<commit_message>
[T03 2026-09-02] feat: model customer process in BPMN 01-09 instead of black box (E-16)
- bpmngen: partner pools with their own non-executable process, message
  flows between concrete elements, optional snap=False routing
- diagrams: customer flows for P01-P09 (e.g. P01 take photo/video/audio,
  send request, answer follow-up questions, accept appointment, end);
  supplier stays an empty pool (black box)
- layout fixes found by the new tools/check_layout.py (P04, P08, P09)
- mkstats counts the Werkstatt process only, customer activities
  separately (kunde_activities); 121 activities, 24 customer activities
- docs, slides, crops, ZIP regenerated; E-16 added, E-06 adjusted

Co-Authored-By: Claude Opus 5.5 <noreply@anthropic.com>
Claude-Session: https://claude.ai/code/session_01H2bGsFaySUqsEjJ1PXuxUw
</commit_message>
<xml_diff>
--- a/doku/Projektdokumentation.docx
+++ b/doku/Projektdokumentation.docx
@@ -734,7 +734,7 @@
           <w:sz w:val="20"/>
           <w:szCs w:val="20"/>
         </w:rPr>
-        <w:t xml:space="preserve">5.3.3 Sequenzdiagramme	16</w:t>
+        <w:t xml:space="preserve">5.3.3 Sequenzdiagramme	17</w:t>
       </w:r>
     </w:p>
     <w:p>
@@ -753,7 +753,7 @@
           <w:sz w:val="20"/>
           <w:szCs w:val="20"/>
         </w:rPr>
-        <w:t xml:space="preserve">5.4 Konsistenz zwischen den Modellen	21</w:t>
+        <w:t xml:space="preserve">5.4 Konsistenz zwischen den Modellen	22</w:t>
       </w:r>
     </w:p>
     <w:p>
@@ -772,7 +772,7 @@
           <w:sz w:val="22"/>
           <w:szCs w:val="22"/>
         </w:rPr>
-        <w:t xml:space="preserve">6 Probleme und Herausforderungen	22</w:t>
+        <w:t xml:space="preserve">6 Probleme und Herausforderungen	23</w:t>
       </w:r>
     </w:p>
     <w:p>
@@ -791,7 +791,7 @@
           <w:sz w:val="22"/>
           <w:szCs w:val="22"/>
         </w:rPr>
-        <w:t xml:space="preserve">7 Feedback	23</w:t>
+        <w:t xml:space="preserve">7 Feedback	24</w:t>
       </w:r>
     </w:p>
     <w:p>
@@ -810,7 +810,7 @@
           <w:sz w:val="20"/>
           <w:szCs w:val="20"/>
         </w:rPr>
-        <w:t xml:space="preserve">7.1 Feedback des Dozenten und Umsetzung	23</w:t>
+        <w:t xml:space="preserve">7.1 Feedback des Dozenten und Umsetzung	24</w:t>
       </w:r>
     </w:p>
     <w:p>
@@ -829,7 +829,7 @@
           <w:sz w:val="20"/>
           <w:szCs w:val="20"/>
         </w:rPr>
-        <w:t xml:space="preserve">7.2 Unser Feedback zur Fallstudie	23</w:t>
+        <w:t xml:space="preserve">7.2 Unser Feedback zur Fallstudie	24</w:t>
       </w:r>
     </w:p>
     <w:p>
@@ -848,7 +848,7 @@
           <w:sz w:val="22"/>
           <w:szCs w:val="22"/>
         </w:rPr>
-        <w:t xml:space="preserve">Anhang A: Abgabestruktur	24</w:t>
+        <w:t xml:space="preserve">Anhang A: Abgabestruktur	25</w:t>
       </w:r>
     </w:p>
     <w:p>
@@ -867,7 +867,7 @@
           <w:sz w:val="22"/>
           <w:szCs w:val="22"/>
         </w:rPr>
-        <w:t xml:space="preserve">Anhang B: Die zehn BPMN-Kollaborationsdiagramme	25</w:t>
+        <w:t xml:space="preserve">Anhang B: Die zehn BPMN-Kollaborationsdiagramme	26</w:t>
       </w:r>
     </w:p>
     <w:p>
@@ -1609,7 +1609,7 @@
           <w:sz w:val="22"/>
           <w:szCs w:val="22"/>
         </w:rPr>
-        <w:t xml:space="preserve">Als „Dokumanager" haben wir zusätzlich das KI-Werkzeug Claude (Anthropic) eingesetzt: für Struktur und Formulierungsvorschläge dieser Dokumentation, für die Pflege des Entscheidungslogs im Git-Repository, für Konsistenzprüfungen zwischen den Modellen und für die Erzeugung der BPMN-Rohdiagramme aus unserer Prozessspezifikation. Claude hat außerdem am 26.09.2026 alle Artefakte gegen Aufgabenstellung und Vorlesung geprüft und Korrekturvorschläge gemacht (Entscheidungslog E-15). Die fachlichen Modellierungsentscheidungen, die Überarbeitung im Camunda Modeler, die Umsetzung in Visual Paradigm und die Präsentation verantwortet das Team. </w:t>
+        <w:t xml:space="preserve">Als „Dokumanager" haben wir zusätzlich das KI-Werkzeug Claude (Anthropic) eingesetzt: für Struktur und Formulierungsvorschläge dieser Dokumentation, für die Pflege des Entscheidungslogs im Git-Repository, für Konsistenzprüfungen zwischen den Modellen und für die Erzeugung der BPMN-Rohdiagramme aus unserer Prozessspezifikation. Claude hat außerdem am 26.09.2026 alle Artefakte gegen Aufgabenstellung und Vorlesung geprüft und Korrekturvorschläge gemacht (Entscheidungslog E-15) und am 28.09.2026 die Kundenabläufe in den BPMN-Diagrammen nach unserer Vorgabe erzeugt (E-16). Die fachlichen Modellierungsentscheidungen, die Überarbeitung im Camunda Modeler, die Umsetzung in Visual Paradigm und die Präsentation verantwortet das Team. </w:t>
       </w:r>
       <w:r>
         <w:rPr>
@@ -2587,7 +2587,7 @@
                 <w:sz w:val="19"/>
                 <w:szCs w:val="19"/>
               </w:rPr>
-              <w:t xml:space="preserve">Modellierung der zehn Prozesse nach den Regeln der Vorlesung: Pool je Unternehmen, Lanes je Rolle, Automatisierung über Aktivitätstypen, Empty Pools für Kunde und Lieferant, Datenobjekte und Datenspeicher. Prüfung mit dem Linter des Camunda Modelers.</w:t>
+              <w:t xml:space="preserve">Modellierung der zehn Prozesse nach den Regeln der Vorlesung: Pool je Unternehmen, Lanes je Rolle, Automatisierung über Aktivitätstypen, Kunde als eigener Prozess, Lieferant als Empty Pool, Datenobjekte und Datenspeicher. Prüfung mit dem Linter des Camunda Modelers.</w:t>
             </w:r>
           </w:p>
         </w:tc>
@@ -7182,7 +7182,7 @@
           <w:sz w:val="22"/>
           <w:szCs w:val="22"/>
         </w:rPr>
-        <w:t xml:space="preserve">Insgesamt enthalten die zehn Diagramme 121 Aktivitäten, im Durchschnitt also 12,1 je Diagramm, dazu 32 Nachrichtenflüsse zwischen den Pools und 48 Datenobjekte und Datenspeicher. Jeder Prozess hat auf Prozessebene genau ein Start- und ein Endereignis; alternative Ausgänge werden mit exklusiven Gateways zusammengeführt.</w:t>
+        <w:t xml:space="preserve">Insgesamt enthalten die zehn Werkstatt-Prozesse 121 Aktivitäten, im Durchschnitt also 12,1 je Diagramm; die Abläufe im Pool Kunde kommen mit weiteren 24 Aktivitäten hinzu und sind in Tabelle 1 nicht mitgezählt. Dazu kommen 32 Nachrichtenflüsse zwischen den Pools und 48 Datenobjekte und Datenspeicher. Jeder Prozess hat auf Prozessebene genau ein Start- und ein Endereignis; alternative Ausgänge werden mit exklusiven Gateways zusammengeführt.</w:t>
       </w:r>
     </w:p>
     <w:p>
@@ -7209,7 +7209,7 @@
           <w:sz w:val="22"/>
           <w:szCs w:val="22"/>
         </w:rPr>
-        <w:t xml:space="preserve">Der Pool ist der Werkstattbetrieb, in dem die Plattform läuft, mit dem Pilotkunden FixWerk als Beispiel. Seine Lanes sind die Rollen Service/Annahme, Techniker, Werkstattleitung und Ersatzteil-Disposition; je Diagramm sind nur die beteiligten Lanes gezeichnet. Kunde und Lieferant sind eigene Unternehmen und deshalb eigene Pools, als Empty Pools ohne innere Logik, mit denen ausschließlich über Nachrichtenflüsse kommuniziert wird. Eine Lane für die Software gibt es bewusst nicht, weil Rechenleistung keine Ressource im Sinne der Prozessmodellierung ist. Wo RepairFlow arbeitet, zeigt stattdessen der Aktivitätstyp:</w:t>
+        <w:t xml:space="preserve">Der Pool ist der Werkstattbetrieb, in dem die Plattform läuft, mit dem Pilotkunden FixWerk als Beispiel. Seine Lanes sind die Rollen Service/Annahme, Techniker, Werkstattleitung und Ersatzteil-Disposition; je Diagramm sind nur die beteiligten Lanes gezeichnet. Kunde und Lieferant sind eigene Beteiligte und deshalb eigene Pools, mit denen ausschließlich über Nachrichtenflüsse kommuniziert wird. Der Kunde hat in den Prozessen 01 bis 09 einen eigenen Ablauf mit Start- und Endereignis, zum Beispiel Foto aufnehmen, Anfrage senden, auf Rückfrage oder Diagnose warten, Kostenvoranschlag freigeben oder ablehnen; dieser Ablauf ist nicht ausführbar, weil RepairFlow ihn nicht steuert, zeigt aber, wann der Kunde reagiert und wie der Vorgang für ihn endet. Die Nachrichtenflüsse verbinden deshalb konkrete Aktivitäten und Ereignisse beider Pools. Der Lieferant bleibt ein Empty Pool (Black Box), weil wir seine internen Abläufe weder kennen noch beeinflussen. Eine Lane für die Software gibt es bewusst nicht, weil Rechenleistung keine Ressource im Sinne der Prozessmodellierung ist. Wo RepairFlow arbeitet, zeigt stattdessen der Aktivitätstyp:</w:t>
       </w:r>
     </w:p>
     <w:tbl>
@@ -10539,7 +10539,7 @@
           <w:sz w:val="22"/>
           <w:szCs w:val="22"/>
         </w:rPr>
-        <w:t xml:space="preserve">Ein erster Entwurf modellierte Werkstatt und Ersatzteil-Disposition als getrennte Pools. Nach der Vorlesungsregel „Pool = Unternehmen, Lanes = Rollen" wurde auf einen Pool mit Lanes umgestellt; Kunde und Lieferant blieben eigene Pools. Erst dadurch wurden die Nachrichtenflüsse eindeutig.</w:t>
+        <w:t xml:space="preserve">Ein erster Entwurf modellierte Werkstatt und Ersatzteil-Disposition als getrennte Pools. Nach der Vorlesungsregel „Pool = Unternehmen, Lanes = Rollen" wurde auf einen Pool mit Lanes umgestellt; Kunde und Lieferant blieben eigene Pools. Erst dadurch wurden die Nachrichtenflüsse eindeutig. Den Kunden hatten wir zunächst als Black Box gezeichnet; weil dabei nicht sichtbar war, wann er antwortet, entscheidet oder fertig ist, haben wir ihm einen eigenen Ablauf gegeben (Entscheidungslog E-16).</w:t>
       </w:r>
     </w:p>
     <w:p>
@@ -10659,7 +10659,7 @@
           <w:sz w:val="22"/>
           <w:szCs w:val="22"/>
         </w:rPr>
-        <w:t xml:space="preserve">Zwölf Aktivitäten, drei Lanes und mehrere Nachrichtenflüsse lassen sich schwer ohne Kreuzungen zeichnen. Wir haben für jedes Diagramm ein Raster festgelegt, in dem Nachrichtenflüsse nur aus der obersten Zeile einer Lane nach außen laufen und Schleifen unterhalb der Zeilen zurückgeführt werden.</w:t>
+        <w:t xml:space="preserve">Zwölf Aktivitäten, drei Lanes und mehrere Nachrichtenflüsse lassen sich schwer ohne Kreuzungen zeichnen. Wir haben für jedes Diagramm ein Raster festgelegt, in dem Nachrichtenflüsse möglichst aus der obersten Zeile einer Lane nach außen laufen, im Kunden-Pool senkrecht über ihrem Gegenstück liegen und Schleifen unterhalb der Zeilen zurückgeführt werden.</w:t>
       </w:r>
     </w:p>
     <w:p>
@@ -11203,7 +11203,7 @@
       <w:r>
         <w:drawing>
           <wp:inline distT="0" distB="0" distL="0" distR="0">
-            <wp:extent cx="9144000" cy="3086100"/>
+            <wp:extent cx="9144000" cy="3286125"/>
             <wp:effectExtent t="0" r="0" b="0" l="0"/>
             <wp:docPr id="1" name="" descr="" title=""/>
             <wp:cNvGraphicFramePr>
@@ -11228,7 +11228,7 @@
                   <pic:spPr bwMode="auto">
                     <a:xfrm>
                       <a:off x="0" y="0"/>
-                      <a:ext cx="9144000" cy="3086100"/>
+                      <a:ext cx="9144000" cy="3286125"/>
                     </a:xfrm>
                     <a:prstGeom prst="rect">
                       <a:avLst/>
@@ -11272,7 +11272,7 @@
       <w:r>
         <w:drawing>
           <wp:inline distT="0" distB="0" distL="0" distR="0">
-            <wp:extent cx="9144000" cy="2867025"/>
+            <wp:extent cx="9144000" cy="2838450"/>
             <wp:effectExtent t="0" r="0" b="0" l="0"/>
             <wp:docPr id="1" name="" descr="" title=""/>
             <wp:cNvGraphicFramePr>
@@ -11297,7 +11297,7 @@
                   <pic:spPr bwMode="auto">
                     <a:xfrm>
                       <a:off x="0" y="0"/>
-                      <a:ext cx="9144000" cy="2867025"/>
+                      <a:ext cx="9144000" cy="2838450"/>
                     </a:xfrm>
                     <a:prstGeom prst="rect">
                       <a:avLst/>
@@ -11341,7 +11341,7 @@
       <w:r>
         <w:drawing>
           <wp:inline distT="0" distB="0" distL="0" distR="0">
-            <wp:extent cx="9144000" cy="3162300"/>
+            <wp:extent cx="9144000" cy="3514725"/>
             <wp:effectExtent t="0" r="0" b="0" l="0"/>
             <wp:docPr id="1" name="" descr="" title=""/>
             <wp:cNvGraphicFramePr>
@@ -11366,7 +11366,7 @@
                   <pic:spPr bwMode="auto">
                     <a:xfrm>
                       <a:off x="0" y="0"/>
-                      <a:ext cx="9144000" cy="3162300"/>
+                      <a:ext cx="9144000" cy="3514725"/>
                     </a:xfrm>
                     <a:prstGeom prst="rect">
                       <a:avLst/>
@@ -11410,7 +11410,7 @@
       <w:r>
         <w:drawing>
           <wp:inline distT="0" distB="0" distL="0" distR="0">
-            <wp:extent cx="9144000" cy="2647950"/>
+            <wp:extent cx="9144000" cy="3248025"/>
             <wp:effectExtent t="0" r="0" b="0" l="0"/>
             <wp:docPr id="1" name="" descr="" title=""/>
             <wp:cNvGraphicFramePr>
@@ -11435,7 +11435,7 @@
                   <pic:spPr bwMode="auto">
                     <a:xfrm>
                       <a:off x="0" y="0"/>
-                      <a:ext cx="9144000" cy="2647950"/>
+                      <a:ext cx="9144000" cy="3248025"/>
                     </a:xfrm>
                     <a:prstGeom prst="rect">
                       <a:avLst/>
@@ -11479,7 +11479,7 @@
       <w:r>
         <w:drawing>
           <wp:inline distT="0" distB="0" distL="0" distR="0">
-            <wp:extent cx="9144000" cy="2171700"/>
+            <wp:extent cx="9144000" cy="2305050"/>
             <wp:effectExtent t="0" r="0" b="0" l="0"/>
             <wp:docPr id="1" name="" descr="" title=""/>
             <wp:cNvGraphicFramePr>
@@ -11504,7 +11504,7 @@
                   <pic:spPr bwMode="auto">
                     <a:xfrm>
                       <a:off x="0" y="0"/>
-                      <a:ext cx="9144000" cy="2171700"/>
+                      <a:ext cx="9144000" cy="2305050"/>
                     </a:xfrm>
                     <a:prstGeom prst="rect">
                       <a:avLst/>
@@ -11548,7 +11548,7 @@
       <w:r>
         <w:drawing>
           <wp:inline distT="0" distB="0" distL="0" distR="0">
-            <wp:extent cx="9144000" cy="2533650"/>
+            <wp:extent cx="9144000" cy="2743200"/>
             <wp:effectExtent t="0" r="0" b="0" l="0"/>
             <wp:docPr id="1" name="" descr="" title=""/>
             <wp:cNvGraphicFramePr>
@@ -11573,7 +11573,7 @@
                   <pic:spPr bwMode="auto">
                     <a:xfrm>
                       <a:off x="0" y="0"/>
-                      <a:ext cx="9144000" cy="2533650"/>
+                      <a:ext cx="9144000" cy="2743200"/>
                     </a:xfrm>
                     <a:prstGeom prst="rect">
                       <a:avLst/>
@@ -11617,7 +11617,7 @@
       <w:r>
         <w:drawing>
           <wp:inline distT="0" distB="0" distL="0" distR="0">
-            <wp:extent cx="9144000" cy="2790825"/>
+            <wp:extent cx="9144000" cy="2914650"/>
             <wp:effectExtent t="0" r="0" b="0" l="0"/>
             <wp:docPr id="1" name="" descr="" title=""/>
             <wp:cNvGraphicFramePr>
@@ -11642,7 +11642,7 @@
                   <pic:spPr bwMode="auto">
                     <a:xfrm>
                       <a:off x="0" y="0"/>
-                      <a:ext cx="9144000" cy="2790825"/>
+                      <a:ext cx="9144000" cy="2914650"/>
                     </a:xfrm>
                     <a:prstGeom prst="rect">
                       <a:avLst/>
@@ -11686,7 +11686,7 @@
       <w:r>
         <w:drawing>
           <wp:inline distT="0" distB="0" distL="0" distR="0">
-            <wp:extent cx="9144000" cy="2105025"/>
+            <wp:extent cx="9144000" cy="2647950"/>
             <wp:effectExtent t="0" r="0" b="0" l="0"/>
             <wp:docPr id="1" name="" descr="" title=""/>
             <wp:cNvGraphicFramePr>
@@ -11711,7 +11711,7 @@
                   <pic:spPr bwMode="auto">
                     <a:xfrm>
                       <a:off x="0" y="0"/>
-                      <a:ext cx="9144000" cy="2105025"/>
+                      <a:ext cx="9144000" cy="2647950"/>
                     </a:xfrm>
                     <a:prstGeom prst="rect">
                       <a:avLst/>
@@ -11755,7 +11755,7 @@
       <w:r>
         <w:drawing>
           <wp:inline distT="0" distB="0" distL="0" distR="0">
-            <wp:extent cx="9144000" cy="2781300"/>
+            <wp:extent cx="9144000" cy="3124200"/>
             <wp:effectExtent t="0" r="0" b="0" l="0"/>
             <wp:docPr id="1" name="" descr="" title=""/>
             <wp:cNvGraphicFramePr>
@@ -11780,7 +11780,7 @@
                   <pic:spPr bwMode="auto">
                     <a:xfrm>
                       <a:off x="0" y="0"/>
-                      <a:ext cx="9144000" cy="2781300"/>
+                      <a:ext cx="9144000" cy="3124200"/>
                     </a:xfrm>
                     <a:prstGeom prst="rect">
                       <a:avLst/>

</xml_diff>

<commit_message>
[T04 2026-10-05] chore: record group decisions E-20 and archive old files
- E-20: all open decisions taken by the group (E-07, E-14 closed)
- Doku/Folien: KI-Absatz und Dokumanager entfernt, keine Camunda Cloud,
  WhatsApp/GitHub als Kanal, kein Trello-Screenshot, Maximilian statt Maxi;
  Kennzahlen und Bilder nach E-19 neu erzeugt (P01/P02, P07/P08, Zustandsdiagramm)
- Archiv: Generatoren (tools/), Prüfprotokolle, To-do 05.10., Vergleichsnotiz,
  Dateiübersicht und ausführlicher Entscheidungslog
- Entscheidungslog als Kurzfassung, README als einzige Übersicht
- BPMN-Abgabe-ZIP gelöscht (wird zur Abgabe selbst gepackt)

Co-Authored-By: Claude Opus 5.5 <noreply@anthropic.com>
Claude-Session: https://claude.ai/code/session_01H2bGsFaySUqsEjJ1PXuxUw
</commit_message>
<xml_diff>
--- a/doku/Projektdokumentation.docx
+++ b/doku/Projektdokumentation.docx
@@ -297,7 +297,7 @@
           <w:sz w:val="20"/>
           <w:szCs w:val="20"/>
         </w:rPr>
-        <w:t xml:space="preserve">2.2 Das Startup RepairFlow	3</w:t>
+        <w:t xml:space="preserve">2.2 Das Startup RepairFlow	2</w:t>
       </w:r>
     </w:p>
     <w:p>
@@ -373,7 +373,7 @@
           <w:sz w:val="20"/>
           <w:szCs w:val="20"/>
         </w:rPr>
-        <w:t xml:space="preserve">2.6 Alleinstellungsmerkmal: die KI-Sofortdiagnose	5</w:t>
+        <w:t xml:space="preserve">2.6 Alleinstellungsmerkmal: die KI-Sofortdiagnose	4</w:t>
       </w:r>
     </w:p>
     <w:p>
@@ -392,7 +392,7 @@
           <w:sz w:val="22"/>
           <w:szCs w:val="22"/>
         </w:rPr>
-        <w:t xml:space="preserve">3 Vorgehen bei der Umsetzung	6</w:t>
+        <w:t xml:space="preserve">3 Vorgehen bei der Umsetzung	5</w:t>
       </w:r>
     </w:p>
     <w:p>
@@ -430,7 +430,7 @@
           <w:sz w:val="20"/>
           <w:szCs w:val="20"/>
         </w:rPr>
-        <w:t xml:space="preserve">3.2 Konventionen	7</w:t>
+        <w:t xml:space="preserve">3.2 Konventionen	6</w:t>
       </w:r>
     </w:p>
     <w:p>
@@ -449,7 +449,7 @@
           <w:sz w:val="20"/>
           <w:szCs w:val="20"/>
         </w:rPr>
-        <w:t xml:space="preserve">3.3 Qualitätssicherung	7</w:t>
+        <w:t xml:space="preserve">3.3 Qualitätssicherung	6</w:t>
       </w:r>
     </w:p>
     <w:p>
@@ -468,7 +468,7 @@
           <w:sz w:val="22"/>
           <w:szCs w:val="22"/>
         </w:rPr>
-        <w:t xml:space="preserve">4 Projektmanagement	8</w:t>
+        <w:t xml:space="preserve">4 Projektmanagement	7</w:t>
       </w:r>
     </w:p>
     <w:p>
@@ -487,7 +487,7 @@
           <w:sz w:val="20"/>
           <w:szCs w:val="20"/>
         </w:rPr>
-        <w:t xml:space="preserve">4.1 Vorgehensmodell und Arbeitsweise	8</w:t>
+        <w:t xml:space="preserve">4.1 Vorgehensmodell und Arbeitsweise	7</w:t>
       </w:r>
     </w:p>
     <w:p>
@@ -506,7 +506,7 @@
           <w:sz w:val="20"/>
           <w:szCs w:val="20"/>
         </w:rPr>
-        <w:t xml:space="preserve">4.2 Sprintplan und Meilensteine	8</w:t>
+        <w:t xml:space="preserve">4.2 Sprintplan und Meilensteine	7</w:t>
       </w:r>
     </w:p>
     <w:p>
@@ -525,7 +525,7 @@
           <w:sz w:val="20"/>
           <w:szCs w:val="20"/>
         </w:rPr>
-        <w:t xml:space="preserve">4.3 Aufgabensteuerung mit Trello	9</w:t>
+        <w:t xml:space="preserve">4.3 Aufgabensteuerung mit Trello	8</w:t>
       </w:r>
     </w:p>
     <w:p>
@@ -544,7 +544,7 @@
           <w:sz w:val="20"/>
           <w:szCs w:val="20"/>
         </w:rPr>
-        <w:t xml:space="preserve">4.4 Zusammenarbeit im Repository	9</w:t>
+        <w:t xml:space="preserve">4.4 Zusammenarbeit im Repository	8</w:t>
       </w:r>
     </w:p>
     <w:p>
@@ -563,7 +563,7 @@
           <w:sz w:val="20"/>
           <w:szCs w:val="20"/>
         </w:rPr>
-        <w:t xml:space="preserve">4.5 Risiken und Gegenmaßnahmen	9</w:t>
+        <w:t xml:space="preserve">4.5 Risiken und Gegenmaßnahmen	8</w:t>
       </w:r>
     </w:p>
     <w:p>
@@ -582,7 +582,7 @@
           <w:sz w:val="22"/>
           <w:szCs w:val="22"/>
         </w:rPr>
-        <w:t xml:space="preserve">5 Überblick über die erstellten Artefakte	10</w:t>
+        <w:t xml:space="preserve">5 Überblick über die erstellten Artefakte	9</w:t>
       </w:r>
     </w:p>
     <w:p>
@@ -601,7 +601,7 @@
           <w:sz w:val="20"/>
           <w:szCs w:val="20"/>
         </w:rPr>
-        <w:t xml:space="preserve">5.1 Geschäftsprozessmodell (BPMN)	10</w:t>
+        <w:t xml:space="preserve">5.1 Geschäftsprozessmodell (BPMN)	9</w:t>
       </w:r>
     </w:p>
     <w:p>
@@ -620,7 +620,7 @@
           <w:sz w:val="20"/>
           <w:szCs w:val="20"/>
         </w:rPr>
-        <w:t xml:space="preserve">5.1.1 Modellierungskonventionen	11</w:t>
+        <w:t xml:space="preserve">5.1.1 Modellierungskonventionen	10</w:t>
       </w:r>
     </w:p>
     <w:p>
@@ -639,7 +639,7 @@
           <w:sz w:val="20"/>
           <w:szCs w:val="20"/>
         </w:rPr>
-        <w:t xml:space="preserve">5.1.2 Die zehn Prozesse	12</w:t>
+        <w:t xml:space="preserve">5.1.2 Die zehn Prozesse	11</w:t>
       </w:r>
     </w:p>
     <w:p>
@@ -658,7 +658,7 @@
           <w:sz w:val="20"/>
           <w:szCs w:val="20"/>
         </w:rPr>
-        <w:t xml:space="preserve">5.2 Automatisierungspotential	13</w:t>
+        <w:t xml:space="preserve">5.2 Automatisierungspotential	12</w:t>
       </w:r>
     </w:p>
     <w:p>
@@ -677,7 +677,7 @@
           <w:sz w:val="20"/>
           <w:szCs w:val="20"/>
         </w:rPr>
-        <w:t xml:space="preserve">5.3 Objektorientierte Analyse (UML)	13</w:t>
+        <w:t xml:space="preserve">5.3 Objektorientierte Analyse (UML)	12</w:t>
       </w:r>
     </w:p>
     <w:p>
@@ -696,7 +696,7 @@
           <w:sz w:val="20"/>
           <w:szCs w:val="20"/>
         </w:rPr>
-        <w:t xml:space="preserve">5.3.1 Use-Case-Diagramm	14</w:t>
+        <w:t xml:space="preserve">5.3.1 Use-Case-Diagramm	13</w:t>
       </w:r>
     </w:p>
     <w:p>
@@ -715,7 +715,7 @@
           <w:sz w:val="20"/>
           <w:szCs w:val="20"/>
         </w:rPr>
-        <w:t xml:space="preserve">5.3.2 Klassendiagramm	15</w:t>
+        <w:t xml:space="preserve">5.3.2 Klassendiagramm	14</w:t>
       </w:r>
     </w:p>
     <w:p>
@@ -734,7 +734,7 @@
           <w:sz w:val="20"/>
           <w:szCs w:val="20"/>
         </w:rPr>
-        <w:t xml:space="preserve">5.3.3 Sequenzdiagramme	16</w:t>
+        <w:t xml:space="preserve">5.3.3 Sequenzdiagramme	14</w:t>
       </w:r>
     </w:p>
     <w:p>
@@ -753,7 +753,7 @@
           <w:sz w:val="20"/>
           <w:szCs w:val="20"/>
         </w:rPr>
-        <w:t xml:space="preserve">5.4 Konsistenz zwischen den Modellen	21</w:t>
+        <w:t xml:space="preserve">5.4 Konsistenz zwischen den Modellen	20</w:t>
       </w:r>
     </w:p>
     <w:p>
@@ -772,7 +772,7 @@
           <w:sz w:val="22"/>
           <w:szCs w:val="22"/>
         </w:rPr>
-        <w:t xml:space="preserve">6 Probleme und Herausforderungen	22</w:t>
+        <w:t xml:space="preserve">6 Probleme und Herausforderungen	21</w:t>
       </w:r>
     </w:p>
     <w:p>
@@ -791,7 +791,7 @@
           <w:sz w:val="22"/>
           <w:szCs w:val="22"/>
         </w:rPr>
-        <w:t xml:space="preserve">7 Feedback	23</w:t>
+        <w:t xml:space="preserve">7 Feedback	22</w:t>
       </w:r>
     </w:p>
     <w:p>
@@ -810,7 +810,7 @@
           <w:sz w:val="20"/>
           <w:szCs w:val="20"/>
         </w:rPr>
-        <w:t xml:space="preserve">7.1 Feedback des Dozenten und Umsetzung	23</w:t>
+        <w:t xml:space="preserve">7.1 Feedback des Dozenten und Umsetzung	22</w:t>
       </w:r>
     </w:p>
     <w:p>
@@ -829,7 +829,7 @@
           <w:sz w:val="20"/>
           <w:szCs w:val="20"/>
         </w:rPr>
-        <w:t xml:space="preserve">7.2 Unser Feedback zur Fallstudie	24</w:t>
+        <w:t xml:space="preserve">7.2 Unser Feedback zur Fallstudie	23</w:t>
       </w:r>
     </w:p>
     <w:p>
@@ -848,7 +848,7 @@
           <w:sz w:val="22"/>
           <w:szCs w:val="22"/>
         </w:rPr>
-        <w:t xml:space="preserve">Anhang A: Abgabestruktur	24</w:t>
+        <w:t xml:space="preserve">Anhang A: Abgabestruktur	23</w:t>
       </w:r>
     </w:p>
     <w:p>
@@ -867,7 +867,7 @@
           <w:sz w:val="22"/>
           <w:szCs w:val="22"/>
         </w:rPr>
-        <w:t xml:space="preserve">Anhang B: Die zehn BPMN-Kollaborationsdiagramme	25</w:t>
+        <w:t xml:space="preserve">Anhang B: Die zehn BPMN-Kollaborationsdiagramme	24</w:t>
       </w:r>
     </w:p>
     <w:p>
@@ -886,7 +886,7 @@
           <w:sz w:val="22"/>
           <w:szCs w:val="22"/>
         </w:rPr>
-        <w:t xml:space="preserve">Anhang C: Das vollständige Klassendiagramm	35</w:t>
+        <w:t xml:space="preserve">Anhang C: Das vollständige Klassendiagramm	34</w:t>
       </w:r>
     </w:p>
     <w:p>
@@ -918,7 +918,7 @@
           <w:sz w:val="22"/>
           <w:szCs w:val="22"/>
         </w:rPr>
-        <w:t xml:space="preserve">Die Fallstudie wurde von sechs Studierenden des Kurses WWI25B4 bearbeitet. Das Team hat sich zu Beginn des Semesters konstituiert und die Zuständigkeiten nach dem Scrum-Vorgehensmodell verteilt (Kapitel 4): Jedes Artefakt hat eine verantwortliche Person, die Projektleitung ist Ansprechpartnerin für den Dozenten, und die Qualitätssicherung übernimmt eine Person, die nicht selbst modelliert.</w:t>
+        <w:t xml:space="preserve">Die Fallstudie wurde von sechs Studierenden des Kurses WWI25B4 bearbeitet. Das Team hat sich zu Beginn des Semesters konstituiert und die Zuständigkeiten nach dem Scrum-Vorgehensmodell verteilt (Kapitel 4): Jedes Artefakt hat eine verantwortliche Person, die Projektleitung plant und koordiniert, und die Qualitätssicherung übernimmt eine Person, die nicht selbst modelliert.</w:t>
       </w:r>
     </w:p>
     <w:tbl>
@@ -1120,7 +1120,7 @@
                 <w:sz w:val="19"/>
                 <w:szCs w:val="19"/>
               </w:rPr>
-              <w:t xml:space="preserve">Ansprechpartnerin für den Dozenten, Gesamtplanung, Termine, Abgabe-Archiv</w:t>
+              <w:t xml:space="preserve">Gesamtplanung, Termine, Abgabe-Archiv</w:t>
             </w:r>
           </w:p>
         </w:tc>
@@ -1215,7 +1215,7 @@
                 <w:sz w:val="19"/>
                 <w:szCs w:val="19"/>
               </w:rPr>
-              <w:t xml:space="preserve">Sicherung der Repositories (Git, Camunda, VP-Server), Termine, Abgabe-Check</w:t>
+              <w:t xml:space="preserve">Sicherung der Repositories (Git, VP-Server), Termine, Abgabe-Check</w:t>
             </w:r>
           </w:p>
         </w:tc>
@@ -1494,7 +1494,7 @@
                 <w:sz w:val="19"/>
                 <w:szCs w:val="19"/>
               </w:rPr>
-              <w:t xml:space="preserve">Die zehn Kollaborationsdiagramme im Camunda Modeler, Camunda-Repository, BPMN-Export</w:t>
+              <w:t xml:space="preserve">Die zehn Kollaborationsdiagramme im Camunda Modeler, BPMN-Dateien im Git-Repository, BPMN-Export</w:t>
             </w:r>
           </w:p>
         </w:tc>
@@ -1610,36 +1610,6 @@
           <w:shd w:fill="FFF2A8" w:color="auto" w:val="clear"/>
         </w:rPr>
         <w:t xml:space="preserve">[Gruppe: Vor der Abgabe ergänzen: tatsächliche Beiträge je Person (welche Diagramme, Kapitel und Folien wer erarbeitet hat), weil der Ablauf verlangt, dass erkennbar ist, was von wem erarbeitet wurde]</w:t>
-      </w:r>
-    </w:p>
-    <w:p>
-      <w:pPr>
-        <w:spacing w:after="160"/>
-      </w:pPr>
-    </w:p>
-    <w:p>
-      <w:pPr>
-        <w:spacing w:after="120" w:line="276"/>
-        <w:jc w:val="both"/>
-      </w:pPr>
-      <w:r>
-        <w:rPr>
-          <w:rFonts w:ascii="Calibri" w:cs="Calibri" w:eastAsia="Calibri" w:hAnsi="Calibri"/>
-          <w:sz w:val="22"/>
-          <w:szCs w:val="22"/>
-        </w:rPr>
-        <w:t xml:space="preserve">Als „Dokumanager" haben wir zusätzlich das KI-Werkzeug Claude (Anthropic) eingesetzt: für Struktur und Formulierungsvorschläge dieser Dokumentation, für die Pflege des Entscheidungslogs im Git-Repository, für Konsistenzprüfungen zwischen den Modellen und für die Erzeugung der BPMN-Rohdiagramme aus unserer Prozessspezifikation. Claude hat außerdem am 26.09.2026 alle Artefakte gegen Aufgabenstellung und Vorlesung geprüft und Korrekturvorschläge gemacht (Entscheidungslog E-15) und am 28.09.2026 die Kundenabläufe in den BPMN-Diagrammen nach unserer Vorgabe erzeugt (E-16). Am 05.10.2026 hat Claude alle Modelle und Texte erneut geprüft und die Korrekturen aus E-17 (Abholung abgelehnter Aufträge, Schleifen-Ausstiege, Use-Case-Beziehungen, Akteur Servicemitarbeiter) vorbereitet; die Gruppe hat sie geprüft und übernommen. Die fachlichen Modellierungsentscheidungen, die Überarbeitung im Camunda Modeler, die Umsetzung in Visual Paradigm und die Präsentation verantwortet das Team. </w:t>
-      </w:r>
-      <w:r>
-        <w:rPr>
-          <w:rFonts w:ascii="Calibri" w:cs="Calibri" w:eastAsia="Calibri" w:hAnsi="Calibri"/>
-          <w:i/>
-          <w:iCs/>
-          <w:sz w:val="22"/>
-          <w:szCs w:val="22"/>
-          <w:shd w:fill="FFF2A8" w:color="auto" w:val="clear"/>
-        </w:rPr>
-        <w:t xml:space="preserve">[Gruppe: Falls eine KI-Nutzungserklärung verlangt wird: geforderten Wortlaut einsetzen]</w:t>
       </w:r>
     </w:p>
     <w:p>
@@ -1977,9 +1947,9 @@
       <w:r>
         <w:drawing>
           <wp:inline distT="0" distB="0" distL="0" distR="0">
-            <wp:extent cx="4095750" cy="6057900"/>
+            <wp:extent cx="4095750" cy="5438775"/>
             <wp:effectExtent t="0" r="0" b="0" l="0"/>
-            <wp:docPr id="1" name="" descr="" title=""/>
+            <wp:docPr id="2" name="" descr="" title=""/>
             <wp:cNvGraphicFramePr>
               <a:graphicFrameLocks xmlns:a="http://schemas.openxmlformats.org/drawingml/2006/main" noChangeAspect="1"/>
             </wp:cNvGraphicFramePr>
@@ -2002,7 +1972,7 @@
                   <pic:spPr bwMode="auto">
                     <a:xfrm>
                       <a:off x="0" y="0"/>
-                      <a:ext cx="4095750" cy="6057900"/>
+                      <a:ext cx="4095750" cy="5438775"/>
                     </a:xfrm>
                     <a:prstGeom prst="rect">
                       <a:avLst/>
@@ -3116,7 +3086,7 @@
           <w:sz w:val="22"/>
           <w:szCs w:val="22"/>
         </w:rPr>
-        <w:t xml:space="preserve">Jedes Artefakt durchläuft eine Definition of Done: Ablage im Git-Repository über einen Pull Request mit Review durch eine zweite Person, Ablage im jeweiligen Fach-Repository (Camunda beziehungsweise VP-Teamwork-Server), Einhaltung der Namens- und Modellierungskonventionen und Abnahme über die QA-Checkliste des Qualitätsmanagers. Die BPMN-Dateien prüfen wir zusätzlich automatisiert mit zwei Werkzeugen: dem Regelsatz des Camunda Modelers (@camunda/linting, Camunda 8.7, dieselben Regeln wie das Problems-Panel) und dem allgemeinen bpmnlint-Regelsatz „recommended". Geprüft werden unter anderem: genau ein Startereignis, kein Flussobjekt ohne Ein- und Ausgang, Bedingungen an allen Ausgängen exklusiver Gateways, keine Zusammenführung mit einem Verzweigungs-Gateway, Beschriftung aller Aktivitäten und Ereignisse, gültige Endpunkte aller Nachrichtenflüsse. Beide Prüfungen laufen für alle zehn Diagramme ohne Befund; ein eigenes Skript prüft zusätzlich, dass kein Fluss durch ein fremdes Element läuft. Die Diagramme wurden mit einem Generator erzeugt und werden vor der Abgabe im Camunda Modeler geöffnet, geprüft und gespeichert.</w:t>
+        <w:t xml:space="preserve">Jedes Artefakt durchläuft eine Definition of Done: Ablage im Git-Repository über einen Pull Request mit Review durch eine zweite Person, bei den UML-Modellen zusätzlich Commit auf dem VP-Teamwork-Server, Einhaltung der Namens- und Modellierungskonventionen und Abnahme über die QA-Checkliste des Qualitätsmanagers. Die BPMN-Dateien prüfen wir zusätzlich automatisiert mit zwei Werkzeugen: dem Regelsatz des Camunda Modelers (@camunda/linting, Camunda 8.7, dieselben Regeln wie das Problems-Panel) und dem allgemeinen bpmnlint-Regelsatz „recommended". Geprüft werden unter anderem: genau ein Startereignis, kein Flussobjekt ohne Ein- und Ausgang, Bedingungen an allen Ausgängen exklusiver Gateways, keine Zusammenführung mit einem Verzweigungs-Gateway, Beschriftung aller Aktivitäten und Ereignisse, gültige Endpunkte aller Nachrichtenflüsse. Beide Prüfungen laufen für alle zehn Diagramme ohne Befund; ein eigenes Skript prüft zusätzlich, dass kein Fluss durch ein fremdes Element läuft. Die Diagramme wurden mit einem Generator erzeugt und werden vor der Abgabe im Camunda Modeler geöffnet, geprüft und gespeichert.</w:t>
       </w:r>
     </w:p>
     <w:p>
@@ -3187,7 +3157,7 @@
           <w:sz w:val="22"/>
           <w:szCs w:val="22"/>
         </w:rPr>
-        <w:t xml:space="preserve">Das Projekt ist nach Scrum organisiert (Vorlesung Kapitel 2): Der Product Owner priorisiert den Product Backlog und nimmt Ergebnisse im Sprint Review ab, der Scrum Master moderiert die Rituale und pflegt das Board, das Projektteam bearbeitet den Sprint Backlog, wobei jede Aufgabe genau einer Person zugeordnet ist. Abweichend vom reinen Scrum gibt es eine Projektleitung als Ansprechpartnerin für den Dozenten, wie es die Aufgabenstellung verlangt.</w:t>
+        <w:t xml:space="preserve">Das Projekt ist nach Scrum organisiert (Vorlesung Kapitel 2): Der Product Owner priorisiert den Product Backlog und nimmt Ergebnisse im Sprint Review ab, der Scrum Master moderiert die Rituale und pflegt das Board, das Projektteam bearbeitet den Sprint Backlog, wobei jede Aufgabe genau einer Person zugeordnet ist. Abweichend vom reinen Scrum gibt es, wie in der Aufgabenstellung vorgesehen, eine Projektleitung, die Planung und Termine koordiniert.</w:t>
       </w:r>
     </w:p>
     <w:p>
@@ -3201,18 +3171,7 @@
           <w:sz w:val="22"/>
           <w:szCs w:val="22"/>
         </w:rPr>
-        <w:t xml:space="preserve">Als Sprint-Takt dienen die Gruppentermine in Präsenz (jeweils 4:15 Stunden): Jeder Termin beginnt mit Sprint Review und Retrospektive des vorangegangenen Sprints und dem Sprint Planning des nächsten; das Feedback des Dozenten aus dem Coaching wird direkt im Planning eingeplant. Zwischen den Terminen arbeiten wir asynchron über das Repository und stimmen uns in einem wöchentlichen Kurz-Meeting online ab. </w:t>
-      </w:r>
-      <w:r>
-        <w:rPr>
-          <w:rFonts w:ascii="Calibri" w:cs="Calibri" w:eastAsia="Calibri" w:hAnsi="Calibri"/>
-          <w:i/>
-          <w:iCs/>
-          <w:sz w:val="22"/>
-          <w:szCs w:val="22"/>
-          <w:shd w:fill="FFF2A8" w:color="auto" w:val="clear"/>
-        </w:rPr>
-        <w:t xml:space="preserve">[Gruppe: Kommunikationskanal und Wochentag des Online-Meetings eintragen]</w:t>
+        <w:t xml:space="preserve">Als Sprint-Takt dienen die Gruppentermine in Präsenz (jeweils 4:15 Stunden): Jeder Termin beginnt mit Sprint Review und Retrospektive des vorangegangenen Sprints und dem Sprint Planning des nächsten; das Feedback des Dozenten aus dem Coaching wird direkt im Planning eingeplant. Zwischen den Terminen arbeiten wir asynchron: Abstimmungen laufen über eine WhatsApp-Gruppe, Dateien teilen wir ausschließlich über das GitHub-Repository.</w:t>
       </w:r>
     </w:p>
     <w:p>
@@ -4045,7 +4004,7 @@
           <w:szCs w:val="22"/>
           <w:shd w:fill="FFF2A8" w:color="auto" w:val="clear"/>
         </w:rPr>
-        <w:t xml:space="preserve">[Gruppe: Screenshot des Trello-Boards (Stand 05.10.) einfügen; tatsächliche Sprint-Ergebnisse und Abweichungen vom Plan beschreiben]</w:t>
+        <w:t xml:space="preserve">[Gruppe: Tatsächliche Sprint-Ergebnisse und Abweichungen vom Plan beschreiben]</w:t>
       </w:r>
     </w:p>
     <w:p>
@@ -4086,7 +4045,7 @@
           <w:sz w:val="22"/>
           <w:szCs w:val="22"/>
         </w:rPr>
-        <w:t xml:space="preserve">Die Modellierungswerkzeuge haben jeweils ein eigenes Repository (Camunda beziehungsweise VP-Teamwork-Server); zusätzlich liegen Exporte und lokale Sicherungen (BPMN-XML, PlantUML, XMI, nach Fertigstellung auch die VPP-Datei) im Git, damit jederzeit ein vollständiger Stand wiederhergestellt werden kann. Office-Dateien lassen sich nicht mergen; wer Dokumentation oder Folien bearbeitet, stimmt das vorher im Team ab.</w:t>
+        <w:t xml:space="preserve">Die BPMN-Modelle liegen ausschließlich im Git-Repository, die UML-Modelle zusätzlich auf dem VP-Teamwork-Server; im Git liegen außerdem Exporte und lokale Sicherungen (PlantUML, XMI, nach Fertigstellung auch die VPP-Datei), damit jederzeit ein vollständiger Stand wiederhergestellt werden kann. Office-Dateien lassen sich nicht mergen; wer Dokumentation oder Folien bearbeitet, stimmt das vorher im Team ab.</w:t>
       </w:r>
     </w:p>
     <w:p>
@@ -6500,7 +6459,7 @@
                 <w:sz w:val="19"/>
                 <w:szCs w:val="19"/>
               </w:rPr>
-              <w:t xml:space="preserve">10</w:t>
+              <w:t xml:space="preserve">13</w:t>
             </w:r>
           </w:p>
         </w:tc>
@@ -6529,7 +6488,7 @@
                 <w:sz w:val="19"/>
                 <w:szCs w:val="19"/>
               </w:rPr>
-              <w:t xml:space="preserve">3 (30 %)</w:t>
+              <w:t xml:space="preserve">5 (38 %)</w:t>
             </w:r>
           </w:p>
         </w:tc>
@@ -6714,7 +6673,7 @@
                 <w:sz w:val="19"/>
                 <w:szCs w:val="19"/>
               </w:rPr>
-              <w:t xml:space="preserve">15</w:t>
+              <w:t xml:space="preserve">17</w:t>
             </w:r>
           </w:p>
         </w:tc>
@@ -6744,7 +6703,7 @@
                 <w:sz w:val="19"/>
                 <w:szCs w:val="19"/>
               </w:rPr>
-              <w:t xml:space="preserve">11 (73 %)</w:t>
+              <w:t xml:space="preserve">11 (65 %)</w:t>
             </w:r>
           </w:p>
         </w:tc>
@@ -7201,7 +7160,7 @@
           <w:sz w:val="22"/>
           <w:szCs w:val="22"/>
         </w:rPr>
-        <w:t xml:space="preserve">Insgesamt enthalten die zehn Werkstatt-Prozesse 125 Aktivitäten, im Durchschnitt also 12,5 je Diagramm; die Abläufe im Pool Kunde kommen mit weiteren 26 Aktivitäten hinzu und sind in Tabelle 1 nicht mitgezählt. Dazu kommen 39 Nachrichtenflüsse zwischen den Pools und 57 Datenobjekte und Datenspeicher. Jeder Prozess hat auf Prozessebene genau ein Start- und ein Endereignis; alternative Ausgänge werden mit exklusiven Gateways zusammengeführt.</w:t>
+        <w:t xml:space="preserve">Insgesamt enthalten die zehn Werkstatt-Prozesse 130 Aktivitäten, im Durchschnitt also 13,0 je Diagramm; die Abläufe im Pool Kunde kommen mit weiteren 26 Aktivitäten hinzu und sind in Tabelle 1 nicht mitgezählt. Dazu kommen 39 Nachrichtenflüsse zwischen den Pools und 59 Datenobjekte und Datenspeicher. Jeder Prozess hat auf Prozessebene genau ein Start- und ein Endereignis; alternative Ausgänge werden mit exklusiven Gateways zusammengeführt.</w:t>
       </w:r>
     </w:p>
     <w:p>
@@ -7993,7 +7952,7 @@
           <w:sz w:val="22"/>
           <w:szCs w:val="22"/>
         </w:rPr>
-        <w:t xml:space="preserve">Von den 125 Aktivitäten sind 77 automatisierte, regelbasierte, sendende oder empfangende Aktivitäten, also 62 Prozent, die RepairFlow ohne manuelle Arbeit ausführt. Weitere 30 Benutzer-Aktivitäten laufen in der Oberfläche der Plattform. Nur 9 Aktivitäten sind manuell und liegen außerhalb der Systemgrenze; die übrigen 9 sind Aufruf-Aktivitäten und ein Mehrfach-Teilprozess. Die Software, die wir in der objektorientierten Analyse entwerfen, automatisiert damit den Reparaturauftrags-Lebenszyklus als zentrales Werkstatt-Management-System:</w:t>
+        <w:t xml:space="preserve">Von den 130 Aktivitäten sind 79 automatisierte, regelbasierte, sendende oder empfangende Aktivitäten, also 61 Prozent, die RepairFlow ohne manuelle Arbeit ausführt. Weitere 32 Benutzer-Aktivitäten laufen in der Oberfläche der Plattform. Nur 9 Aktivitäten sind manuell und liegen außerhalb der Systemgrenze; die übrigen 10 sind Aufruf-Aktivitäten und ein Mehrfach-Teilprozess. Die Software, die wir in der objektorientierten Analyse entwerfen, automatisiert damit den Reparaturauftrags-Lebenszyklus als zentrales Werkstatt-Management-System:</w:t>
       </w:r>
     </w:p>
     <w:p>
@@ -8169,7 +8128,7 @@
           <wp:inline distT="0" distB="0" distL="0" distR="0">
             <wp:extent cx="4857750" cy="5334000"/>
             <wp:effectExtent t="0" r="0" b="0" l="0"/>
-            <wp:docPr id="1" name="" descr="" title=""/>
+            <wp:docPr id="3" name="" descr="" title=""/>
             <wp:cNvGraphicFramePr>
               <a:graphicFrameLocks xmlns:a="http://schemas.openxmlformats.org/drawingml/2006/main" noChangeAspect="1"/>
             </wp:cNvGraphicFramePr>
@@ -8525,7 +8484,7 @@
           <wp:inline distT="0" distB="0" distL="0" distR="0">
             <wp:extent cx="3800475" cy="4953000"/>
             <wp:effectExtent t="0" r="0" b="0" l="0"/>
-            <wp:docPr id="1" name="" descr="" title=""/>
+            <wp:docPr id="4" name="" descr="" title=""/>
             <wp:cNvGraphicFramePr>
               <a:graphicFrameLocks xmlns:a="http://schemas.openxmlformats.org/drawingml/2006/main" noChangeAspect="1"/>
             </wp:cNvGraphicFramePr>
@@ -8603,7 +8562,7 @@
           <wp:inline distT="0" distB="0" distL="0" distR="0">
             <wp:extent cx="3000375" cy="4572000"/>
             <wp:effectExtent t="0" r="0" b="0" l="0"/>
-            <wp:docPr id="1" name="" descr="" title=""/>
+            <wp:docPr id="5" name="" descr="" title=""/>
             <wp:cNvGraphicFramePr>
               <a:graphicFrameLocks xmlns:a="http://schemas.openxmlformats.org/drawingml/2006/main" noChangeAspect="1"/>
             </wp:cNvGraphicFramePr>
@@ -8681,7 +8640,7 @@
           <wp:inline distT="0" distB="0" distL="0" distR="0">
             <wp:extent cx="4733925" cy="4953000"/>
             <wp:effectExtent t="0" r="0" b="0" l="0"/>
-            <wp:docPr id="1" name="" descr="" title=""/>
+            <wp:docPr id="6" name="" descr="" title=""/>
             <wp:cNvGraphicFramePr>
               <a:graphicFrameLocks xmlns:a="http://schemas.openxmlformats.org/drawingml/2006/main" noChangeAspect="1"/>
             </wp:cNvGraphicFramePr>
@@ -8759,7 +8718,7 @@
           <wp:inline distT="0" distB="0" distL="0" distR="0">
             <wp:extent cx="3238500" cy="4191000"/>
             <wp:effectExtent t="0" r="0" b="0" l="0"/>
-            <wp:docPr id="1" name="" descr="" title=""/>
+            <wp:docPr id="7" name="" descr="" title=""/>
             <wp:cNvGraphicFramePr>
               <a:graphicFrameLocks xmlns:a="http://schemas.openxmlformats.org/drawingml/2006/main" noChangeAspect="1"/>
             </wp:cNvGraphicFramePr>
@@ -8837,7 +8796,7 @@
           <wp:inline distT="0" distB="0" distL="0" distR="0">
             <wp:extent cx="3933825" cy="4572000"/>
             <wp:effectExtent t="0" r="0" b="0" l="0"/>
-            <wp:docPr id="1" name="" descr="" title=""/>
+            <wp:docPr id="8" name="" descr="" title=""/>
             <wp:cNvGraphicFramePr>
               <a:graphicFrameLocks xmlns:a="http://schemas.openxmlformats.org/drawingml/2006/main" noChangeAspect="1"/>
             </wp:cNvGraphicFramePr>
@@ -8915,7 +8874,7 @@
           <wp:inline distT="0" distB="0" distL="0" distR="0">
             <wp:extent cx="4095750" cy="4572000"/>
             <wp:effectExtent t="0" r="0" b="0" l="0"/>
-            <wp:docPr id="1" name="" descr="" title=""/>
+            <wp:docPr id="9" name="" descr="" title=""/>
             <wp:cNvGraphicFramePr>
               <a:graphicFrameLocks xmlns:a="http://schemas.openxmlformats.org/drawingml/2006/main" noChangeAspect="1"/>
             </wp:cNvGraphicFramePr>
@@ -11091,8 +11050,8 @@
     <w:p>
       <w:pPr>
         <w:sectPr>
-          <w:headerReference w:type="default" r:id="rId7"/>
-          <w:footerReference w:type="default" r:id="rId8"/>
+          <w:headerReference w:type="default" r:id="rId6"/>
+          <w:footerReference w:type="default" r:id="rId7"/>
           <w:pgSz w:w="11906" w:h="16838" w:orient="portrait"/>
           <w:pgMar w:top="1300" w:right="1400" w:bottom="1200" w:left="1400" w:header="708" w:footer="708" w:gutter="0"/>
           <w:pgNumType w:start="1"/>
@@ -11124,7 +11083,7 @@
           <wp:inline distT="0" distB="0" distL="0" distR="0">
             <wp:extent cx="9144000" cy="3333750"/>
             <wp:effectExtent t="0" r="0" b="0" l="0"/>
-            <wp:docPr id="1" name="" descr="" title=""/>
+            <wp:docPr id="10" name="" descr="" title=""/>
             <wp:cNvGraphicFramePr>
               <a:graphicFrameLocks xmlns:a="http://schemas.openxmlformats.org/drawingml/2006/main" noChangeAspect="1"/>
             </wp:cNvGraphicFramePr>
@@ -11193,7 +11152,7 @@
           <wp:inline distT="0" distB="0" distL="0" distR="0">
             <wp:extent cx="9144000" cy="2838450"/>
             <wp:effectExtent t="0" r="0" b="0" l="0"/>
-            <wp:docPr id="1" name="" descr="" title=""/>
+            <wp:docPr id="11" name="" descr="" title=""/>
             <wp:cNvGraphicFramePr>
               <a:graphicFrameLocks xmlns:a="http://schemas.openxmlformats.org/drawingml/2006/main" noChangeAspect="1"/>
             </wp:cNvGraphicFramePr>
@@ -11262,7 +11221,7 @@
           <wp:inline distT="0" distB="0" distL="0" distR="0">
             <wp:extent cx="9144000" cy="2943225"/>
             <wp:effectExtent t="0" r="0" b="0" l="0"/>
-            <wp:docPr id="1" name="" descr="" title=""/>
+            <wp:docPr id="12" name="" descr="" title=""/>
             <wp:cNvGraphicFramePr>
               <a:graphicFrameLocks xmlns:a="http://schemas.openxmlformats.org/drawingml/2006/main" noChangeAspect="1"/>
             </wp:cNvGraphicFramePr>
@@ -11331,7 +11290,7 @@
           <wp:inline distT="0" distB="0" distL="0" distR="0">
             <wp:extent cx="9144000" cy="3752850"/>
             <wp:effectExtent t="0" r="0" b="0" l="0"/>
-            <wp:docPr id="1" name="" descr="" title=""/>
+            <wp:docPr id="13" name="" descr="" title=""/>
             <wp:cNvGraphicFramePr>
               <a:graphicFrameLocks xmlns:a="http://schemas.openxmlformats.org/drawingml/2006/main" noChangeAspect="1"/>
             </wp:cNvGraphicFramePr>
@@ -11400,7 +11359,7 @@
           <wp:inline distT="0" distB="0" distL="0" distR="0">
             <wp:extent cx="9144000" cy="2409825"/>
             <wp:effectExtent t="0" r="0" b="0" l="0"/>
-            <wp:docPr id="1" name="" descr="" title=""/>
+            <wp:docPr id="14" name="" descr="" title=""/>
             <wp:cNvGraphicFramePr>
               <a:graphicFrameLocks xmlns:a="http://schemas.openxmlformats.org/drawingml/2006/main" noChangeAspect="1"/>
             </wp:cNvGraphicFramePr>
@@ -11469,7 +11428,7 @@
           <wp:inline distT="0" distB="0" distL="0" distR="0">
             <wp:extent cx="9144000" cy="2952750"/>
             <wp:effectExtent t="0" r="0" b="0" l="0"/>
-            <wp:docPr id="1" name="" descr="" title=""/>
+            <wp:docPr id="15" name="" descr="" title=""/>
             <wp:cNvGraphicFramePr>
               <a:graphicFrameLocks xmlns:a="http://schemas.openxmlformats.org/drawingml/2006/main" noChangeAspect="1"/>
             </wp:cNvGraphicFramePr>
@@ -11536,9 +11495,9 @@
       <w:r>
         <w:drawing>
           <wp:inline distT="0" distB="0" distL="0" distR="0">
-            <wp:extent cx="9144000" cy="3190875"/>
+            <wp:extent cx="9144000" cy="2600325"/>
             <wp:effectExtent t="0" r="0" b="0" l="0"/>
-            <wp:docPr id="1" name="" descr="" title=""/>
+            <wp:docPr id="16" name="" descr="" title=""/>
             <wp:cNvGraphicFramePr>
               <a:graphicFrameLocks xmlns:a="http://schemas.openxmlformats.org/drawingml/2006/main" noChangeAspect="1"/>
             </wp:cNvGraphicFramePr>
@@ -11561,7 +11520,7 @@
                   <pic:spPr bwMode="auto">
                     <a:xfrm>
                       <a:off x="0" y="0"/>
-                      <a:ext cx="9144000" cy="3190875"/>
+                      <a:ext cx="9144000" cy="2600325"/>
                     </a:xfrm>
                     <a:prstGeom prst="rect">
                       <a:avLst/>
@@ -11605,9 +11564,9 @@
       <w:r>
         <w:drawing>
           <wp:inline distT="0" distB="0" distL="0" distR="0">
-            <wp:extent cx="9144000" cy="2495550"/>
+            <wp:extent cx="9144000" cy="2505075"/>
             <wp:effectExtent t="0" r="0" b="0" l="0"/>
-            <wp:docPr id="1" name="" descr="" title=""/>
+            <wp:docPr id="17" name="" descr="" title=""/>
             <wp:cNvGraphicFramePr>
               <a:graphicFrameLocks xmlns:a="http://schemas.openxmlformats.org/drawingml/2006/main" noChangeAspect="1"/>
             </wp:cNvGraphicFramePr>
@@ -11630,7 +11589,7 @@
                   <pic:spPr bwMode="auto">
                     <a:xfrm>
                       <a:off x="0" y="0"/>
-                      <a:ext cx="9144000" cy="2495550"/>
+                      <a:ext cx="9144000" cy="2505075"/>
                     </a:xfrm>
                     <a:prstGeom prst="rect">
                       <a:avLst/>
@@ -11676,7 +11635,7 @@
           <wp:inline distT="0" distB="0" distL="0" distR="0">
             <wp:extent cx="9144000" cy="3124200"/>
             <wp:effectExtent t="0" r="0" b="0" l="0"/>
-            <wp:docPr id="1" name="" descr="" title=""/>
+            <wp:docPr id="18" name="" descr="" title=""/>
             <wp:cNvGraphicFramePr>
               <a:graphicFrameLocks xmlns:a="http://schemas.openxmlformats.org/drawingml/2006/main" noChangeAspect="1"/>
             </wp:cNvGraphicFramePr>
@@ -11745,7 +11704,7 @@
           <wp:inline distT="0" distB="0" distL="0" distR="0">
             <wp:extent cx="9144000" cy="2705100"/>
             <wp:effectExtent t="0" r="0" b="0" l="0"/>
-            <wp:docPr id="1" name="" descr="" title=""/>
+            <wp:docPr id="19" name="" descr="" title=""/>
             <wp:cNvGraphicFramePr>
               <a:graphicFrameLocks xmlns:a="http://schemas.openxmlformats.org/drawingml/2006/main" noChangeAspect="1"/>
             </wp:cNvGraphicFramePr>
@@ -11827,7 +11786,7 @@
           <wp:inline distT="0" distB="0" distL="0" distR="0">
             <wp:extent cx="5324475" cy="4953000"/>
             <wp:effectExtent t="0" r="0" b="0" l="0"/>
-            <wp:docPr id="1" name="" descr="" title=""/>
+            <wp:docPr id="20" name="" descr="" title=""/>
             <wp:cNvGraphicFramePr>
               <a:graphicFrameLocks xmlns:a="http://schemas.openxmlformats.org/drawingml/2006/main" noChangeAspect="1"/>
             </wp:cNvGraphicFramePr>
@@ -11881,8 +11840,8 @@
       </w:r>
     </w:p>
     <w:sectPr>
-      <w:headerReference w:type="default" r:id="rId9"/>
-      <w:footerReference w:type="default" r:id="rId10"/>
+      <w:headerReference w:type="default" r:id="rId8"/>
+      <w:footerReference w:type="default" r:id="rId9"/>
       <w:pgSz w:w="16838" w:h="11906" w:orient="landscape"/>
       <w:pgMar w:top="1000" w:right="1100" w:bottom="900" w:left="1100" w:header="708" w:footer="708" w:gutter="0"/>
       <w:pgNumType/>
@@ -11890,10 +11849,6 @@
     </w:sectPr>
   </w:body>
 </w:document>
-</file>
-
-<file path=word/comments.xml><?xml version="1.0" encoding="utf-8"?>
-<w:comments xmlns:cx="http://schemas.microsoft.com/office/drawing/2014/chartex" xmlns:cx1="http://schemas.microsoft.com/office/drawing/2015/9/8/chartex" xmlns:cx2="http://schemas.microsoft.com/office/drawing/2015/10/21/chartex" xmlns:cx3="http://schemas.microsoft.com/office/drawing/2016/5/9/chartex" xmlns:cx4="http://schemas.microsoft.com/office/drawing/2016/5/10/chartex" xmlns:cx5="http://schemas.microsoft.com/office/drawing/2016/5/11/chartex" xmlns:cx6="http://schemas.microsoft.com/office/drawing/2016/5/12/chartex" xmlns:cx7="http://schemas.microsoft.com/office/drawing/2016/5/13/chartex" xmlns:cx8="http://schemas.microsoft.com/office/drawing/2016/5/14/chartex" xmlns:mc="http://schemas.openxmlformats.org/markup-compatibility/2006" xmlns:aink="http://schemas.microsoft.com/office/drawing/2016/ink" xmlns:am3d="http://schemas.microsoft.com/office/drawing/2017/model3d" xmlns:o="urn:schemas-microsoft-com:office:office" xmlns:r="http://schemas.openxmlformats.org/officeDocument/2006/relationships" xmlns:m="http://schemas.openxmlformats.org/officeDocument/2006/math" xmlns:v="urn:schemas-microsoft-com:vml" xmlns:wp14="http://schemas.microsoft.com/office/word/2010/wordprocessingDrawing" xmlns:wp="http://schemas.openxmlformats.org/drawingml/2006/wordprocessingDrawing" xmlns:w10="urn:schemas-microsoft-com:office:word" xmlns:w="http://schemas.openxmlformats.org/wordprocessingml/2006/main" xmlns:w14="http://schemas.microsoft.com/office/word/2010/wordml" xmlns:w15="http://schemas.microsoft.com/office/word/2012/wordml" xmlns:w16cex="http://schemas.microsoft.com/office/word/2018/wordml/cex" xmlns:w16cid="http://schemas.microsoft.com/office/word/2016/wordml/cid" xmlns:w16="http://schemas.microsoft.com/office/word/2018/wordml" xmlns:w16sdtdh="http://schemas.microsoft.com/office/word/2020/wordml/sdtdatahash" xmlns:w16se="http://schemas.microsoft.com/office/word/2015/wordml/symex" xmlns:wpg="http://schemas.microsoft.com/office/word/2010/wordprocessingGroup" xmlns:wpi="http://schemas.microsoft.com/office/word/2010/wordprocessingInk" xmlns:wne="http://schemas.microsoft.com/office/word/2006/wordml" xmlns:wps="http://schemas.microsoft.com/office/word/2010/wordprocessingShape"/>
 </file>
 
 <file path=word/endnotes.xml><?xml version="1.0" encoding="utf-8"?>
@@ -12064,7 +12019,7 @@
 <w:numbering xmlns:wpc="http://schemas.microsoft.com/office/word/2010/wordprocessingCanvas" xmlns:mc="http://schemas.openxmlformats.org/markup-compatibility/2006" xmlns:o="urn:schemas-microsoft-com:office:office" xmlns:r="http://schemas.openxmlformats.org/officeDocument/2006/relationships" xmlns:m="http://schemas.openxmlformats.org/officeDocument/2006/math" xmlns:v="urn:schemas-microsoft-com:vml" xmlns:wp14="http://schemas.microsoft.com/office/word/2010/wordprocessingDrawing" xmlns:wp="http://schemas.openxmlformats.org/drawingml/2006/wordprocessingDrawing" xmlns:w10="urn:schemas-microsoft-com:office:word" xmlns:w="http://schemas.openxmlformats.org/wordprocessingml/2006/main" xmlns:w14="http://schemas.microsoft.com/office/word/2010/wordml" xmlns:w15="http://schemas.microsoft.com/office/word/2012/wordml" xmlns:wpg="http://schemas.microsoft.com/office/word/2010/wordprocessingGroup" xmlns:wpi="http://schemas.microsoft.com/office/word/2010/wordprocessingInk" xmlns:wne="http://schemas.microsoft.com/office/word/2006/wordml" xmlns:wps="http://schemas.microsoft.com/office/word/2010/wordprocessingShape" mc:Ignorable="w14 w15 wp14">
   <w:abstractNum w:abstractNumId="1" w15:restartNumberingAfterBreak="0">
     <w:multiLevelType w:val="hybridMultilevel"/>
-    <w:lvl w:ilvl="0" w15:tentative="1">
+    <w:lvl w:ilvl="0" w:tentative="1">
       <w:start w:val="1"/>
       <w:numFmt w:val="bullet"/>
       <w:lvlText w:val="●"/>
@@ -12073,7 +12028,7 @@
         <w:ind w:left="720" w:hanging="360"/>
       </w:pPr>
     </w:lvl>
-    <w:lvl w:ilvl="1" w15:tentative="1">
+    <w:lvl w:ilvl="1" w:tentative="1">
       <w:start w:val="1"/>
       <w:numFmt w:val="bullet"/>
       <w:lvlText w:val="○"/>
@@ -12082,7 +12037,7 @@
         <w:ind w:left="1440" w:hanging="360"/>
       </w:pPr>
     </w:lvl>
-    <w:lvl w:ilvl="2" w15:tentative="1">
+    <w:lvl w:ilvl="2" w:tentative="1">
       <w:start w:val="1"/>
       <w:numFmt w:val="bullet"/>
       <w:lvlText w:val="■"/>
@@ -12091,7 +12046,7 @@
         <w:ind w:left="2160" w:hanging="360"/>
       </w:pPr>
     </w:lvl>
-    <w:lvl w:ilvl="3" w15:tentative="1">
+    <w:lvl w:ilvl="3" w:tentative="1">
       <w:start w:val="1"/>
       <w:numFmt w:val="bullet"/>
       <w:lvlText w:val="●"/>
@@ -12100,7 +12055,7 @@
         <w:ind w:left="2880" w:hanging="360"/>
       </w:pPr>
     </w:lvl>
-    <w:lvl w:ilvl="4" w15:tentative="1">
+    <w:lvl w:ilvl="4" w:tentative="1">
       <w:start w:val="1"/>
       <w:numFmt w:val="bullet"/>
       <w:lvlText w:val="○"/>
@@ -12109,7 +12064,7 @@
         <w:ind w:left="3600" w:hanging="360"/>
       </w:pPr>
     </w:lvl>
-    <w:lvl w:ilvl="5" w15:tentative="1">
+    <w:lvl w:ilvl="5" w:tentative="1">
       <w:start w:val="1"/>
       <w:numFmt w:val="bullet"/>
       <w:lvlText w:val="■"/>
@@ -12118,7 +12073,7 @@
         <w:ind w:left="4320" w:hanging="360"/>
       </w:pPr>
     </w:lvl>
-    <w:lvl w:ilvl="6" w15:tentative="1">
+    <w:lvl w:ilvl="6" w:tentative="1">
       <w:start w:val="1"/>
       <w:numFmt w:val="bullet"/>
       <w:lvlText w:val="●"/>
@@ -12127,7 +12082,7 @@
         <w:ind w:left="5040" w:hanging="360"/>
       </w:pPr>
     </w:lvl>
-    <w:lvl w:ilvl="7" w15:tentative="1">
+    <w:lvl w:ilvl="7" w:tentative="1">
       <w:start w:val="1"/>
       <w:numFmt w:val="bullet"/>
       <w:lvlText w:val="●"/>
@@ -12136,7 +12091,7 @@
         <w:ind w:left="5760" w:hanging="360"/>
       </w:pPr>
     </w:lvl>
-    <w:lvl w:ilvl="8" w15:tentative="1">
+    <w:lvl w:ilvl="8" w:tentative="1">
       <w:start w:val="1"/>
       <w:numFmt w:val="bullet"/>
       <w:lvlText w:val="●"/>
@@ -12148,7 +12103,7 @@
   </w:abstractNum>
   <w:abstractNum w:abstractNumId="2" w15:restartNumberingAfterBreak="0">
     <w:multiLevelType w:val="hybridMultilevel"/>
-    <w:lvl w:ilvl="0" w15:tentative="1">
+    <w:lvl w:ilvl="0" w:tentative="1">
       <w:start w:val="1"/>
       <w:numFmt w:val="bullet"/>
       <w:lvlText w:val="•"/>
@@ -12160,7 +12115,7 @@
   </w:abstractNum>
   <w:abstractNum w:abstractNumId="3" w15:restartNumberingAfterBreak="0">
     <w:multiLevelType w:val="hybridMultilevel"/>
-    <w:lvl w:ilvl="0" w15:tentative="1">
+    <w:lvl w:ilvl="0" w:tentative="1">
       <w:start w:val="1"/>
       <w:numFmt w:val="decimal"/>
       <w:lvlText w:val="%1."/>
@@ -12197,6 +12152,10 @@
     </w:rPrDefault>
     <w:pPrDefault/>
   </w:docDefaults>
+  <w:style w:type="paragraph" w:styleId="Normal" w:default="1">
+    <w:name w:val="Normal"/>
+    <w:qFormat/>
+  </w:style>
   <w:style w:type="paragraph" w:styleId="Title">
     <w:name w:val="Title"/>
     <w:basedOn w:val="Normal"/>
@@ -12205,39 +12164,6 @@
     <w:rPr>
       <w:sz w:val="56"/>
       <w:szCs w:val="56"/>
-    </w:rPr>
-  </w:style>
-  <w:style w:type="paragraph" w:styleId="Heading1">
-    <w:name w:val="Heading 1"/>
-    <w:basedOn w:val="Normal"/>
-    <w:next w:val="Normal"/>
-    <w:qFormat/>
-    <w:rPr>
-      <w:color w:val="2E74B5"/>
-      <w:sz w:val="32"/>
-      <w:szCs w:val="32"/>
-    </w:rPr>
-  </w:style>
-  <w:style w:type="paragraph" w:styleId="Heading2">
-    <w:name w:val="Heading 2"/>
-    <w:basedOn w:val="Normal"/>
-    <w:next w:val="Normal"/>
-    <w:qFormat/>
-    <w:rPr>
-      <w:color w:val="2E74B5"/>
-      <w:sz w:val="26"/>
-      <w:szCs w:val="26"/>
-    </w:rPr>
-  </w:style>
-  <w:style w:type="paragraph" w:styleId="Heading3">
-    <w:name w:val="Heading 3"/>
-    <w:basedOn w:val="Normal"/>
-    <w:next w:val="Normal"/>
-    <w:qFormat/>
-    <w:rPr>
-      <w:color w:val="1F4D78"/>
-      <w:sz w:val="24"/>
-      <w:szCs w:val="24"/>
     </w:rPr>
   </w:style>
   <w:style w:type="paragraph" w:styleId="Heading4">
@@ -12423,4 +12349,294 @@
     </w:rPr>
   </w:style>
 </w:styles>
+</file>
+
+<file path=word/theme/theme1.xml><?xml version="1.0" encoding="utf-8"?>
+<a:theme xmlns:a="http://schemas.openxmlformats.org/drawingml/2006/main" name="Office Theme">
+  <a:themeElements>
+    <a:clrScheme name="Office">
+      <a:dk1>
+        <a:sysClr val="windowText" lastClr="000000"/>
+      </a:dk1>
+      <a:lt1>
+        <a:sysClr val="window" lastClr="FFFFFF"/>
+      </a:lt1>
+      <a:dk2>
+        <a:srgbClr val="44546A"/>
+      </a:dk2>
+      <a:lt2>
+        <a:srgbClr val="E7E6E6"/>
+      </a:lt2>
+      <a:accent1>
+        <a:srgbClr val="4472C4"/>
+      </a:accent1>
+      <a:accent2>
+        <a:srgbClr val="ED7D31"/>
+      </a:accent2>
+      <a:accent3>
+        <a:srgbClr val="A5A5A5"/>
+      </a:accent3>
+      <a:accent4>
+        <a:srgbClr val="FFC000"/>
+      </a:accent4>
+      <a:accent5>
+        <a:srgbClr val="5B9BD5"/>
+      </a:accent5>
+      <a:accent6>
+        <a:srgbClr val="70AD47"/>
+      </a:accent6>
+      <a:hlink>
+        <a:srgbClr val="0563C1"/>
+      </a:hlink>
+      <a:folHlink>
+        <a:srgbClr val="954F72"/>
+      </a:folHlink>
+    </a:clrScheme>
+    <a:fontScheme name="Office">
+      <a:majorFont>
+        <a:latin typeface="Calibri Light" panose="020F0302020204030204"/>
+        <a:ea typeface=""/>
+        <a:cs typeface=""/>
+        <a:font script="Jpan" typeface="游ゴシック Light"/>
+        <a:font script="Hang" typeface="맑은 고딕"/>
+        <a:font script="Hans" typeface="等线 Light"/>
+        <a:font script="Hant" typeface="新細明體"/>
+        <a:font script="Arab" typeface="Times New Roman"/>
+        <a:font script="Hebr" typeface="Times New Roman"/>
+        <a:font script="Thai" typeface="Angsana New"/>
+        <a:font script="Ethi" typeface="Nyala"/>
+        <a:font script="Beng" typeface="Vrinda"/>
+        <a:font script="Gujr" typeface="Shruti"/>
+        <a:font script="Khmr" typeface="MoolBoran"/>
+        <a:font script="Knda" typeface="Tunga"/>
+        <a:font script="Guru" typeface="Raavi"/>
+        <a:font script="Cans" typeface="Euphemia"/>
+        <a:font script="Cher" typeface="Plantagenet Cherokee"/>
+        <a:font script="Yiii" typeface="Microsoft Yi Baiti"/>
+        <a:font script="Tibt" typeface="Microsoft Himalaya"/>
+        <a:font script="Thaa" typeface="MV Boli"/>
+        <a:font script="Deva" typeface="Mangal"/>
+        <a:font script="Telu" typeface="Gautami"/>
+        <a:font script="Taml" typeface="Latha"/>
+        <a:font script="Syrc" typeface="Estrangelo Edessa"/>
+        <a:font script="Orya" typeface="Kalinga"/>
+        <a:font script="Mlym" typeface="Kartika"/>
+        <a:font script="Laoo" typeface="DokChampa"/>
+        <a:font script="Sinh" typeface="Iskoola Pota"/>
+        <a:font script="Mong" typeface="Mongolian Baiti"/>
+        <a:font script="Viet" typeface="Times New Roman"/>
+        <a:font script="Uigh" typeface="Microsoft Uighur"/>
+        <a:font script="Geor" typeface="Sylfaen"/>
+        <a:font script="Armn" typeface="Arial"/>
+        <a:font script="Bugi" typeface="Leelawadee UI"/>
+        <a:font script="Bopo" typeface="Microsoft JhengHei"/>
+        <a:font script="Java" typeface="Javanese Text"/>
+        <a:font script="Lisu" typeface="Segoe UI"/>
+        <a:font script="Mymr" typeface="Myanmar Text"/>
+        <a:font script="Nkoo" typeface="Ebrima"/>
+        <a:font script="Olck" typeface="Nirmala UI"/>
+        <a:font script="Osma" typeface="Ebrima"/>
+        <a:font script="Phag" typeface="Phagspa"/>
+        <a:font script="Syrn" typeface="Estrangelo Edessa"/>
+        <a:font script="Syrj" typeface="Estrangelo Edessa"/>
+        <a:font script="Syre" typeface="Estrangelo Edessa"/>
+        <a:font script="Sora" typeface="Nirmala UI"/>
+        <a:font script="Tale" typeface="Microsoft Tai Le"/>
+        <a:font script="Talu" typeface="Microsoft New Tai Lue"/>
+        <a:font script="Tfng" typeface="Ebrima"/>
+      </a:majorFont>
+      <a:minorFont>
+        <a:latin typeface="Calibri" panose="020F0502020204030204"/>
+        <a:ea typeface=""/>
+        <a:cs typeface=""/>
+        <a:font script="Jpan" typeface="游明朝"/>
+        <a:font script="Hang" typeface="맑은 고딕"/>
+        <a:font script="Hans" typeface="等线"/>
+        <a:font script="Hant" typeface="新細明體"/>
+        <a:font script="Arab" typeface="Arial"/>
+        <a:font script="Hebr" typeface="Arial"/>
+        <a:font script="Thai" typeface="Cordia New"/>
+        <a:font script="Ethi" typeface="Nyala"/>
+        <a:font script="Beng" typeface="Vrinda"/>
+        <a:font script="Gujr" typeface="Shruti"/>
+        <a:font script="Khmr" typeface="DaunPenh"/>
+        <a:font script="Knda" typeface="Tunga"/>
+        <a:font script="Guru" typeface="Raavi"/>
+        <a:font script="Cans" typeface="Euphemia"/>
+        <a:font script="Cher" typeface="Plantagenet Cherokee"/>
+        <a:font script="Yiii" typeface="Microsoft Yi Baiti"/>
+        <a:font script="Tibt" typeface="Microsoft Himalaya"/>
+        <a:font script="Thaa" typeface="MV Boli"/>
+        <a:font script="Deva" typeface="Mangal"/>
+        <a:font script="Telu" typeface="Gautami"/>
+        <a:font script="Taml" typeface="Latha"/>
+        <a:font script="Syrc" typeface="Estrangelo Edessa"/>
+        <a:font script="Orya" typeface="Kalinga"/>
+        <a:font script="Mlym" typeface="Kartika"/>
+        <a:font script="Laoo" typeface="DokChampa"/>
+        <a:font script="Sinh" typeface="Iskoola Pota"/>
+        <a:font script="Mong" typeface="Mongolian Baiti"/>
+        <a:font script="Viet" typeface="Arial"/>
+        <a:font script="Uigh" typeface="Microsoft Uighur"/>
+        <a:font script="Geor" typeface="Sylfaen"/>
+        <a:font script="Armn" typeface="Arial"/>
+        <a:font script="Bugi" typeface="Leelawadee UI"/>
+        <a:font script="Bopo" typeface="Microsoft JhengHei"/>
+        <a:font script="Java" typeface="Javanese Text"/>
+        <a:font script="Lisu" typeface="Segoe UI"/>
+        <a:font script="Mymr" typeface="Myanmar Text"/>
+        <a:font script="Nkoo" typeface="Ebrima"/>
+        <a:font script="Olck" typeface="Nirmala UI"/>
+        <a:font script="Osma" typeface="Ebrima"/>
+        <a:font script="Phag" typeface="Phagspa"/>
+        <a:font script="Syrn" typeface="Estrangelo Edessa"/>
+        <a:font script="Syrj" typeface="Estrangelo Edessa"/>
+        <a:font script="Syre" typeface="Estrangelo Edessa"/>
+        <a:font script="Sora" typeface="Nirmala UI"/>
+        <a:font script="Tale" typeface="Microsoft Tai Le"/>
+        <a:font script="Talu" typeface="Microsoft New Tai Lue"/>
+        <a:font script="Tfng" typeface="Ebrima"/>
+      </a:minorFont>
+    </a:fontScheme>
+    <a:fmtScheme name="Office">
+      <a:fillStyleLst>
+        <a:solidFill>
+          <a:schemeClr val="phClr"/>
+        </a:solidFill>
+        <a:gradFill rotWithShape="true">
+          <a:gsLst>
+            <a:gs pos="0">
+              <a:schemeClr val="phClr">
+                <a:lumMod val="110000"/>
+                <a:satMod val="105000"/>
+                <a:tint val="67000"/>
+              </a:schemeClr>
+            </a:gs>
+            <a:gs pos="50000">
+              <a:schemeClr val="phClr">
+                <a:lumMod val="105000"/>
+                <a:satMod val="103000"/>
+                <a:tint val="73000"/>
+              </a:schemeClr>
+            </a:gs>
+            <a:gs pos="100000">
+              <a:schemeClr val="phClr">
+                <a:lumMod val="105000"/>
+                <a:satMod val="109000"/>
+                <a:tint val="81000"/>
+              </a:schemeClr>
+            </a:gs>
+          </a:gsLst>
+          <a:lin ang="5400000" scaled="false"/>
+        </a:gradFill>
+        <a:gradFill rotWithShape="true">
+          <a:gsLst>
+            <a:gs pos="0">
+              <a:schemeClr val="phClr">
+                <a:satMod val="103000"/>
+                <a:lumMod val="102000"/>
+                <a:tint val="94000"/>
+              </a:schemeClr>
+            </a:gs>
+            <a:gs pos="50000">
+              <a:schemeClr val="phClr">
+                <a:satMod val="110000"/>
+                <a:lumMod val="100000"/>
+                <a:shade val="100000"/>
+              </a:schemeClr>
+            </a:gs>
+            <a:gs pos="100000">
+              <a:schemeClr val="phClr">
+                <a:lumMod val="99000"/>
+                <a:satMod val="120000"/>
+                <a:shade val="78000"/>
+              </a:schemeClr>
+            </a:gs>
+          </a:gsLst>
+          <a:lin ang="5400000" scaled="false"/>
+        </a:gradFill>
+      </a:fillStyleLst>
+      <a:lnStyleLst>
+        <a:ln w="6350" cap="flat" cmpd="sng" algn="ctr">
+          <a:solidFill>
+            <a:schemeClr val="phClr"/>
+          </a:solidFill>
+          <a:prstDash val="solid"/>
+          <a:miter lim="800000"/>
+        </a:ln>
+        <a:ln w="12700" cap="flat" cmpd="sng" algn="ctr">
+          <a:solidFill>
+            <a:schemeClr val="phClr"/>
+          </a:solidFill>
+          <a:prstDash val="solid"/>
+          <a:miter lim="800000"/>
+        </a:ln>
+        <a:ln w="19050" cap="flat" cmpd="sng" algn="ctr">
+          <a:solidFill>
+            <a:schemeClr val="phClr"/>
+          </a:solidFill>
+          <a:prstDash val="solid"/>
+          <a:miter lim="800000"/>
+        </a:ln>
+      </a:lnStyleLst>
+      <a:effectStyleLst>
+        <a:effectStyle>
+          <a:effectLst/>
+        </a:effectStyle>
+        <a:effectStyle>
+          <a:effectLst/>
+        </a:effectStyle>
+        <a:effectStyle>
+          <a:effectLst>
+            <a:outerShdw blurRad="57150" dist="19050" dir="5400000" algn="ctr" rotWithShape="false">
+              <a:srgbClr val="000000">
+                <a:alpha val="63000"/>
+              </a:srgbClr>
+            </a:outerShdw>
+          </a:effectLst>
+        </a:effectStyle>
+      </a:effectStyleLst>
+      <a:bgFillStyleLst>
+        <a:solidFill>
+          <a:schemeClr val="phClr"/>
+        </a:solidFill>
+        <a:solidFill>
+          <a:schemeClr val="phClr">
+            <a:tint val="95000"/>
+            <a:satMod val="170000"/>
+          </a:schemeClr>
+        </a:solidFill>
+        <a:gradFill rotWithShape="true">
+          <a:gsLst>
+            <a:gs pos="0">
+              <a:schemeClr val="phClr">
+                <a:tint val="93000"/>
+                <a:satMod val="150000"/>
+                <a:shade val="98000"/>
+                <a:lumMod val="102000"/>
+              </a:schemeClr>
+            </a:gs>
+            <a:gs pos="50000">
+              <a:schemeClr val="phClr">
+                <a:tint val="98000"/>
+                <a:satMod val="130000"/>
+                <a:shade val="90000"/>
+                <a:lumMod val="103000"/>
+              </a:schemeClr>
+            </a:gs>
+            <a:gs pos="100000">
+              <a:schemeClr val="phClr">
+                <a:shade val="63000"/>
+                <a:satMod val="120000"/>
+              </a:schemeClr>
+            </a:gs>
+          </a:gsLst>
+          <a:lin ang="5400000" scaled="false"/>
+        </a:gradFill>
+      </a:bgFillStyleLst>
+    </a:fmtScheme>
+  </a:themeElements>
+  <a:objectDefaults/>
+  <a:extraClrSchemeLst/>
+</a:theme>
 </file>
</xml_diff>

<commit_message>
[T04 2026-10-05] fix: refresh images, doku and slides after E-20
- PNGs P05/P06 (bpmn-js), SD3, SD6 und Use-Case-Diagramm (PlantUML) neu gerendert
- Folienausschnitt P05 neu, Bildmaße aktualisiert
- Projektdokumentation und Präsentation mit Kennzahlen nach E-20 (131 Aktivitäten, Ø 13,1)
- Entscheidungslog: Ø 13,1, offene Punkte zu E-20 präzisiert; Protokoll: E-20 bei Adrians Aufgabe
- README: erledigte Export-Aufgabe entfernt

Co-Authored-By: Claude Opus 5.5 <noreply@anthropic.com>
Claude-Session: https://claude.ai/code/session_01H2bGsFaySUqsEjJ1PXuxUw
</commit_message>
<xml_diff>
--- a/doku/Projektdokumentation.docx
+++ b/doku/Projektdokumentation.docx
@@ -6036,7 +6036,7 @@
                 <w:sz w:val="19"/>
                 <w:szCs w:val="19"/>
               </w:rPr>
-              <w:t xml:space="preserve">13</w:t>
+              <w:t xml:space="preserve">14</w:t>
             </w:r>
           </w:p>
         </w:tc>
@@ -6065,7 +6065,7 @@
                 <w:sz w:val="19"/>
                 <w:szCs w:val="19"/>
               </w:rPr>
-              <w:t xml:space="preserve">10 (77 %)</w:t>
+              <w:t xml:space="preserve">11 (79 %)</w:t>
             </w:r>
           </w:p>
         </w:tc>
@@ -6280,7 +6280,7 @@
                 <w:sz w:val="19"/>
                 <w:szCs w:val="19"/>
               </w:rPr>
-              <w:t xml:space="preserve">9 (64 %)</w:t>
+              <w:t xml:space="preserve">8 (57 %)</w:t>
             </w:r>
           </w:p>
         </w:tc>
@@ -7160,7 +7160,7 @@
           <w:sz w:val="22"/>
           <w:szCs w:val="22"/>
         </w:rPr>
-        <w:t xml:space="preserve">Insgesamt enthalten die zehn Werkstatt-Prozesse 130 Aktivitäten, im Durchschnitt also 13,0 je Diagramm; die Abläufe im Pool Kunde kommen mit weiteren 26 Aktivitäten hinzu und sind in Tabelle 1 nicht mitgezählt. Dazu kommen 39 Nachrichtenflüsse zwischen den Pools und 59 Datenobjekte und Datenspeicher. Jeder Prozess hat auf Prozessebene genau ein Start- und ein Endereignis; alternative Ausgänge werden mit exklusiven Gateways zusammengeführt.</w:t>
+        <w:t xml:space="preserve">Insgesamt enthalten die zehn Werkstatt-Prozesse 131 Aktivitäten, im Durchschnitt also 13,1 je Diagramm; die Abläufe im Pool Kunde kommen mit weiteren 26 Aktivitäten hinzu und sind in Tabelle 1 nicht mitgezählt. Dazu kommen 40 Nachrichtenflüsse zwischen den Pools und 60 Datenobjekte und Datenspeicher. Jeder Prozess hat auf Prozessebene genau ein Start- und ein Endereignis; alternative Ausgänge werden mit exklusiven Gateways zusammengeführt.</w:t>
       </w:r>
     </w:p>
     <w:p>
@@ -7805,7 +7805,7 @@
           <w:sz w:val="22"/>
           <w:szCs w:val="22"/>
         </w:rPr>
-        <w:t xml:space="preserve">Je Ersatzteil prüft RepairFlow in einem parallelen Mehrfach-Teilprozess zuerst den Bestand der eigenen Filiale, dann den der anderen Filialen. Teile werden reserviert oder per Umlagerung angefordert, Fehlteile für die Bestellung markiert. Danach werden die Reservierungen bestätigt; ein unterschrittener Meldebestand erzeugt einen Nachbestellvorschlag. Der Kunde erhält den voraussichtlichen Reparaturbeginn; Fehlteile und Nachbestellvorschläge werden über Prozess 06 bestellt.</w:t>
+        <w:t xml:space="preserve">Je Ersatzteil prüft RepairFlow in einem parallelen Mehrfach-Teilprozess zuerst den Bestand der eigenen Filiale, dann den der anderen Filialen. Teile werden reserviert, bei Bestand in einer anderen Filiale zusätzlich per Umlagerung angefordert, Fehlteile für die Bestellung markiert. Danach werden die Reservierungen bestätigt; ein unterschrittener Meldebestand erzeugt einen Nachbestellvorschlag. Der Service informiert den Kunden über den voraussichtlichen Reparaturbeginn. Nur Fehlteile lösen Prozess 06 direkt aus; ein Nachbestellvorschlag bleibt im Status Vorschlag und wird mit der nächsten Bestellung gebündelt, damit die Reparatur nicht auf Lagernachschub wartet.</w:t>
       </w:r>
     </w:p>
     <w:p>
@@ -7829,7 +7829,7 @@
           <w:sz w:val="22"/>
           <w:szCs w:val="22"/>
         </w:rPr>
-        <w:t xml:space="preserve">Fehlteile und Nachbestellvorschläge werden gebündelt und beim Lieferanten bestellt, bei Überschreitung der Freigabegrenze nach Freigabe durch die Werkstattleitung. Kann der Lieferant nicht liefern, wird die Bestellung storniert und ein alternativer Lieferant gesucht. Nach Auftragsbestätigung wird der Liefertermin am Auftrag hinterlegt (Status „Teile bestellt") und der Kunde bei Verzögerung informiert. Der Wareneingang wird geprüft und gebucht, mangelhafte Lieferungen gehen in die Retoure (Prozess 10). Kommt Ersatz, werden die Teile dem Auftrag zugeordnet; bei Gutschrift wird neu bestellt, solange das Teil noch benötigt wird.</w:t>
+        <w:t xml:space="preserve">Die Fehlteile eines Auftrags werden mit offenen Nachbestellvorschlägen gebündelt und beim Lieferanten bestellt, bei Überschreitung der Freigabegrenze nach Freigabe durch die Werkstattleitung. Kommt binnen 3 Tagen keine Auftragsbestätigung oder kann der Lieferant nicht liefern, wird die Bestellung storniert und ein alternativer Lieferant gesucht. Nach Auftragsbestätigung wird der Liefertermin am Auftrag hinterlegt (Status „Teile bestellt") und der Kunde bei Verzögerung informiert; bleibt die Lieferung 14 Tage aus, wird sie angemahnt. Der Wareneingang wird geprüft und gebucht, mangelhafte Lieferungen gehen in die Retoure (Prozess 10). Eine Ersatzlieferung wird geprüft, bevor die Fehlteile dem Auftrag zugeordnet werden; bei Gutschrift wird neu bestellt, solange das Teil noch benötigt wird.</w:t>
       </w:r>
     </w:p>
     <w:p>
@@ -7952,7 +7952,7 @@
           <w:sz w:val="22"/>
           <w:szCs w:val="22"/>
         </w:rPr>
-        <w:t xml:space="preserve">Von den 130 Aktivitäten sind 79 automatisierte, regelbasierte, sendende oder empfangende Aktivitäten, also 61 Prozent, die RepairFlow ohne manuelle Arbeit ausführt. Weitere 32 Benutzer-Aktivitäten laufen in der Oberfläche der Plattform. Nur 9 Aktivitäten sind manuell und liegen außerhalb der Systemgrenze; die übrigen 10 sind Aufruf-Aktivitäten und ein Mehrfach-Teilprozess. Die Software, die wir in der objektorientierten Analyse entwerfen, automatisiert damit den Reparaturauftrags-Lebenszyklus als zentrales Werkstatt-Management-System:</w:t>
+        <w:t xml:space="preserve">Von den 131 Aktivitäten sind 79 automatisierte, regelbasierte, sendende oder empfangende Aktivitäten, also 60 Prozent, die RepairFlow ohne manuelle Arbeit ausführt. Weitere 33 Benutzer-Aktivitäten laufen in der Oberfläche der Plattform. Nur 9 Aktivitäten sind manuell und liegen außerhalb der Systemgrenze; die übrigen 10 sind Aufruf-Aktivitäten und ein Mehrfach-Teilprozess. Die Software, die wir in der objektorientierten Analyse entwerfen, automatisiert damit den Reparaturauftrags-Lebenszyklus als zentrales Werkstatt-Management-System:</w:t>
       </w:r>
     </w:p>
     <w:p>
@@ -8126,7 +8126,7 @@
       <w:r>
         <w:drawing>
           <wp:inline distT="0" distB="0" distL="0" distR="0">
-            <wp:extent cx="4857750" cy="5334000"/>
+            <wp:extent cx="5715000" cy="4581525"/>
             <wp:effectExtent t="0" r="0" b="0" l="0"/>
             <wp:docPr id="3" name="" descr="" title=""/>
             <wp:cNvGraphicFramePr>
@@ -8151,7 +8151,7 @@
                   <pic:spPr bwMode="auto">
                     <a:xfrm>
                       <a:off x="0" y="0"/>
-                      <a:ext cx="4857750" cy="5334000"/>
+                      <a:ext cx="5715000" cy="4581525"/>
                     </a:xfrm>
                     <a:prstGeom prst="rect">
                       <a:avLst/>
@@ -8192,7 +8192,7 @@
           <w:sz w:val="22"/>
           <w:szCs w:val="22"/>
         </w:rPr>
-        <w:t xml:space="preserve">Die Beziehungen zwischen den Use Cases folgen der Regel: include für einen Teilschritt, der immer ausgeführt wird, extend für bedingtes Verhalten. So schließen „Sofortdiagnose anfordern" und „Ersatzteile disponieren und reservieren" im erfolgreichen Hauptablauf „Ersatzteil-Verfügbarkeit prüfen" ein. „Reparaturauftrag anlegen" erweitert „Reklamation bearbeiten" nur bei freigegebener Nacharbeit oder angenommenem Angebot; bei Ablehnung entsteht kein neuer Auftrag. „Voranmeldung bestätigen" erweitert die Sofortdiagnose nur dann, wenn der Kunde den Vorschlag annimmt; „Diagnosevorschlag prüfen" bleibt ein eigener Use Case vor der Befunderfassung; Prozess 03 enthält dafür keine bedingte Verzweigung, deshalb wird keine extend-Beziehung behauptet; „Nachbestellvorschlag erzeugen" erweitert die Disposition bei unterschrittenem Meldebestand. „Lieferantenbestellung auslösen" erweitert sie bei Fehlteilen oder Nachbestellvorschlag. „Retoure abwickeln" erweitert den Wareneingang bei mangelhafter Lieferung und die Reklamation bei einem defekten Lieferantenteil. Die Bedingungen und Erweiterungspunkte stehen auch in der XMI-Datei. Vorbedingungen wie die Fertigmeldung vor der Rechnung sind bewusst keine include-Beziehungen, weil der Basis-Use-Case den anderen nicht ausführt.</w:t>
+        <w:t xml:space="preserve">Die Beziehungen zwischen den Use Cases folgen der Regel: include für einen Teilschritt, der immer ausgeführt wird, extend für bedingtes Verhalten. So schließen „Sofortdiagnose anfordern" und „Ersatzteile disponieren und reservieren" im erfolgreichen Hauptablauf „Ersatzteil-Verfügbarkeit prüfen" ein. „Reparaturauftrag anlegen" erweitert „Reklamation bearbeiten" nur bei freigegebener Nacharbeit oder angenommenem Angebot; bei Ablehnung entsteht kein neuer Auftrag. „Voranmeldung bestätigen" erweitert die Sofortdiagnose nur dann, wenn der Kunde den Vorschlag annimmt; „Diagnosevorschlag prüfen" bleibt ein eigener Use Case vor der Befunderfassung; Prozess 03 enthält dafür keine bedingte Verzweigung, deshalb wird keine extend-Beziehung behauptet; „Nachbestellvorschlag erzeugen" erweitert die Disposition bei unterschrittenem Meldebestand. „Lieferantenbestellung auslösen" erweitert sie, wenn Fehlteile vorhanden sind. „Retoure abwickeln" erweitert den Wareneingang bei mangelhafter Lieferung und die Reklamation bei einem defekten Lieferantenteil. Die Bedingungen und Erweiterungspunkte stehen auch in der XMI-Datei. Vorbedingungen wie die Fertigmeldung vor der Rechnung sind bewusst keine include-Beziehungen, weil der Basis-Use-Case den anderen nicht ausführt.</w:t>
       </w:r>
     </w:p>
     <w:p>
@@ -8638,7 +8638,7 @@
       <w:r>
         <w:drawing>
           <wp:inline distT="0" distB="0" distL="0" distR="0">
-            <wp:extent cx="4733925" cy="4953000"/>
+            <wp:extent cx="4943475" cy="4953000"/>
             <wp:effectExtent t="0" r="0" b="0" l="0"/>
             <wp:docPr id="6" name="" descr="" title=""/>
             <wp:cNvGraphicFramePr>
@@ -8663,7 +8663,7 @@
                   <pic:spPr bwMode="auto">
                     <a:xfrm>
                       <a:off x="0" y="0"/>
-                      <a:ext cx="4733925" cy="4953000"/>
+                      <a:ext cx="4943475" cy="4953000"/>
                     </a:xfrm>
                     <a:prstGeom prst="rect">
                       <a:avLst/>
@@ -8704,7 +8704,7 @@
           <w:sz w:val="22"/>
           <w:szCs w:val="22"/>
         </w:rPr>
-        <w:t xml:space="preserve">SD3 zeigt den parallelen Mehrfach-Teilprozess je Ersatzteil: eigene Filiale, andere Filialen mit Umlagerung oder Fehlteil markieren. Danach folgen die Bestätigung aller Reservierungen und die Meldebestandsprüfung mit optionalem Nachbestellvorschlag (UC12). Der Techniker ermittelt den Reparaturbeginn und informiert den Kunden. Erst dann startet bei Fehlteilen oder Nachbestellvorschlag UC10; der Status „Teile bestellt" folgt erst nach bestätigter Bestellung in SD6.</w:t>
+        <w:t xml:space="preserve">SD3 zeigt den parallelen Mehrfach-Teilprozess je Ersatzteil: eigene Filiale, andere Filialen mit Umlagerung oder Fehlteil markieren. Danach folgen die Bestätigung aller Reservierungen und die Meldebestandsprüfung mit optionalem Nachbestellvorschlag (UC12). Der Servicemitarbeiter ermittelt den Reparaturbeginn und informiert den Kunden. Erst dann startet bei Fehlteilen UC10, ein Nachbestellvorschlag allein löst keine Bestellung aus; der Status „Teile bestellt" folgt erst nach bestätigter Bestellung in SD6.</w:t>
       </w:r>
     </w:p>
     <w:p>
@@ -8872,7 +8872,7 @@
       <w:r>
         <w:drawing>
           <wp:inline distT="0" distB="0" distL="0" distR="0">
-            <wp:extent cx="4095750" cy="4572000"/>
+            <wp:extent cx="3381375" cy="4572000"/>
             <wp:effectExtent t="0" r="0" b="0" l="0"/>
             <wp:docPr id="9" name="" descr="" title=""/>
             <wp:cNvGraphicFramePr>
@@ -8897,7 +8897,7 @@
                   <pic:spPr bwMode="auto">
                     <a:xfrm>
                       <a:off x="0" y="0"/>
-                      <a:ext cx="4095750" cy="4572000"/>
+                      <a:ext cx="3381375" cy="4572000"/>
                     </a:xfrm>
                     <a:prstGeom prst="rect">
                       <a:avLst/>
@@ -11357,7 +11357,7 @@
       <w:r>
         <w:drawing>
           <wp:inline distT="0" distB="0" distL="0" distR="0">
-            <wp:extent cx="9144000" cy="2409825"/>
+            <wp:extent cx="9144000" cy="2305050"/>
             <wp:effectExtent t="0" r="0" b="0" l="0"/>
             <wp:docPr id="14" name="" descr="" title=""/>
             <wp:cNvGraphicFramePr>
@@ -11382,7 +11382,7 @@
                   <pic:spPr bwMode="auto">
                     <a:xfrm>
                       <a:off x="0" y="0"/>
-                      <a:ext cx="9144000" cy="2409825"/>
+                      <a:ext cx="9144000" cy="2305050"/>
                     </a:xfrm>
                     <a:prstGeom prst="rect">
                       <a:avLst/>
@@ -11426,7 +11426,7 @@
       <w:r>
         <w:drawing>
           <wp:inline distT="0" distB="0" distL="0" distR="0">
-            <wp:extent cx="9144000" cy="2952750"/>
+            <wp:extent cx="9144000" cy="2400300"/>
             <wp:effectExtent t="0" r="0" b="0" l="0"/>
             <wp:docPr id="15" name="" descr="" title=""/>
             <wp:cNvGraphicFramePr>
@@ -11451,7 +11451,7 @@
                   <pic:spPr bwMode="auto">
                     <a:xfrm>
                       <a:off x="0" y="0"/>
-                      <a:ext cx="9144000" cy="2952750"/>
+                      <a:ext cx="9144000" cy="2400300"/>
                     </a:xfrm>
                     <a:prstGeom prst="rect">
                       <a:avLst/>

</xml_diff>

<commit_message>
[T04 2026-10-05] docs: align project documentation with current models
</commit_message>
<xml_diff>
--- a/doku/Projektdokumentation.docx
+++ b/doku/Projektdokumentation.docx
@@ -166,8 +166,17 @@
     </w:p>
     <w:p>
       <w:pPr>
-        <w:spacing w:after="900"/>
-      </w:pPr>
+        <w:spacing w:after="120"/>
+        <w:jc w:val="center"/>
+      </w:pPr>
+      <w:r>
+        <w:rPr>
+          <w:rFonts w:ascii="Calibri" w:hAnsi="Calibri"/>
+          <w:sz w:val="20"/>
+          <w:color w:val="666666"/>
+        </w:rPr>
+        <w:t>Bearbeitungsstand: 5. Oktober 2026</w:t>
+      </w:r>
     </w:p>
     <w:p>
       <w:pPr>
@@ -449,7 +458,7 @@
           <w:sz w:val="20"/>
           <w:szCs w:val="20"/>
         </w:rPr>
-        <w:t xml:space="preserve">3.3 Qualitätssicherung	6</w:t>
+        <w:t xml:space="preserve">3.3 Qualitätssicherung	7</w:t>
       </w:r>
     </w:p>
     <w:p>
@@ -563,7 +572,7 @@
           <w:sz w:val="20"/>
           <w:szCs w:val="20"/>
         </w:rPr>
-        <w:t xml:space="preserve">4.5 Risiken und Gegenmaßnahmen	8</w:t>
+        <w:t xml:space="preserve">4.5 Risiken und Gegenmaßnahmen	9</w:t>
       </w:r>
     </w:p>
     <w:p>
@@ -658,7 +667,7 @@
           <w:sz w:val="20"/>
           <w:szCs w:val="20"/>
         </w:rPr>
-        <w:t xml:space="preserve">5.2 Automatisierungspotential	12</w:t>
+        <w:t xml:space="preserve">5.2 Automatisierungspotential	13</w:t>
       </w:r>
     </w:p>
     <w:p>
@@ -677,7 +686,7 @@
           <w:sz w:val="20"/>
           <w:szCs w:val="20"/>
         </w:rPr>
-        <w:t xml:space="preserve">5.3 Objektorientierte Analyse (UML)	12</w:t>
+        <w:t xml:space="preserve">5.3 Objektorientierte Analyse (UML)	13</w:t>
       </w:r>
     </w:p>
     <w:p>
@@ -734,7 +743,7 @@
           <w:sz w:val="20"/>
           <w:szCs w:val="20"/>
         </w:rPr>
-        <w:t xml:space="preserve">5.3.3 Sequenzdiagramme	14</w:t>
+        <w:t xml:space="preserve">5.3.3 Sequenzdiagramme	15</w:t>
       </w:r>
     </w:p>
     <w:p>
@@ -753,7 +762,7 @@
           <w:sz w:val="20"/>
           <w:szCs w:val="20"/>
         </w:rPr>
-        <w:t xml:space="preserve">5.4 Konsistenz zwischen den Modellen	20</w:t>
+        <w:t xml:space="preserve">5.4 Konsistenz zwischen den Modellen	21</w:t>
       </w:r>
     </w:p>
     <w:p>
@@ -772,7 +781,7 @@
           <w:sz w:val="22"/>
           <w:szCs w:val="22"/>
         </w:rPr>
-        <w:t xml:space="preserve">6 Probleme und Herausforderungen	21</w:t>
+        <w:t xml:space="preserve">6 Probleme und Herausforderungen	22</w:t>
       </w:r>
     </w:p>
     <w:p>
@@ -791,7 +800,7 @@
           <w:sz w:val="22"/>
           <w:szCs w:val="22"/>
         </w:rPr>
-        <w:t xml:space="preserve">7 Feedback	22</w:t>
+        <w:t xml:space="preserve">7 Feedback	24</w:t>
       </w:r>
     </w:p>
     <w:p>
@@ -810,7 +819,7 @@
           <w:sz w:val="20"/>
           <w:szCs w:val="20"/>
         </w:rPr>
-        <w:t xml:space="preserve">7.1 Feedback des Dozenten und Umsetzung	22</w:t>
+        <w:t xml:space="preserve">7.1 Feedback des Dozenten und Umsetzung	24</w:t>
       </w:r>
     </w:p>
     <w:p>
@@ -829,7 +838,7 @@
           <w:sz w:val="20"/>
           <w:szCs w:val="20"/>
         </w:rPr>
-        <w:t xml:space="preserve">7.2 Unser Feedback zur Fallstudie	23</w:t>
+        <w:t xml:space="preserve">7.2 Unser Feedback zur Fallstudie	24</w:t>
       </w:r>
     </w:p>
     <w:p>
@@ -848,7 +857,7 @@
           <w:sz w:val="22"/>
           <w:szCs w:val="22"/>
         </w:rPr>
-        <w:t xml:space="preserve">Anhang A: Abgabestruktur	23</w:t>
+        <w:t xml:space="preserve">Anhang A: Abgabestruktur	24</w:t>
       </w:r>
     </w:p>
     <w:p>
@@ -867,7 +876,7 @@
           <w:sz w:val="22"/>
           <w:szCs w:val="22"/>
         </w:rPr>
-        <w:t xml:space="preserve">Anhang B: Die zehn BPMN-Kollaborationsdiagramme	24</w:t>
+        <w:t xml:space="preserve">Anhang B: Die zehn BPMN-Kollaborationsdiagramme	25</w:t>
       </w:r>
     </w:p>
     <w:p>
@@ -886,7 +895,7 @@
           <w:sz w:val="22"/>
           <w:szCs w:val="22"/>
         </w:rPr>
-        <w:t xml:space="preserve">Anhang C: Das vollständige Klassendiagramm	34</w:t>
+        <w:t xml:space="preserve">Anhang C: Das vollständige Klassendiagramm	35</w:t>
       </w:r>
     </w:p>
     <w:p>
@@ -918,7 +927,7 @@
           <w:sz w:val="22"/>
           <w:szCs w:val="22"/>
         </w:rPr>
-        <w:t xml:space="preserve">Die Fallstudie wurde von sechs Studierenden des Kurses WWI25B4 bearbeitet. Das Team hat sich zu Beginn des Semesters konstituiert und die Zuständigkeiten nach dem Scrum-Vorgehensmodell verteilt (Kapitel 4): Jedes Artefakt hat eine verantwortliche Person, die Projektleitung plant und koordiniert, und die Qualitätssicherung übernimmt eine Person, die nicht selbst modelliert.</w:t>
+        <w:t xml:space="preserve">Die Fallstudie wird von sechs Studierenden des Kurses WWI25B4 bearbeitet. Das Team hat sich zu Beginn des Semesters konstituiert und die Zuständigkeiten nach dem Scrum-Vorgehensmodell verteilt (Kapitel 4): Jedes Artefakt hat eine verantwortliche Person, die Projektleitung plant und koordiniert, und Reviews erfolgen durch eine zweite Person nach dem Vier-Augen-Prinzip.</w:t>
       </w:r>
     </w:p>
     <w:tbl>
@@ -1206,16 +1215,24 @@
               <w:spacing w:after="40" w:line="252"/>
               <w:jc w:val="left"/>
             </w:pPr>
-            <w:r>
-              <w:rPr>
-                <w:rFonts w:ascii="Calibri" w:cs="Calibri" w:eastAsia="Calibri" w:hAnsi="Calibri"/>
-                <w:b w:val="false"/>
-                <w:bCs w:val="false"/>
-                <w:color w:val="000000"/>
-                <w:sz w:val="19"/>
-                <w:szCs w:val="19"/>
-              </w:rPr>
-              <w:t xml:space="preserve">Sicherung der Repositories (Git, VP-Server), Termine, Abgabe-Check</w:t>
+            <w:commentRangeStart w:id="0"/>
+            <w:r>
+              <w:rPr>
+                <w:rFonts w:ascii="Calibri" w:cs="Calibri" w:eastAsia="Calibri" w:hAnsi="Calibri"/>
+                <w:b w:val="false"/>
+                <w:bCs w:val="false"/>
+                <w:color w:val="000000"/>
+                <w:sz w:val="19"/>
+                <w:szCs w:val="19"/>
+              </w:rPr>
+              <w:t xml:space="preserve">Sicherung der Repositories (Git, VP-Server), Termine, Abgabe-Check; SD2, SD4, SD5 und SD6 in Visual Paradigm</w:t>
+            </w:r>
+            <w:commentRangeEnd w:id="0"/>
+            <w:r>
+              <w:rPr>
+                <w:rStyle w:val="CommentReference"/>
+              </w:rPr>
+              <w:commentReference w:id="0"/>
             </w:r>
           </w:p>
         </w:tc>
@@ -1402,7 +1419,7 @@
                 <w:sz w:val="19"/>
                 <w:szCs w:val="19"/>
               </w:rPr>
-              <w:t xml:space="preserve">Sprint-Rituale und Trello-Board; Use-Case-, Klassen- und Sequenzdiagramme in Visual Paradigm, VP-Repository</w:t>
+              <w:t xml:space="preserve">Sprint-Rituale und Trello-Board; Use-Case- und Klassenmodell sowie SD1 und SD3 in Visual Paradigm, VP-Repository</w:t>
             </w:r>
           </w:p>
         </w:tc>
@@ -1649,7 +1666,7 @@
           <w:sz w:val="22"/>
           <w:szCs w:val="22"/>
         </w:rPr>
-        <w:t xml:space="preserve">Unabhängige Reparaturwerkstätten für Fahrräder, E-Bikes und Consumer-Elektronik arbeiten heute oft mit Papier-Auftragszetteln, Excel-Listen und Telefon. Das Reparaturgeschäft wächst, weil E-Bikes wartungsintensiv sind und das Recht auf Reparatur die Nachfrage nach Elektronikreparaturen stützt. Die Abläufe in den Werkstätten halten damit nicht Schritt.</w:t>
+        <w:t xml:space="preserve">Für unser Beispielszenario gehen wir davon aus, dass unabhängige Reparaturwerkstätten für Fahrräder, E-Bikes und Consumer-Elektronik mit Papier-Auftragszetteln, Excel-Listen und Telefon arbeiten. Wir untersuchen, wie RepairFlow diese Abläufe durch eine gemeinsame Auftragsverwaltung und digitale Kommunikation unterstützen kann.</w:t>
       </w:r>
     </w:p>
     <w:p>
@@ -1663,7 +1680,7 @@
           <w:sz w:val="22"/>
           <w:szCs w:val="22"/>
         </w:rPr>
-        <w:t xml:space="preserve">Als Referenz dient uns die FixWerk GmbH, eine fiktive Werkstattkette mit vier Filialen in der Region Karlsruhe, die sowohl Fahrräder und E-Bikes als auch Smartphones, Laptops und Kleingeräte repariert. Aus Gesprächen mit dem Werkstattleiter und aus dem Ist-Ablauf ergeben sich vier wiederkehrende Probleme:</w:t>
+        <w:t xml:space="preserve">Als Referenz dient uns die FixWerk GmbH, eine fiktive Werkstattkette mit vier Filialen in der Region Karlsruhe, die sowohl Fahrräder und E-Bikes als auch Smartphones, Laptops und Kleingeräte repariert. Für dieses Beispielszenario nehmen wir vier wiederkehrende Probleme an:</w:t>
       </w:r>
     </w:p>
     <w:p>
@@ -1762,7 +1779,7 @@
           <w:sz w:val="22"/>
           <w:szCs w:val="22"/>
         </w:rPr>
-        <w:t xml:space="preserve">RepairFlow ist ein Software-Startup, das Werkstätten eine Cloud-Plattform für den gesamten Reparatur-Lebenszyklus anbietet: von der Anfrage des Kunden über Diagnose, Kostenvoranschlag, Ersatzteil-Disposition und Reparatur bis zu Abholung, Rechnung und Reklamation. Wir treten also nicht als Werkstatt auf, sondern als Solution Provider. Die FixWerk GmbH ist unser Pilotkunde, an dessen Prozessen wir die Plattform entwickelt haben.</w:t>
+        <w:t xml:space="preserve">RepairFlow ist ein Software-Startup, das Werkstätten eine Cloud-Plattform für den gesamten Reparatur-Lebenszyklus anbietet: von der Anfrage des Kunden über Diagnose, Kostenvoranschlag, Ersatzteil-Disposition und Reparatur bis zu Abholung, Rechnung und Reklamation. Wir treten also nicht als Werkstatt auf, sondern als Solution Provider. Die FixWerk GmbH ist unser Pilotkunde, an dessen Prozessen wir die Anforderungen an die Plattform modellieren.</w:t>
       </w:r>
     </w:p>
     <w:p>
@@ -1803,7 +1820,7 @@
           <w:sz w:val="22"/>
           <w:szCs w:val="22"/>
         </w:rPr>
-        <w:t xml:space="preserve">Werkstattsoftware gibt es bereits, meist entweder für Fahrradwerkstätten (fixdesk, RO App, Repero) oder für Elektronikreparaturen (RepairDesk, RepairShopr). Keine der verbreiteten Lösungen kombiniert beide Reparaturwelten oder deckt die Ersatzteilversorgung über mehrere Filialen ab. RepairFlow unterscheidet sich in drei Punkten: eine Plattform für Fahrrad, E-Bike und Elektronik mit gemeinsamem Ersatzteillager; eine filialübergreifende Ersatzteil-Disposition mit Beständen, Reservierungen und Umlagerungen über alle Standorte; und die KI-Sofortdiagnose, die dem Kunden einen Diagnosevorschlag mit vorläufigem Kostenvoranschlag liefert, bevor er die Werkstatt betritt (Abschnitt 2.6).</w:t>
+        <w:t xml:space="preserve">RepairFlow soll Fahrrad-, E-Bike- und Elektronikreparaturen in einer gemeinsamen Plattform abbilden. Unser Konzept verbindet ein gemeinsames Ersatzteillager mit filialübergreifender Disposition: Bestände, Reservierungen und Umlagerungen werden über alle Standorte berücksichtigt. Als weiteres Merkmal liefert die KI-Sofortdiagnose dem Kunden einen Diagnosevorschlag mit vorläufigem Kostenvoranschlag, bevor er die Werkstatt betritt (Abschnitt 2.6). Diese Merkmale beschreiben den Zuschnitt unseres Entwurfs; ein belegter Funktionsvergleich mit bestehenden Werkstattlösungen liegt der Dokumentation nicht zugrunde.</w:t>
       </w:r>
     </w:p>
     <w:p>
@@ -1842,7 +1859,7 @@
       <w:r>
         <w:drawing>
           <wp:inline distT="0" distB="0" distL="0" distR="0">
-            <wp:extent cx="5715000" cy="3686175"/>
+            <wp:extent cx="5257800" cy="3391281"/>
             <wp:effectExtent t="0" r="0" b="0" l="0"/>
             <wp:docPr id="1" name="" descr="" title=""/>
             <wp:cNvGraphicFramePr>
@@ -1867,7 +1884,7 @@
                   <pic:spPr bwMode="auto">
                     <a:xfrm>
                       <a:off x="0" y="0"/>
-                      <a:ext cx="5715000" cy="3686175"/>
+                      <a:ext cx="5257800" cy="3391281"/>
                     </a:xfrm>
                     <a:prstGeom prst="rect">
                       <a:avLst/>
@@ -1935,7 +1952,7 @@
           <w:sz w:val="22"/>
           <w:szCs w:val="22"/>
         </w:rPr>
-        <w:t xml:space="preserve">Kern der Plattform ist der Reparaturauftrag. Er durchläuft einen festen Lebenszyklus, den alle Modelle gemeinsam verwenden: angenommen, in Diagnose, KVA offen, freigegeben oder abgelehnt, Teile bestellt, in Reparatur, fertig, abgeholt. Die zehn Geschäftsprozesse in Kapitel 5 sind die Übergänge dieses Automaten, das Klassendiagramm führt ihn als Attribut status mit der Aufzählung AuftragStatus, und die Sequenzdiagramme markieren die Statuswechsel, an denen sie beteiligt sind. Abbildung 2 zeigt den Zustandsautomaten als UML-Zustandsdiagramm.</w:t>
+        <w:t xml:space="preserve">Kern der Plattform ist der Reparaturauftrag. Alle Modelle verwenden die Zustände angenommen, in Diagnose, KVA offen, freigegeben, abgelehnt, Teile bestellt, in Reparatur, fertig und abgeholt. Je nach Ablauf werden einzelne Zustände übersprungen: Ohne Fehlteile entfällt „Teile bestellt“, ein Nacharbeitsauftrag beginnt ohne erneute Diagnose und KVA. Seit E-19 kann eine erfolglose zweite Nacharbeit aus „in Reparatur“ nach „abgelehnt“ führen. Das Klassendiagramm hält die Werte im Attribut status mit der Aufzählung AuftragStatus; Abbildung 2 zeigt die möglichen Übergänge.</w:t>
       </w:r>
     </w:p>
     <w:p>
@@ -2034,13 +2051,21 @@
         <w:spacing w:after="120" w:line="276"/>
         <w:jc w:val="both"/>
       </w:pPr>
-      <w:r>
-        <w:rPr>
-          <w:rFonts w:ascii="Calibri" w:cs="Calibri" w:eastAsia="Calibri" w:hAnsi="Calibri"/>
-          <w:sz w:val="22"/>
-          <w:szCs w:val="22"/>
-        </w:rPr>
-        <w:t xml:space="preserve">So funktioniert sie: Der Kunde lädt in der RepairFlow-App ein Foto des Schadens, ein Video oder eine Tonaufnahme hoch, etwa das Klackern eines E-Bike-Motors, und beschreibt die Symptome. Der KI-Diagnosedienst erkennt Gerätetyp und wahrscheinliche Fehlerursache und nennt die vermutlich benötigten Ersatzteile. RepairFlow berechnet daraus einen vorläufigen Kostenvoranschlag, prüft die Teileverfügbarkeit in allen Filialen und schlägt Filiale und Termin vor. Bestätigt der Kunde, entsteht eine Voranmeldung, und die benötigten Teile werden bereits vorreserviert. Bei der Fehlerdiagnose in der Werkstatt werden die Daten übernommen, der Techniker prüft den Vorschlag und bestätigt oder korrigiert ihn. Unser Slogan dafür: KVA in 60 Sekunden.</w:t>
+      <w:commentRangeStart w:id="1"/>
+      <w:r>
+        <w:rPr>
+          <w:rFonts w:ascii="Calibri" w:cs="Calibri" w:eastAsia="Calibri" w:hAnsi="Calibri"/>
+          <w:sz w:val="22"/>
+          <w:szCs w:val="22"/>
+        </w:rPr>
+        <w:t xml:space="preserve">So funktioniert sie: Der Kunde lädt in der RepairFlow-App ein Foto des Schadens, ein Video oder eine Tonaufnahme hoch, etwa das Klackern eines E-Bike-Motors, und beschreibt die Symptome. RepairFlow legt mit Eingang der Anfrage eine Voranmeldung an. Der KI-Diagnosedienst erkennt Gerätetyp und wahrscheinliche Fehlerursache und nennt die vermutlich benötigten Ersatzteile. RepairFlow berechnet daraus einen vorläufigen Kostenvoranschlag, prüft die Teileverfügbarkeit in allen Filialen und schlägt Filiale und Termin vor. Bestätigt der Kunde den Vorschlag, wird die Voranmeldung als bestätigt markiert, und die benötigten Teile werden vorreserviert. Bei der Fehlerdiagnose in der Werkstatt werden die Daten übernommen, der Techniker prüft den Vorschlag und bestätigt oder korrigiert ihn. Unser Slogan dafür: KVA in 60 Sekunden.</w:t>
+      </w:r>
+      <w:commentRangeEnd w:id="1"/>
+      <w:r>
+        <w:rPr>
+          <w:rStyle w:val="CommentReference"/>
+        </w:rPr>
+        <w:commentReference w:id="1"/>
       </w:r>
     </w:p>
     <w:p>
@@ -2054,7 +2079,7 @@
           <w:sz w:val="22"/>
           <w:szCs w:val="22"/>
         </w:rPr>
-        <w:t xml:space="preserve">Technisch ist ein Teil davon heute machbar, etwa die Erkennung sichtbarer Schäden wie eines gebrochenen Displays oder einer abgerissenen Kette per Bildanalyse. Die Auswertung von Motorgeräuschen oder die Schätzung von Arbeitszeiten aus einem Video sind dagegen Vision. Deshalb bleibt der Vorschlag im Modell ausdrücklich unverbindlich: Der Kostenvoranschlag trägt den Status „vorläufig", der Techniker muss ihn bestätigen, und bei nicht auswertbaren Medien fragt das System nach einer besseren Aufnahme. Medien werden nur mit Einwilligung des Kunden verarbeitet und nach Abschluss des Auftrags gelöscht.</w:t>
+        <w:t xml:space="preserve">Technisch ist ein Teil davon heute machbar, etwa die Erkennung sichtbarer Schäden wie eines gebrochenen Displays oder einer abgerissenen Kette per Bildanalyse. Die Auswertung von Motorgeräuschen oder die Schätzung von Arbeitszeiten aus einem Video sind dagegen Vision. Deshalb bleibt der Vorschlag im Modell ausdrücklich unverbindlich: Der Kostenvoranschlag trägt den Status „vorläufig", der Techniker muss ihn bestätigen, und bei nicht auswertbaren Medien fragt das System nach einer besseren Aufnahme. Für die spätere Umsetzung ist als Anforderung vorgesehen, Medien nur mit Einwilligung des Kunden zu verarbeiten und nach Abschluss des Auftrags zu löschen.</w:t>
       </w:r>
     </w:p>
     <w:p>
@@ -2481,7 +2506,7 @@
                 <w:sz w:val="19"/>
                 <w:szCs w:val="19"/>
               </w:rPr>
-              <w:t xml:space="preserve">Aufnahme der Ist-Abläufe beim Pilotkunden, Ableitung der Soll-Prozesse mit RepairFlow, Festlegung der Prozessliste mit zehn Kollaborationsdiagrammen und der Namenskonventionen als Single Source of Truth.</w:t>
+              <w:t xml:space="preserve">Beschreibung der Ist-Abläufe im fiktiven Pilotbetrieb, Ableitung der Soll-Prozesse mit RepairFlow, Festlegung der Prozessliste mit zehn Kollaborationsdiagrammen und der Namenskonventionen als gemeinsame Grundlage.</w:t>
             </w:r>
           </w:p>
         </w:tc>
@@ -2576,7 +2601,7 @@
                 <w:sz w:val="19"/>
                 <w:szCs w:val="19"/>
               </w:rPr>
-              <w:t xml:space="preserve">Modellierung der zehn Prozesse nach den Regeln der Vorlesung: Pool je Unternehmen, Lanes je Rolle, Automatisierung über Aktivitätstypen, Kunde als eigener Prozess, Lieferant als Empty Pool, Datenobjekte und Datenspeicher. Prüfung mit dem Linter des Camunda Modelers.</w:t>
+              <w:t xml:space="preserve">Modellierung der zehn Prozesse nach den Regeln der Vorlesung: Pool je Unternehmen, Lanes je Rolle, Automatisierung über Aktivitätstypen, Kunde als eigener Prozess, Lieferant als Empty Pool, Datenobjekte und Datenspeicher. Die aktuelle Fassung wird vor der Abgabe im Camunda Modeler geprüft und gespeichert.</w:t>
             </w:r>
           </w:p>
         </w:tc>
@@ -2668,7 +2693,7 @@
                 <w:sz w:val="19"/>
                 <w:szCs w:val="19"/>
               </w:rPr>
-              <w:t xml:space="preserve">Use-Case-Diagramm aus der Systemgrenze, Klassendiagramm aus den Datenobjekten der Prozesse, sechs Sequenzdiagramme (gefordert fünf) zu den interaktionsreichsten Use Cases, Zustandsdiagramm des Reparaturauftrags. Umsetzung in Visual Paradigm mit Teamwork-Server.</w:t>
+              <w:t xml:space="preserve">Use-Case-Diagramm aus der Systemgrenze, Klassendiagramm aus den Datenobjekten der Prozesse, sechs Sequenzdiagramme (gefordert fünf) und Zustandsdiagramm des Reparaturauftrags. PlantUML-Quellen und XMI liegen vor; die Fertigstellung in Visual Paradigm und auf dem Teamwork-Server steht noch aus.</w:t>
             </w:r>
           </w:p>
         </w:tc>
@@ -2763,7 +2788,7 @@
                 <w:sz w:val="19"/>
                 <w:szCs w:val="19"/>
               </w:rPr>
-              <w:t xml:space="preserve">Projektdokumentation, Abschlusspräsentation mit Zuordnung der Vortragenden, Zusammenstellung des Abgabe-Archivs.</w:t>
+              <w:t xml:space="preserve">Projektdokumentation und Abschlusspräsentation mit Zuordnung der Vortragenden; Vorbereitung des Abgabe-Archivs.</w:t>
             </w:r>
           </w:p>
         </w:tc>
@@ -2795,6 +2820,7 @@
           <w:numId w:val="2"/>
         </w:numPr>
         <w:spacing w:after="60" w:line="264"/>
+        <w:keepLines/>
       </w:pPr>
       <w:r>
         <w:rPr>
@@ -2812,7 +2838,7 @@
           <w:sz w:val="22"/>
           <w:szCs w:val="22"/>
         </w:rPr>
-        <w:t xml:space="preserve">für die BPMN-Kollaborationsdiagramme. Die Diagramme sind so angereichert, dass der Camunda-Linter (dieselben Regeln wie das Problems-Panel des Modelers) keine Fehler meldet: Task-Definitionen für automatisierte Aktivitäten, Message-Subscriptions für empfangende Elemente, ISO-Dauern für Timer und FEEL-Bedingungen an allen Gateway-Ausgängen.</w:t>
+        <w:t xml:space="preserve">für die BPMN-Kollaborationsdiagramme. Die Modelle enthalten Task-Definitionen für automatisierte Aktivitäten, Message-Subscriptions, ISO-Dauern für Timer und FEEL-Bedingungen. Verbindliche Quelle sind die .bpmn-Dateien; nach einer Änderung wird das PNG neu exportiert. Die abschließende Prüfung aller zehn Dateien im Modeler ist noch offen.</w:t>
       </w:r>
     </w:p>
     <w:p>
@@ -2823,6 +2849,7 @@
           <w:numId w:val="2"/>
         </w:numPr>
         <w:spacing w:after="60" w:line="264"/>
+        <w:keepLines/>
       </w:pPr>
       <w:r>
         <w:rPr>
@@ -2840,7 +2867,7 @@
           <w:sz w:val="22"/>
           <w:szCs w:val="22"/>
         </w:rPr>
-        <w:t xml:space="preserve">für Use-Case-, Klassen- und Sequenzdiagramme, mit dem Teamwork-Server der DHBW als gemeinsamem Repository (WWI25B4G1). Das Klassen- und Use-Case-Modell haben wir zusätzlich als XMI vorgehalten, damit es tool-unabhängig importierbar bleibt.</w:t>
+        <w:t xml:space="preserve">für das finale UML-Projekt, mit dem DHBW-Teamwork-Server WWI25B4G1 als Zielrepository. Die XMI-Datei enthält das Klassen- und Use-Case-Modell für den Import. Sequenzdiagramme werden in Visual Paradigm als Unterdiagramme der jeweiligen Use Cases angelegt; die abzugebende VPP-Datei liegt noch nicht vor.</w:t>
       </w:r>
     </w:p>
     <w:p>
@@ -2879,7 +2906,9 @@
           <w:numId w:val="2"/>
         </w:numPr>
         <w:spacing w:after="60" w:line="264"/>
-      </w:pPr>
+        <w:keepLines/>
+      </w:pPr>
+      <w:commentRangeStart w:id="2"/>
       <w:r>
         <w:rPr>
           <w:rFonts w:ascii="Calibri" w:cs="Calibri" w:eastAsia="Calibri" w:hAnsi="Calibri"/>
@@ -2896,7 +2925,14 @@
           <w:sz w:val="22"/>
           <w:szCs w:val="22"/>
         </w:rPr>
-        <w:t xml:space="preserve">als textuelle Zwischenform der UML-Modelle. Aus einer gemeinsamen Modellbeschreibung entstehen Diagrammbilder für Dokumentation und Präsentation sowie die XMI-Datei für Visual Paradigm; so bleiben Klassennamen, Attribute und Operationen an allen Stellen identisch.</w:t>
+        <w:t xml:space="preserve">als textuelle Quelle der UML-Diagramme im Verzeichnis uml/. Die PNGs werden aus der jeweils aktuellen .puml-Datei gerendert. Die frühere gemeinsame Modellgenerierung liegt seit dem Gruppenbeschluss E-21 in archiv/tools/ und wird nicht mehr zur Bearbeitung verwendet. Dokumentation und Folien werden direkt in Word und PowerPoint gepflegt.</w:t>
+      </w:r>
+      <w:commentRangeEnd w:id="2"/>
+      <w:r>
+        <w:rPr>
+          <w:rStyle w:val="CommentReference"/>
+        </w:rPr>
+        <w:commentReference w:id="2"/>
       </w:r>
     </w:p>
     <w:p>
@@ -3080,13 +3116,21 @@
         <w:spacing w:after="120" w:line="276"/>
         <w:jc w:val="both"/>
       </w:pPr>
-      <w:r>
-        <w:rPr>
-          <w:rFonts w:ascii="Calibri" w:cs="Calibri" w:eastAsia="Calibri" w:hAnsi="Calibri"/>
-          <w:sz w:val="22"/>
-          <w:szCs w:val="22"/>
-        </w:rPr>
-        <w:t xml:space="preserve">Jedes Artefakt durchläuft eine Definition of Done: Ablage im Git-Repository über einen Pull Request mit Review durch eine zweite Person, bei den UML-Modellen zusätzlich Commit auf dem VP-Teamwork-Server, Einhaltung der Namens- und Modellierungskonventionen und Abnahme über die QA-Checkliste des Qualitätsmanagers. Die BPMN-Dateien prüfen wir zusätzlich automatisiert mit zwei Werkzeugen: dem Regelsatz des Camunda Modelers (@camunda/linting, Camunda 8.7, dieselben Regeln wie das Problems-Panel) und dem allgemeinen bpmnlint-Regelsatz „recommended". Geprüft werden unter anderem: genau ein Startereignis, kein Flussobjekt ohne Ein- und Ausgang, Bedingungen an allen Ausgängen exklusiver Gateways, keine Zusammenführung mit einem Verzweigungs-Gateway, Beschriftung aller Aktivitäten und Ereignisse, gültige Endpunkte aller Nachrichtenflüsse. Beide Prüfungen laufen für alle zehn Diagramme ohne Befund; ein eigenes Skript prüft zusätzlich, dass kein Fluss durch ein fremdes Element läuft. Die Diagramme wurden mit einem Generator erzeugt und werden vor der Abgabe im Camunda Modeler geöffnet, geprüft und gespeichert.</w:t>
+      <w:commentRangeStart w:id="3"/>
+      <w:r>
+        <w:rPr>
+          <w:rFonts w:ascii="Calibri" w:cs="Calibri" w:eastAsia="Calibri" w:hAnsi="Calibri"/>
+          <w:sz w:val="22"/>
+          <w:szCs w:val="22"/>
+        </w:rPr>
+        <w:t xml:space="preserve">Jedes Artefakt durchläuft eine Definition of Done: eigener Branch mit aktuellem main-Stand, Pull Request, Review durch eine zweite Person und Abnahme anhand der QA-Checkliste. Jakob übernimmt die Qualitätssicherung und den Merge; bei UML gehört außerdem der Commit auf dem VP-Teamwork-Server dazu. Die seit dem 05.10.2026 gültige Liste steht in doku/qa-checkliste.md. Frühere Rohdiagramme wurden mit dem Camunda-Regelsatz und bpmnlint geprüft; die Skripte und damaligen Protokolle liegen im Archiv. Diese Ergebnisse ersetzen keine Prüfung späterer Änderungen. Für den aktuellen Stand sind das Öffnen, Prüfen und Speichern aller zehn BPMN-Dateien im Camunda Modeler sowie der Abschluss in Visual Paradigm noch ausstehend.</w:t>
+      </w:r>
+      <w:commentRangeEnd w:id="3"/>
+      <w:r>
+        <w:rPr>
+          <w:rStyle w:val="CommentReference"/>
+        </w:rPr>
+        <w:commentReference w:id="3"/>
       </w:r>
     </w:p>
     <w:p>
@@ -3100,7 +3144,7 @@
           <w:sz w:val="22"/>
           <w:szCs w:val="22"/>
         </w:rPr>
-        <w:t xml:space="preserve">Für die UML-Modelle gilt die Konsistenzregel „Botschaft = Operation der Klasse": Jede Lebenslinie eines Sequenzdiagramms ist eine Klasse oder ein Akteur des Klassen- beziehungsweise Use-Case-Diagramms, jede Botschaft eine dort definierte Operation. Die Prüfung erfolgt beim Review, die Abweichungen und ihre Korrekturen stehen in Kapitel 6.</w:t>
+        <w:t xml:space="preserve">Für die UML-Modelle gilt die Konsistenzregel „Botschaft = Operation der Klasse": Jede Lebenslinie eines Sequenzdiagramms ist eine Klasse oder ein Akteur des Klassen- beziehungsweise Use-Case-Diagramms, jede Botschaft eine dort definierte Operation. Die Prüfung erfolgt beim Review. Noch offene Abweichungen werden in Abschnitt 5.4 benannt; Kapitel 6 beschreibt die bisherigen Korrekturen.</w:t>
       </w:r>
     </w:p>
     <w:p>
@@ -3171,7 +3215,7 @@
           <w:sz w:val="22"/>
           <w:szCs w:val="22"/>
         </w:rPr>
-        <w:t xml:space="preserve">Als Sprint-Takt dienen die Gruppentermine in Präsenz (jeweils 4:15 Stunden): Jeder Termin beginnt mit Sprint Review und Retrospektive des vorangegangenen Sprints und dem Sprint Planning des nächsten; das Feedback des Dozenten aus dem Coaching wird direkt im Planning eingeplant. Zwischen den Terminen arbeiten wir asynchron: Abstimmungen laufen über eine WhatsApp-Gruppe, Dateien teilen wir ausschließlich über das GitHub-Repository.</w:t>
+        <w:t xml:space="preserve">Als Sprint-Takt dienen die Gruppentermine in Präsenz (jeweils 4:15 Stunden): Für jeden Termin sind Sprint Review und Retrospektive des vorangegangenen Sprints sowie das Sprint Planning des nächsten vorgesehen; das Feedback des Dozenten aus dem Coaching wird direkt im Planning eingeplant. Zwischen den Terminen arbeiten wir asynchron: Abstimmungen laufen über eine WhatsApp-Gruppe, Dateien teilen wir ausschließlich über das GitHub-Repository.</w:t>
       </w:r>
     </w:p>
     <w:p>
@@ -3325,7 +3369,7 @@
                 <w:sz w:val="19"/>
                 <w:szCs w:val="19"/>
               </w:rPr>
-              <w:t xml:space="preserve">Ergebnisse</w:t>
+              <w:t xml:space="preserve">Ergebnisse und Planung</w:t>
             </w:r>
           </w:p>
         </w:tc>
@@ -3571,7 +3615,7 @@
                 <w:sz w:val="19"/>
                 <w:szCs w:val="19"/>
               </w:rPr>
-              <w:t xml:space="preserve">Review-Befunde in den BPMN-Dateien einarbeiten, Modelle im Camunda Modeler nachziehen, Sequenzdiagramme als Unterdiagramme der Use Cases in Visual Paradigm, Dokumentationskapitel 1 bis 4</w:t>
+              <w:t xml:space="preserve">Review-Korrekturen an BPMN und UML (E-15 bis E-20), sechs Sequenzdiagramme als PlantUML, aktualisierte Bilder und Dokumentation. Am 05.10. wurden die Grundentscheidungen bestätigt (E-21); die Übernahme in Visual Paradigm und offene QA-Befunde bleiben Aufgaben für Sprint 3.</w:t>
             </w:r>
           </w:p>
         </w:tc>
@@ -3692,7 +3736,7 @@
                 <w:sz w:val="19"/>
                 <w:szCs w:val="19"/>
               </w:rPr>
-              <w:t xml:space="preserve">BPMN-Freeze mit BPMN-Archiv, UML-Freeze mit VPP-Datei, Dokumentation fertig, Folien mit finalen Diagrammen, Sprechtexte</w:t>
+              <w:t xml:space="preserve">Geplant: BPMN- und UML-Stand abschließen, VPP-Datei sichern, Dokumentationsplatzhalter füllen, Folien mit finalen Diagrammen und Sprechtexte. Das BPMN-ZIP wird zur Abgabe von Hand gepackt.</w:t>
             </w:r>
           </w:p>
         </w:tc>
@@ -3817,7 +3861,7 @@
                 <w:sz w:val="19"/>
                 <w:szCs w:val="19"/>
               </w:rPr>
-              <w:t xml:space="preserve">Kompletter Probedurchlauf mit Zeitmessung und Fragenrunde, letzte Korrekturen, Retrospektive</w:t>
+              <w:t xml:space="preserve">Geplant: kompletter Probedurchlauf mit Zeitmessung und Fragenrunde, letzte Korrekturen, Retrospektive</w:t>
             </w:r>
           </w:p>
         </w:tc>
@@ -3938,7 +3982,7 @@
                 <w:sz w:val="19"/>
                 <w:szCs w:val="19"/>
               </w:rPr>
-              <w:t xml:space="preserve">15 bis 20 Minuten im Plenum, alle Gruppenmitglieder tragen vor; Kapitel 6 und 7 abschließen; Abgabe-Archiv Fallstudie-WWI25B4-Gruppe1.zip über Moodle, jede Person lädt es selbst hoch</w:t>
+              <w:t xml:space="preserve">Geplant: 15 bis 20 Minuten im Plenum, alle Gruppenmitglieder tragen vor; Kapitel 6 und 7 abschließen; das vollständige Abgabe-Archiv über Moodle hochladen, jede Person separat</w:t>
             </w:r>
           </w:p>
         </w:tc>
@@ -4031,7 +4075,7 @@
           <w:sz w:val="22"/>
           <w:szCs w:val="22"/>
         </w:rPr>
-        <w:t xml:space="preserve">Änderungen am gemeinsamen Stand laufen über einen Git-Workflow, den wir in der README des Repositories festgehalten haben: keine direkten Commits auf main, ein Branch je Aufgabe, Pull Request mit Beschreibung, Review durch ein anderes Teammitglied, Definition of Done. Commit-Nachrichten tragen einen Termin-Stempel und ein Conventional-Commit-Präfix nach dem Muster [T03 2026-09-02] docs: update class diagram, damit im Log erkennbar bleibt, zu welchem Gruppentermin ein Stand gehört. Das Repository ist nach Artefakten gegliedert (bpmn, uml, doku, praesi); Entscheidungen, die mehr als eine Person betreffen, stehen mit Datum, Begründung und Auswirkung im Entscheidungslog, Rückmeldungen des Dozenten in einer eigenen Datei.</w:t>
+        <w:t xml:space="preserve">Änderungen am gemeinsamen Stand laufen über einen Git-Workflow, den wir in der README des Repositories festgehalten haben: vor Beginn main aktualisieren, keine direkten Commits auf main, ein Branch je Aufgabe, Pull Request mit Beschreibung, Review durch ein anderes Teammitglied und Merge durch den Qualitätsmanager. Commit-Nachrichten tragen einen Termin-Stempel und ein Conventional-Commit-Präfix nach dem Muster [T03 2026-09-02] docs: update class diagram, damit im Log erkennbar bleibt, zu welchem Gruppentermin ein Stand gehört. Das Repository ist nach Artefakten gegliedert (bpmn, uml, doku, praesi); Entscheidungen, die mehr als eine Person betreffen, stehen in der aktuellen Kurzfassung doku/03-entscheidungen.md; der ausführliche frühere Verlauf liegt im Archiv, Rückmeldungen des Dozenten in einer eigenen Datei.</w:t>
       </w:r>
     </w:p>
     <w:p>
@@ -4045,7 +4089,7 @@
           <w:sz w:val="22"/>
           <w:szCs w:val="22"/>
         </w:rPr>
-        <w:t xml:space="preserve">Die BPMN-Modelle liegen ausschließlich im Git-Repository, die UML-Modelle zusätzlich auf dem VP-Teamwork-Server; im Git liegen außerdem Exporte und lokale Sicherungen (PlantUML, XMI, nach Fertigstellung auch die VPP-Datei), damit jederzeit ein vollständiger Stand wiederhergestellt werden kann. Office-Dateien lassen sich nicht mergen; wer Dokumentation oder Folien bearbeitet, stimmt das vorher im Team ab.</w:t>
+        <w:t xml:space="preserve">Die BPMN-Modelle liegen ausschließlich im Git-Repository; Camunda Cloud wird nicht genutzt. Für UML ist der VP-Teamwork-Server das Zielrepository. Im Git liegen derzeit PlantUML-Quellen, PNGs und XMI; die lokale VPP-Sicherung wird nach der Fertigstellung ergänzt. Seit E-21 werden Word- und PowerPoint-Dateien direkt bearbeitet. Weil diese Dateien nicht automatisch zusammengeführt werden können, stimmt das Team die Bearbeitung vorher über WhatsApp ab; die Dateien selbst werden ausschließlich über GitHub geteilt.</w:t>
       </w:r>
     </w:p>
     <w:p>
@@ -4447,7 +4491,7 @@
                 <w:sz w:val="19"/>
                 <w:szCs w:val="19"/>
               </w:rPr>
-              <w:t xml:space="preserve">Lehre-VPN eingerichtet, regelmäßige lokale Sicherung der VPP-Datei über „Save Project As", XMI-Export im Git</w:t>
+              <w:t xml:space="preserve">Zugang über das Lehre-VPN; nach der Fertigstellung regelmäßige lokale VPP-Sicherung über „Save Project As“, XMI im Git</w:t>
             </w:r>
           </w:p>
         </w:tc>
@@ -4634,7 +4678,7 @@
                 <w:sz w:val="19"/>
                 <w:szCs w:val="19"/>
               </w:rPr>
-              <w:t xml:space="preserve">Jeder Teil der Präsentation hat eine Vertretung, Folien liegen im Repository</w:t>
+              <w:t xml:space="preserve">Folien und Sprecherzuordnung liegen im Repository; Vertretung vor der Generalprobe im Team abstimmen</w:t>
             </w:r>
           </w:p>
         </w:tc>
@@ -4777,7 +4821,7 @@
           <w:sz w:val="22"/>
           <w:szCs w:val="22"/>
         </w:rPr>
-        <w:t xml:space="preserve">Wir haben zehn Soll-Prozesse unserer Kunden als BPMN-2.0-Kollaborationsdiagramme modelliert. Die Prozesse 01 bis 08 bilden die durchgehende Auftragsreise entlang des Zustandsautomaten, 09 und 10 sind angebundene Folgeprozesse für Reklamation und Retoure. Tabelle 1 fasst die Prozesse zusammen, Anhang B zeigt alle Diagramme in voller Größe. Die Diagramme liegen im Repository unter bpmn/p01-sofortdiagnose.bpmn bis bpmn/p10-retoure.bpmn und als XML-Export in BPMN-WWI25B4-Gruppe1.zip, dort nach den Vorgaben des Ablaufs benannt (01-Sofortdiagnose.bpmn bis 10-Retoure.bpmn).</w:t>
+        <w:t xml:space="preserve">Wir haben zehn Soll-Prozesse unserer Kunden als BPMN-2.0-Kollaborationsdiagramme modelliert. Die Prozesse 01 bis 08 bilden die durchgehende Auftragsreise entlang des Zustandsautomaten, 09 und 10 sind angebundene Folgeprozesse für Reklamation und Retoure. Tabelle 1 fasst die Prozesse zusammen, Anhang B zeigt alle Diagramme in voller Größe. Die Diagramme liegen im Repository unter bpmn/p01-sofortdiagnose.bpmn bis bpmn/p10-retoure.bpmn und mit gleichnamigen PNGs vor. Zur Abgabe werden die zehn XML-Dateien von Hand als BPMN-WWI25B4-Gruppe1.zip gepackt und nach den Vorgaben des Ablaufs benannt (01-Sofortdiagnose.bpmn bis 10-Retoure.bpmn).</w:t>
       </w:r>
     </w:p>
     <w:tbl>
@@ -7154,13 +7198,21 @@
         <w:spacing w:after="120" w:line="276"/>
         <w:jc w:val="both"/>
       </w:pPr>
-      <w:r>
-        <w:rPr>
-          <w:rFonts w:ascii="Calibri" w:cs="Calibri" w:eastAsia="Calibri" w:hAnsi="Calibri"/>
-          <w:sz w:val="22"/>
-          <w:szCs w:val="22"/>
-        </w:rPr>
-        <w:t xml:space="preserve">Insgesamt enthalten die zehn Werkstatt-Prozesse 131 Aktivitäten, im Durchschnitt also 13,1 je Diagramm; die Abläufe im Pool Kunde kommen mit weiteren 26 Aktivitäten hinzu und sind in Tabelle 1 nicht mitgezählt. Dazu kommen 40 Nachrichtenflüsse zwischen den Pools und 60 Datenobjekte und Datenspeicher. Jeder Prozess hat auf Prozessebene genau ein Start- und ein Endereignis; alternative Ausgänge werden mit exklusiven Gateways zusammengeführt.</w:t>
+      <w:commentRangeStart w:id="4"/>
+      <w:r>
+        <w:rPr>
+          <w:rFonts w:ascii="Calibri" w:cs="Calibri" w:eastAsia="Calibri" w:hAnsi="Calibri"/>
+          <w:sz w:val="22"/>
+          <w:szCs w:val="22"/>
+        </w:rPr>
+        <w:t xml:space="preserve">Insgesamt enthalten die zehn Werkstatt-Prozesse 131 Aktivitäten, im Durchschnitt 13,1 je Diagramm. Gezählt werden alle Task-Typen, Aufruf-Aktivitäten und der Mehrfach-Teilprozess einschließlich seiner enthaltenen Aktivitäten. Die Kundenabläufe kommen mit 26 weiteren Aktivitäten hinzu und sind in Tabelle 1 nicht mitgezählt. Dazu kommen 40 Nachrichtenflüsse sowie 48 Datenobjekt-Referenzen und zwölf Datenspeicherdefinitionen, zusammen 60; mehrere Referenzen auf denselben Speicher innerhalb eines Diagramms zählen dabei einmal. Jeder Prozess hat auf Prozessebene genau ein Start- und ein Endereignis.</w:t>
+      </w:r>
+      <w:commentRangeEnd w:id="4"/>
+      <w:r>
+        <w:rPr>
+          <w:rStyle w:val="CommentReference"/>
+        </w:rPr>
+        <w:commentReference w:id="4"/>
       </w:r>
     </w:p>
     <w:p>
@@ -7457,7 +7509,7 @@
                 <w:sz w:val="19"/>
                 <w:szCs w:val="19"/>
               </w:rPr>
-              <w:t xml:space="preserve">Nachricht an Kunde oder Lieferant über RepairFlow beziehungsweise Warten auf eine Antwort, zum Beispiel KVA senden, Auftragsbestätigung empfangen.</w:t>
+              <w:t xml:space="preserve">Nachricht an Kunde oder Lieferant über RepairFlow beziehungsweise Warten auf eine Antwort, zum Beispiel KVA senden, Lieferanten-Rückmeldung empfangen.</w:t>
             </w:r>
           </w:p>
         </w:tc>
@@ -7829,7 +7881,7 @@
           <w:sz w:val="22"/>
           <w:szCs w:val="22"/>
         </w:rPr>
-        <w:t xml:space="preserve">Die Fehlteile eines Auftrags werden mit offenen Nachbestellvorschlägen gebündelt und beim Lieferanten bestellt, bei Überschreitung der Freigabegrenze nach Freigabe durch die Werkstattleitung. Kommt binnen 3 Tagen keine Auftragsbestätigung oder kann der Lieferant nicht liefern, wird die Bestellung storniert und ein alternativer Lieferant gesucht. Nach Auftragsbestätigung wird der Liefertermin am Auftrag hinterlegt (Status „Teile bestellt") und der Kunde bei Verzögerung informiert; bleibt die Lieferung 14 Tage aus, wird sie angemahnt. Der Wareneingang wird geprüft und gebucht, mangelhafte Lieferungen gehen in die Retoure (Prozess 10). Eine Ersatzlieferung wird geprüft, bevor die Fehlteile dem Auftrag zugeordnet werden; bei Gutschrift wird neu bestellt, solange das Teil noch benötigt wird.</w:t>
+        <w:t xml:space="preserve">Die Fehlteile eines Auftrags werden mit offenen Nachbestellvorschlägen gebündelt und beim Lieferanten bestellt, bei Überschreitung der Freigabegrenze nach Freigabe durch die Werkstattleitung. Kommt binnen 3 Tagen keine Auftragsbestätigung oder kann der Lieferant nicht liefern, wird die Bestellung storniert und ein alternativer Lieferant gesucht. Nach Auftragsbestätigung wird der Liefertermin am Auftrag hinterlegt (Status „Teile bestellt") und der Kunde bei Verzögerung informiert; bleibt die Lieferung 14 Tage aus, wird sie angemahnt und erneut gewartet. Eine Grenze für wiederholte Liefermahnungen ist bisher nicht modelliert und muss im Rahmen von E-20 festgelegt werden. Der Wareneingang wird geprüft und gebucht, mangelhafte Lieferungen gehen in die Retoure (Prozess 10). Eine Ersatzlieferung wird geprüft, bevor die Fehlteile dem Auftrag zugeordnet werden; bei Gutschrift wird neu bestellt, solange das Teil noch benötigt wird.</w:t>
       </w:r>
     </w:p>
     <w:p>
@@ -7837,6 +7889,7 @@
         <w:spacing w:after="120" w:line="276"/>
         <w:jc w:val="both"/>
       </w:pPr>
+      <w:commentRangeStart w:id="5"/>
       <w:r>
         <w:rPr>
           <w:rFonts w:ascii="Calibri" w:cs="Calibri" w:eastAsia="Calibri" w:hAnsi="Calibri"/>
@@ -7853,7 +7906,14 @@
           <w:sz w:val="22"/>
           <w:szCs w:val="22"/>
         </w:rPr>
-        <w:t xml:space="preserve">Der Techniker entnimmt die reservierten Teile und arbeitet die Reparaturschritte in einer Schleife mit Zeiterfassung ab. Ein Zusatzbefund führt zu einem Nachtrags-KVA, den der Kunde freigeben muss; ohne Antwort innerhalb von drei Tagen gilt er als abgelehnt. Nach Endkontrolle und Prüfprotokoll wird der Auftrag auf „fertig" gesetzt, bei Mängeln folgt Nacharbeit. Auch die Nacharbeit aus einer Reklamation (Prozess 09) läuft über diesen Prozess.</w:t>
+        <w:t xml:space="preserve">Der Techniker entnimmt die reservierten Teile und arbeitet die Reparaturschritte mit Zeiterfassung ab. Bei einem Zusatzbefund entsteht ein Nachtrags-KVA. Nach Freigabe werden die zusätzlichen Teile über Prozess 05 disponiert und entnommen; Ablehnung oder drei Tage ohne Antwort führen zur Endkontrolle. Nach bestandener Endkontrolle setzt RepairFlow den Auftrag auf „fertig“. Bei Mängeln sind höchstens zwei Nacharbeiten vorgesehen; bleibt die zweite erfolglos, wird der Auftrag auf „abgelehnt“ gesetzt. Auch ein Nacharbeitsauftrag aus einer Reklamation (Prozess 09) läuft über diesen Prozess.</w:t>
+      </w:r>
+      <w:commentRangeEnd w:id="5"/>
+      <w:r>
+        <w:rPr>
+          <w:rStyle w:val="CommentReference"/>
+        </w:rPr>
+        <w:commentReference w:id="5"/>
       </w:r>
     </w:p>
     <w:p>
@@ -7861,6 +7921,7 @@
         <w:spacing w:after="120" w:line="276"/>
         <w:jc w:val="both"/>
       </w:pPr>
+      <w:commentRangeStart w:id="6"/>
       <w:r>
         <w:rPr>
           <w:rFonts w:ascii="Calibri" w:cs="Calibri" w:eastAsia="Calibri" w:hAnsi="Calibri"/>
@@ -7877,7 +7938,14 @@
           <w:sz w:val="22"/>
           <w:szCs w:val="22"/>
         </w:rPr>
-        <w:t xml:space="preserve">Sobald ein Gerät abholbereit ist, erstellt RepairFlow die Rechnung aus KVA und Arbeitszeiten, bei abgelehnten Aufträgen über die Diagnosepauschale (kostenfreie Nacharbeit ohne Rechnung) und benachrichtigt den Kunden. Wird das Gerät nicht abgeholt, erinnert das System alle 14 Tage, nach der dritten Erinnerung mit Lagergebühr. Bei der Abholung teilt der Kunde die Zahlungsart mit, zahlt bar oder per Karte oder erhält die Rechnung mit Zahlungsziel; danach wird das Gerät übergeben und der Auftrag auf „abgeholt" gesetzt. Offene Rechnungen werden nach 14 Tagen gemahnt, eingegangene Zahlungen verbucht und an die Buchhaltung übergeben. Zum Schluss bittet RepairFlow um eine Bewertung.</w:t>
+        <w:t xml:space="preserve">Für ein abholbereites Gerät entsteht die Rechnung aus KVA und Arbeitszeiten oder bei abgelehnten Aufträgen über die Diagnosepauschale; kostenfreie Nacharbeit wird ohne Rechnung abgewickelt. RepairFlow benachrichtigt den Kunden und erinnert alle 14 Tage. Nach der dritten Erinnerung wird eine Lagergebühr aufgenommen; beim vierten Fristablauf wird die Verwertung des Geräts eingeleitet. Bei regulärer Abholung werden Zahlungsart und Zahlung erfasst beziehungsweise die Rechnung mit Zahlungsziel versandt, danach das Gerät übergeben und der Auftrag auf „abgeholt“ gesetzt. Offene Rechnungen werden alle 14 Tage gemahnt. Bleibt die dritte Mahnung erfolglos, geht die Forderung an Inkasso; andernfalls wird die Zahlung verbucht und an die Buchhaltung übergeben. Im regulären Abschluss folgt eine Bewertungsanfrage. Die Verwertungs- und Mahngrenzen aus E-19 sind noch durch die Gruppe zu bestätigen.</w:t>
+      </w:r>
+      <w:commentRangeEnd w:id="6"/>
+      <w:r>
+        <w:rPr>
+          <w:rStyle w:val="CommentReference"/>
+        </w:rPr>
+        <w:commentReference w:id="6"/>
       </w:r>
     </w:p>
     <w:p>
@@ -7925,7 +7993,7 @@
           <w:sz w:val="22"/>
           <w:szCs w:val="22"/>
         </w:rPr>
-        <w:t xml:space="preserve">Defekte oder falsche Lieferantenteile werden beim Lieferanten angemeldet. Bleibt die RMA-Freigabe fünf Tage aus, eskaliert die Werkstattleitung. Nach weiteren fünf Tagen ohne Freigabe wird das Teil abgeschrieben. Nach der Freigabe wird das Teil versendet, der Bestand korrigiert und je nach Rückmeldung eine Ersatzlieferung gebucht oder eine Gutschrift verbucht; ob danach neu bestellt wird, entscheidet der aufrufende Prozess 06.</w:t>
+        <w:t xml:space="preserve">Defekte oder falsche Lieferantenteile werden beim Lieferanten angemeldet. Bleibt die RMA-Freigabe fünf Tage aus, eskaliert die Werkstattleitung. Nach weiteren fünf Tagen ohne Freigabe wird das Teil abgeschrieben. Nach der Freigabe wird das Teil versendet, der Bestand korrigiert und je nach Rückmeldung eine Ersatzlieferung gebucht oder eine Gutschrift verbucht; ob danach neu bestellt wird, entscheidet der aufrufende Prozess 06. Im Ersatzpfad fehlt derzeit ein ausdrücklicher Empfang der Ersatzlieferung vor ihrer Buchung (offener Befund B12).</w:t>
       </w:r>
     </w:p>
     <w:p>
@@ -7952,7 +8020,7 @@
           <w:sz w:val="22"/>
           <w:szCs w:val="22"/>
         </w:rPr>
-        <w:t xml:space="preserve">Von den 131 Aktivitäten sind 79 automatisierte, regelbasierte, sendende oder empfangende Aktivitäten, also 60 Prozent, die RepairFlow ohne manuelle Arbeit ausführt. Weitere 33 Benutzer-Aktivitäten laufen in der Oberfläche der Plattform. Nur 9 Aktivitäten sind manuell und liegen außerhalb der Systemgrenze; die übrigen 10 sind Aufruf-Aktivitäten und ein Mehrfach-Teilprozess. Die Software, die wir in der objektorientierten Analyse entwerfen, automatisiert damit den Reparaturauftrags-Lebenszyklus als zentrales Werkstatt-Management-System:</w:t>
+        <w:t xml:space="preserve">Von den 131 Aktivitäten sind 79 automatisierte, regelbasierte, sendende oder empfangende Aktivitäten, also rund 60 Prozent. Weitere 33 Benutzer-Aktivitäten werden von Mitarbeitern in der Plattform ausgeführt. Neun manuelle Aktivitäten liegen außerhalb der Systemgrenze; neun Aktivitäten rufen einen anderen Prozess auf, und eine weitere ist der Mehrfach-Teilprozess. Die Software, die wir in der objektorientierten Analyse entwerfen, unterstützt und automatisiert damit den Reparaturauftrags-Lebenszyklus:</w:t>
       </w:r>
     </w:p>
     <w:p>
@@ -7988,7 +8056,7 @@
           <w:sz w:val="22"/>
           <w:szCs w:val="22"/>
         </w:rPr>
-        <w:t xml:space="preserve">Kundenkommunikation an jedem Statusübergang: Sofortdiagnose, Annahmebeleg, Kostenvoranschlag, Lieferverzögerung, Reparaturbeginn, Abholung, Rechnung, Bewertung.</w:t>
+        <w:t xml:space="preserve">Automatisierte Kundenkommunikation zu den vorgesehenen Prozessschritten: Sofortdiagnose, Annahmebeleg, Kostenvoranschlag, Lieferverzögerung, Reparaturbeginn, Abholung, Rechnung, Bewertung.</w:t>
       </w:r>
     </w:p>
     <w:p>
@@ -8081,13 +8149,21 @@
         <w:spacing w:after="120" w:line="276"/>
         <w:jc w:val="both"/>
       </w:pPr>
-      <w:r>
-        <w:rPr>
-          <w:rFonts w:ascii="Calibri" w:cs="Calibri" w:eastAsia="Calibri" w:hAnsi="Calibri"/>
-          <w:sz w:val="22"/>
-          <w:szCs w:val="22"/>
-        </w:rPr>
-        <w:t xml:space="preserve">Die objektorientierte Analyse folgt der Reihenfolge aus der Vorlesung: Use-Case-Diagramm, Klassendiagramm, je Use Case ein Interaktionsdiagramm, Zustandsdiagramm je Klasse mit Lebenszyklus. Alle Diagramme werden aus der XMI-Datei in das Visual-Paradigm-Projekt UML-WWI25B4-Gruppe1.vpp übernommen, die Sequenzdiagramme dort als Unterdiagramme der zugehörigen Use Cases.</w:t>
+      <w:commentRangeStart w:id="7"/>
+      <w:r>
+        <w:rPr>
+          <w:rFonts w:ascii="Calibri" w:cs="Calibri" w:eastAsia="Calibri" w:hAnsi="Calibri"/>
+          <w:sz w:val="22"/>
+          <w:szCs w:val="22"/>
+        </w:rPr>
+        <w:t xml:space="preserve">Die objektorientierte Analyse folgt der Reihenfolge aus der Vorlesung: Use-Case-Diagramm, Klassendiagramm, Interaktionsdiagramme zu ausgewählten Use Cases und ergänzend ein Zustandsdiagramm des Reparaturauftrags. Der aktuelle Git-Stand enthält PlantUML-Quellen, PNGs und uml/modell.xmi mit Klassen- und Use-Case-Modell. Diese Modelle werden in Visual Paradigm importiert; die sechs Sequenzdiagramme sind dort als Unterdiagramme der zugehörigen Use Cases anzulegen. UML-WWI25B4-Gruppe1.vpp ist noch zu erstellen und in uml/ zu sichern.</w:t>
+      </w:r>
+      <w:commentRangeEnd w:id="7"/>
+      <w:r>
+        <w:rPr>
+          <w:rStyle w:val="CommentReference"/>
+        </w:rPr>
+        <w:commentReference w:id="7"/>
       </w:r>
     </w:p>
     <w:p>
@@ -8126,7 +8202,7 @@
       <w:r>
         <w:drawing>
           <wp:inline distT="0" distB="0" distL="0" distR="0">
-            <wp:extent cx="5715000" cy="4581525"/>
+            <wp:extent cx="4188973" cy="4581525"/>
             <wp:effectExtent t="0" r="0" b="0" l="0"/>
             <wp:docPr id="3" name="" descr="" title=""/>
             <wp:cNvGraphicFramePr>
@@ -8151,7 +8227,7 @@
                   <pic:spPr bwMode="auto">
                     <a:xfrm>
                       <a:off x="0" y="0"/>
-                      <a:ext cx="5715000" cy="4581525"/>
+                      <a:ext cx="4188973" cy="4581525"/>
                     </a:xfrm>
                     <a:prstGeom prst="rect">
                       <a:avLst/>
@@ -8169,6 +8245,7 @@
         <w:spacing w:after="200" w:before="60"/>
         <w:jc w:val="center"/>
       </w:pPr>
+      <w:commentRangeStart w:id="10"/>
       <w:r>
         <w:rPr>
           <w:rFonts w:ascii="Calibri" w:cs="Calibri" w:eastAsia="Calibri" w:hAnsi="Calibri"/>
@@ -8179,6 +8256,13 @@
           <w:szCs w:val="18"/>
         </w:rPr>
         <w:t xml:space="preserve">Abbildung 3: Use-Case-Diagramm RepairFlow</w:t>
+      </w:r>
+      <w:commentRangeEnd w:id="10"/>
+      <w:r>
+        <w:rPr>
+          <w:rStyle w:val="CommentReference"/>
+        </w:rPr>
+        <w:commentReference w:id="10"/>
       </w:r>
     </w:p>
     <w:p>
@@ -8331,7 +8415,7 @@
           <w:sz w:val="22"/>
           <w:szCs w:val="22"/>
         </w:rPr>
-        <w:t xml:space="preserve">Eine Reklamation verweist auf den Ursprungsauftrag und führt zu einem neuen Reparaturauftrag für die Nacharbeit, der mit dem Attribut kostenfrei kennzeichnet, ob die Gewährleistung greift. So bleibt der Lebenszyklus jedes Auftrags linear, und Prozess 09 kann die Nacharbeit über die Prozesse 07 und 08 abwickeln.</w:t>
+        <w:t xml:space="preserve">Eine Reklamation verweist auf den Ursprungsauftrag und führt zu einem neuen Reparaturauftrag für die Nacharbeit, der mit dem Attribut kostenfrei kennzeichnet, ob die Gewährleistung greift. So erhält die Nacharbeit einen eigenen Auftragslebenszyklus, und Prozess 09 kann die Nacharbeit über die Prozesse 07 und 08 abwickeln.</w:t>
       </w:r>
     </w:p>
     <w:p>
@@ -8776,13 +8860,21 @@
         <w:spacing w:after="120" w:line="276"/>
         <w:jc w:val="both"/>
       </w:pPr>
-      <w:r>
-        <w:rPr>
-          <w:rFonts w:ascii="Calibri" w:cs="Calibri" w:eastAsia="Calibri" w:hAnsi="Calibri"/>
-          <w:sz w:val="22"/>
-          <w:szCs w:val="22"/>
-        </w:rPr>
-        <w:t xml:space="preserve">SD4 knüpft die Fertigmeldung an abgeschlossene Reparaturschritte und bestandene Endkontrolle. UC13 umfasst die Schritte und Arbeitszeiten sowie den optionalen Nachtrags-KVA: Freigabe führt zu weiteren Schritten, Ablehnung oder drei Tage ohne Antwort zur Endkontrolle. Fehler in der Endkontrolle führen zur Nacharbeit und erneuter Prüfung. UC14 setzt erst dann den Status „fertig". Abholbenachrichtigung und Rechnung gehören zu UC15 in Prozess 08.</w:t>
+      <w:commentRangeStart w:id="8"/>
+      <w:r>
+        <w:rPr>
+          <w:rFonts w:ascii="Calibri" w:cs="Calibri" w:eastAsia="Calibri" w:hAnsi="Calibri"/>
+          <w:sz w:val="22"/>
+          <w:szCs w:val="22"/>
+        </w:rPr>
+        <w:t xml:space="preserve">SD4 knüpft die Fertigmeldung an abgeschlossene Reparaturschritte und bestandene Endkontrolle. Der Verweis auf UC13 umfasst Schritte, Arbeitszeiten und einen möglichen Nachtrags-KVA; Ablehnung oder drei Tage ohne Antwort führen zur Endkontrolle. Die dargestellte Fassung ist noch nicht vollständig an E-19 angepasst: Im freigegebenen Nachtrag fehlen die Teile-Disposition über Prozess 05, in der Endkontrollschleife der Abbruch nach der zweiten erfolglosen Nacharbeit. Diese Ergänzungen sind für SD4 noch offen. Abholbenachrichtigung und Rechnung gehören zu UC15 in Prozess 08.</w:t>
+      </w:r>
+      <w:commentRangeEnd w:id="8"/>
+      <w:r>
+        <w:rPr>
+          <w:rStyle w:val="CommentReference"/>
+        </w:rPr>
+        <w:commentReference w:id="8"/>
       </w:r>
     </w:p>
     <w:p>
@@ -8938,7 +9030,7 @@
           <w:sz w:val="22"/>
           <w:szCs w:val="22"/>
         </w:rPr>
-        <w:t xml:space="preserve">SD6 bündelt den Bestellbedarf aus Prozess 05, wählt einen Lieferanten und legt eine Bestellung mit Positionen an. Oberhalb der Freigabegrenze ist die Freigabe durch die Werkstattleitung erforderlich. Nur eine bestätigte und lieferbare Bestellung setzt bei auftragsbezogenen Fehlteilen den Status „Teile bestellt"; Verzögerungen werden dem Kunden mitgeteilt. Nicht lieferbare Bestellungen werden storniert, ein alternativer Lieferant wird gesucht. UC11 verfeinert Lieferung und Wareneingang, bei Mängeln mit UC19 Retoure. Ohne Ersatz wird nur erneut bestellt, solange das Teil noch benötigt wird. Eine Zusammenführung mit offenen Bestellungen wird nicht behauptet, weil Prozess 06 diesen Pfad nicht enthält.</w:t>
+        <w:t xml:space="preserve">SD6 bündelt den Bestellbedarf aus Prozess 05, wählt einen Lieferanten und legt eine Bestellung mit Positionen an. Oberhalb der Freigabegrenze ist die Freigabe durch die Werkstattleitung erforderlich. Nur eine bestätigte und lieferbare Bestellung setzt bei auftragsbezogenen Fehlteilen den Status „Teile bestellt"; Verzögerungen werden dem Kunden mitgeteilt. Nicht lieferbare oder binnen drei Tagen nicht bestätigte Bestellungen werden storniert, ein alternativer Lieferant wird gesucht. Die Lieferwartezeit beträgt 14 Tage, danach wird angemahnt und weiter gewartet; die Abbruchgrenze ist noch offen. UC11 verfeinert Lieferung und Wareneingang, bei Mängeln mit UC19 Retoure. Ohne Ersatz wird nur erneut bestellt, solange das Teil noch benötigt wird. Eine Zusammenführung mit offenen Bestellungen wird nicht behauptet, weil Prozess 06 diesen Pfad nicht enthält.</w:t>
       </w:r>
     </w:p>
     <w:p>
@@ -8965,7 +9057,22 @@
           <w:sz w:val="22"/>
           <w:szCs w:val="22"/>
         </w:rPr>
-        <w:t xml:space="preserve">Die drei Modelle sind über drei Klammern verbunden: Erstens tragen die Datenobjekte der BPMN-Diagramme die Klassennamen des Klassendiagramms, teilweise mit dem Zustand in eckigen Klammern. Zweitens entsprechen der Pool Kunde und die Lanes Service / Annahme, Techniker, Ersatzteil-Disposition und Werkstattleitung den Akteuren Kunde, Servicemitarbeiter, Techniker, Disponent und Werkstattleiter und den gleichnamigen Klassen (Kunde beziehungsweise Unterklassen von Mitarbeiter). Drittens folgen Sequenzdiagramme, Datenobjekt-Zustände und Zustandsdiagramm demselben Zustandsautomaten, sodass jeder Statuswechsel als Aktivität „Auftragsstatus auf … setzen" in den Prozessen, als Aufruf von wechsleStatus() in den Sequenzdiagrammen und als Übergang im Zustandsdiagramm wiederzufinden ist (den Status „abgelehnt" setzen Prozess 03 und 04, „angenommen" Prozess 02 und 09, weil beide Prozesse denselben Übergang auslösen). Tabelle 2 zeigt die Zuordnung.</w:t>
+        <w:t xml:space="preserve">Die Modelle werden über gemeinsame Namen, Rollen und Statuswerte abgeglichen. BPMN-Datenobjekte tragen die Klassennamen, bei Bedarf mit Zustand in eckigen Klammern. Der Pool Kunde und die Werkstatt-Lanes entsprechen den Akteuren Kunde, Servicemitarbeiter, Techniker, Disponent und Werkstattleiter sowie den Rollenklassen. Die Auftragszustände folgen AuftragStatus; „abgelehnt“ wird in Prozess 03, 04 und seit E-19 auch in Prozess 07 gesetzt, „angenommen“ in Prozess 02 und bei einem neuen Nacharbeitsauftrag in Prozess 09. Tabelle 2 zeigt die fachliche Zuordnung; sie belegt noch keinen vollständig abgeschlossenen Abgleich.</w:t>
+      </w:r>
+    </w:p>
+    <w:p>
+      <w:pPr>
+        <w:spacing w:after="120" w:line="276"/>
+        <w:jc w:val="both"/>
+        <w:keepLines/>
+      </w:pPr>
+      <w:r>
+        <w:rPr>
+          <w:rFonts w:ascii="Calibri" w:cs="Calibri" w:eastAsia="Calibri" w:hAnsi="Calibri"/>
+          <w:sz w:val="22"/>
+          <w:szCs w:val="22"/>
+        </w:rPr>
+        <w:t xml:space="preserve">Offen sind im Stand vom 05.10.2026 die Anpassung von SD4 an den Nachtrags- und Abbruchpfad in P07, die Begrenzung der Liefermahnungen in P06 und der Empfang der Ersatzlieferung vor der Buchung in P10. E-19 und E-20 sind außerdem noch durch die Gruppe zu bestätigen; für verwertete Geräte ist ein möglicher zusätzlicher AuftragStatus ungeklärt. Die QA-Checkliste führt diese Punkte. Die Diagrammbilder entsprechen den aktuell eingecheckten PNGs.</w:t>
       </w:r>
     </w:p>
     <w:tbl>
@@ -9661,7 +9768,7 @@
                 <w:sz w:val="19"/>
                 <w:szCs w:val="19"/>
               </w:rPr>
-              <w:t xml:space="preserve">UC08, UC09, UC12</w:t>
+              <w:t xml:space="preserve">UC08, UC09, UC12; UC10 bei Fehlteilen</w:t>
             </w:r>
           </w:p>
         </w:tc>
@@ -9690,7 +9797,7 @@
                 <w:sz w:val="19"/>
                 <w:szCs w:val="19"/>
               </w:rPr>
-              <w:t xml:space="preserve">Disponent, Lagerbestand, ErsatzteilReservierung, Lieferantenbestellung [Vorschlag]</w:t>
+              <w:t xml:space="preserve">Disponent, Servicemitarbeiter, Lagerbestand, ErsatzteilReservierung, Lieferantenbestellung [Vorschlag]</w:t>
             </w:r>
           </w:p>
         </w:tc>
@@ -9907,7 +10014,7 @@
                 <w:sz w:val="19"/>
                 <w:szCs w:val="19"/>
               </w:rPr>
-              <w:t xml:space="preserve">UC13, UC14</w:t>
+              <w:t xml:space="preserve">UC13, UC14; UC09 bei freigegebenem Nachtrag</w:t>
             </w:r>
           </w:p>
         </w:tc>
@@ -9936,7 +10043,7 @@
                 <w:sz w:val="19"/>
                 <w:szCs w:val="19"/>
               </w:rPr>
-              <w:t xml:space="preserve">Reparaturschritt, Arbeitszeitbuchung, Reparaturauftrag [in Reparatur, fertig]</w:t>
+              <w:t xml:space="preserve">Reparaturschritt, Arbeitszeitbuchung, Reparaturauftrag [in Reparatur, fertig, abgelehnt]</w:t>
             </w:r>
           </w:p>
         </w:tc>
@@ -9965,7 +10072,7 @@
                 <w:sz w:val="19"/>
                 <w:szCs w:val="19"/>
               </w:rPr>
-              <w:t xml:space="preserve">SD4</w:t>
+              <w:t xml:space="preserve">SD4 (Abgleich offen)</w:t>
             </w:r>
           </w:p>
         </w:tc>
@@ -10393,7 +10500,7 @@
           <w:sz w:val="22"/>
           <w:szCs w:val="22"/>
         </w:rPr>
-        <w:t xml:space="preserve">Zu Beginn des Semesters sind zwei vollständige Entwürfe entstanden: einer aus der Betreiber-Perspektive (FixWerk GmbH als Betreiber, ohne KI-Feature, Camunda 7) und einer aus der Solution-Provider-Perspektive mit KI-Sofortdiagnose (Camunda 8). Statt einen davon zu verwerfen, haben wir beide Artefakt für Artefakt verglichen und zusammengeführt: Grundlage sind die Solution-Provider-Diagramme, weil sie das Dozentenfeedback umsetzen und beide Linter ohne Befund passieren; aus dem Betreiber-Entwurf übernommen wurden die Rollenklassen Mitarbeiter, Disponent und Werkstattleiter, die Datenspeicher Technikerplan und Buchhaltung, das Sequenzdiagramm zum Nachbestellvorschlag, der Abschnitt zur Konsistenz der Modelle sowie Sprintplan und Trello-Board. Die Gegenüberstellung steht im Repository (doku/05-vergleich-und-zusammenfuehrung.md).</w:t>
+        <w:t xml:space="preserve">Zu Beginn des Semesters sind zwei vollständige Entwürfe entstanden: einer aus der Betreiber-Perspektive (FixWerk GmbH als Betreiber, ohne KI-Feature, Camunda 7) und einer aus der Solution-Provider-Perspektive mit KI-Sofortdiagnose (Camunda 8). Statt einen davon zu verwerfen, haben wir beide Artefakt für Artefakt verglichen und zusammengeführt: Grundlage sind die Solution-Provider-Diagramme, weil sie das Dozentenfeedback umsetzen und die für den damaligen Stand dokumentierten Linter-Prüfungen ohne Befund passiert haben; aus dem Betreiber-Entwurf übernommen wurden die Rollenklassen Mitarbeiter, Disponent und Werkstattleiter, die Datenspeicher Technikerplan und Buchhaltung, das Sequenzdiagramm zum Nachbestellvorschlag, der Abschnitt zur Konsistenz der Modelle sowie Sprintplan und Trello-Board. Die Gegenüberstellung steht im Repository (archiv/doku/05-vergleich-und-zusammenfuehrung.md).</w:t>
       </w:r>
     </w:p>
     <w:p>
@@ -10417,7 +10524,7 @@
           <w:sz w:val="22"/>
           <w:szCs w:val="22"/>
         </w:rPr>
-        <w:t xml:space="preserve">Ein erster Entwurf modellierte Werkstatt und Ersatzteil-Disposition als getrennte Pools. Nach der Vorlesungsregel „Pool = Unternehmen, Lanes = Rollen" wurde auf einen Pool mit Lanes umgestellt; Kunde und Lieferant blieben eigene Pools. Erst dadurch wurden die Nachrichtenflüsse eindeutig. Den Kunden hatten wir zunächst als Black Box gezeichnet; weil dabei nicht sichtbar war, wann er antwortet, entscheidet oder fertig ist, haben wir ihm einen eigenen Ablauf gegeben (Entscheidungslog E-16). Eine Gesamtprüfung aller Modelle am 05.10.2026 (E-17) zeigte danach Lücken zwischen den Prozessen, etwa dass abgelehnte Aufträge nie abgeholt wurden und Warteschleifen keinen Ausstieg hatten; seitdem laufen alle Rückgaben über Prozess 08 und jede Warteschleife hat einen Timer.</w:t>
+        <w:t xml:space="preserve">Ein erster Entwurf modellierte Werkstatt und Ersatzteil-Disposition als getrennte Pools. Nach der Vorlesungsregel „Pool = Unternehmen, Lanes = Rollen" wurde auf einen Pool mit Lanes umgestellt; Kunde und Lieferant blieben eigene Pools. Erst dadurch wurden die Nachrichtenflüsse eindeutig. Den Kunden hatten wir zunächst als Black Box gezeichnet; weil dabei nicht sichtbar war, wann er antwortet, entscheidet oder fertig ist, haben wir ihm einen eigenen Ablauf gegeben (Entscheidungslog E-16). Eine Gesamtprüfung aller Modelle am 05.10.2026 (E-17) zeigte danach Lücken zwischen den Prozessen, etwa dass abgelehnte Aufträge nie abgeholt wurden und Warteschleifen keinen Ausstieg hatten; die Rückgaben laufen seitdem über Prozess 08, und Wartesituationen haben modellierte Fristen. In Prozess 06 führt der Liefer-Timer allerdings nur zur Mahnung und zurück in die Warteschleife; ein endgültiger Ausstieg ist noch festzulegen.</w:t>
       </w:r>
     </w:p>
     <w:p>
@@ -10489,7 +10596,7 @@
           <w:sz w:val="22"/>
           <w:szCs w:val="22"/>
         </w:rPr>
-        <w:t xml:space="preserve">Datenobjekte, Klassen, Lebenslinien und Statuswerte müssen wortgleich sein. Frühere Fassungen der Sequenzdiagramme verwendeten „Diagnose" und „Reservierung", das Klassendiagramm „Fehlerbefund" und „ErsatzteilReservierung". Wir haben eine gemeinsame Modellbeschreibung eingeführt, aus der Klassendiagramm, XMI und die Namen in den anderen Modellen stammen.</w:t>
+        <w:t xml:space="preserve">Datenobjekte, Klassen, Lebenslinien und Statuswerte müssen wortgleich sein. Frühere Fassungen der Sequenzdiagramme verwendeten „Diagnose" und „Reservierung", das Klassendiagramm „Fehlerbefund" und „ErsatzteilReservierung". Die Rohentwürfe wurden deshalb aus einer gemeinsamen Modellbeschreibung erzeugt. Seit E-21 werden die aktiven Quellen direkt bearbeitet; Namen, Operationen und Beziehungen müssen nach Änderungen erneut gegeneinander geprüft werden. Der noch offene Abgleich von SD4 zeigt, warum diese Prüfung erforderlich bleibt.</w:t>
       </w:r>
     </w:p>
     <w:p>
@@ -10513,7 +10620,7 @@
           <w:sz w:val="22"/>
           <w:szCs w:val="22"/>
         </w:rPr>
-        <w:t xml:space="preserve">Der Teamwork-Server von Visual Paradigm ist nur über das Lehre-VPN erreichbar, und der Camunda Modeler meldet für Camunda-8-Diagramme technische Details als Fehler, etwa fehlende Task-Definitionen oder Message-Subscriptions. Wir haben uns entschieden, die Diagramme „engine-ready" anzureichern, statt die Fehler zu ignorieren; das entspricht dem in der Vorlesung beschriebenen Weg vom fachlichen zum ausführbaren Modell.</w:t>
+        <w:t xml:space="preserve">Der Teamwork-Server von Visual Paradigm ist nur über das Lehre-VPN erreichbar, und der Camunda Modeler meldet für Camunda-8-Diagramme technische Details als Fehler, etwa fehlende Task-Definitionen oder Message-Subscriptions. Wir haben uns entschieden, die Diagramme „engine-ready" anzureichern, statt die Fehler zu ignorieren; diese Anreicherung dient der technischen Modellprüfung. Eine Ausführung der gesamten Prozesskette in einer Camunda-Engine ist damit nicht nachgewiesen.</w:t>
       </w:r>
     </w:p>
     <w:p>
@@ -10662,7 +10769,7 @@
           <w:sz w:val="22"/>
           <w:szCs w:val="22"/>
         </w:rPr>
-        <w:t xml:space="preserve">Die Fallstudie hat uns gezeigt, wie viel Abstimmung nötig ist, damit Prozessmodell, Use Cases und Klassenmodell zusammenpassen. Das Wechselspiel aus Coaching-Terminen und eigenständiger Arbeit hat gut funktioniert, weil wir das Feedback direkt einarbeiten konnten. Hilfreich wäre aus unserer Sicht eine frühere Klarstellung gewesen, wie streng die Vorgabe „durchschnittlich zehn Aktivitäten" gemeint ist.</w:t>
+        <w:t xml:space="preserve">Die bisherigen Review-Befunde zeigen, wie viel Abstimmung nötig ist, damit Prozessmodell, Use Cases und Klassenmodell zusammenpassen. Für die abschließende Bewertung der Fallstudie sammeln wir die persönlichen Rückmeldungen aller Gruppenmitglieder und die Erfahrungen aus den weiteren Coaching-Terminen.</w:t>
       </w:r>
     </w:p>
     <w:p>
@@ -10700,13 +10807,21 @@
         <w:spacing w:after="120" w:line="276"/>
         <w:jc w:val="both"/>
       </w:pPr>
-      <w:r>
-        <w:rPr>
-          <w:rFonts w:ascii="Calibri" w:cs="Calibri" w:eastAsia="Calibri" w:hAnsi="Calibri"/>
-          <w:sz w:val="22"/>
-          <w:szCs w:val="22"/>
-        </w:rPr>
-        <w:t xml:space="preserve">Das Abgabe-Archiv Fallstudie-WWI25B4-Gruppe1.zip enthält:</w:t>
+      <w:commentRangeStart w:id="9"/>
+      <w:r>
+        <w:rPr>
+          <w:rFonts w:ascii="Calibri" w:cs="Calibri" w:eastAsia="Calibri" w:hAnsi="Calibri"/>
+          <w:sz w:val="22"/>
+          <w:szCs w:val="22"/>
+        </w:rPr>
+        <w:t xml:space="preserve">Zur Abgabe wird das vollständige Archiv Fallstudie-WWI25B4-Gruppe1.zip zusammengestellt. Vorgesehen sind:</w:t>
+      </w:r>
+      <w:commentRangeEnd w:id="9"/>
+      <w:r>
+        <w:rPr>
+          <w:rStyle w:val="CommentReference"/>
+        </w:rPr>
+        <w:commentReference w:id="9"/>
       </w:r>
     </w:p>
     <w:tbl>
@@ -10976,7 +11091,7 @@
                 <w:sz w:val="19"/>
                 <w:szCs w:val="19"/>
               </w:rPr>
-              <w:t xml:space="preserve">Visual-Paradigm-Projekt mit Use-Case-, Klassen-, sechs Sequenz- und einem Zustandsdiagramm, aus uml/modell.xmi importiert (im Repository: uml/ als PlantUML, PNG und XMI)</w:t>
+              <w:t xml:space="preserve">Noch zu erstellendes Visual-Paradigm-Projekt mit Use-Case-, genau einem Klassen- und sechs Sequenzdiagrammen, ergänzend dem Zustandsdiagramm. XMI liefert das Klassen- und Use-Case-Modell; Sequenzdiagramme werden in VP angelegt. Die finale VPP-Datei wird in uml/ gesichert.</w:t>
             </w:r>
           </w:p>
         </w:tc>
@@ -11849,6 +11964,88 @@
     </w:sectPr>
   </w:body>
 </w:document>
+</file>
+
+<file path=word/comments.xml><?xml version="1.0" encoding="utf-8"?>
+<w:comments xmlns:w="http://schemas.openxmlformats.org/wordprocessingml/2006/main">
+  <w:comment w:id="0" w:author="David Leismann" w:initials="DL" w:date="2026-10-05T10:03:10Z">
+    <w:p>
+      <w:r>
+        <w:t>Zuständigkeit laut doku/protokolle/2026-10-05-gruppentermin.md: David SD2/SD4/SD5/SD6, Kilian SD1/SD3. Dies ist die Aufgabenverteilung, kein Nachweis tatsächlicher Einzelbeiträge; der gelbe Platzhalter bleibt bestehen.</w:t>
+      </w:r>
+    </w:p>
+  </w:comment>
+  <w:comment w:id="1" w:author="David Leismann" w:initials="DL" w:date="2026-10-05T10:03:10Z">
+    <w:p>
+      <w:r>
+        <w:t>Mit P01 und SD1 abgeglichen: Die Voranmeldung wird bei Eingang der Anfrage angelegt; bei Annahme des Vorschlags wird sie bestätigt.</w:t>
+      </w:r>
+    </w:p>
+  </w:comment>
+  <w:comment w:id="2" w:author="David Leismann" w:initials="DL" w:date="2026-10-05T10:03:10Z">
+    <w:p>
+      <w:r>
+        <w:t>E-21: Aktive .bpmn/.puml-Dateien direkt bearbeiten, Generatoren nur im Archiv; Office-Dateien direkt pflegen.</w:t>
+      </w:r>
+    </w:p>
+  </w:comment>
+  <w:comment w:id="3" w:author="David Leismann" w:initials="DL" w:date="2026-10-05T10:03:10Z">
+    <w:p>
+      <w:r>
+        <w:t>Abgleich mit main cc329e1 vom 05.10.2026. QA-Checkliste ist seit 05.10. gültig. Historische Linter-Ergebnisse sind keine Bestätigung für spätere Modelländerungen; Camunda-/VP-Abschluss bleibt offen.</w:t>
+      </w:r>
+    </w:p>
+  </w:comment>
+  <w:comment w:id="4" w:author="David Leismann" w:initials="DL" w:date="2026-10-05T10:03:10Z">
+    <w:p>
+      <w:r>
+        <w:t>Aktuelle BPMN-XML nachgezählt: 131 Werkstatt-Aktivitäten, 79 automatisiert, 33 User Tasks, 9 Manual Tasks, 9 Call Activities, 1 Subprozess; 26 Kundenaktivitäten, 40 Nachrichtenflüsse, 48 Datenobjekt-Referenzen und 12 Datenspeicherdefinitionen.</w:t>
+      </w:r>
+    </w:p>
+  </w:comment>
+  <w:comment w:id="5" w:author="David Leismann" w:initials="DL" w:date="2026-10-05T10:03:10Z">
+    <w:p>
+      <w:r>
+        <w:t>Quelle: P07 GW07_Grenze / T07_Abbruch / T07_Teile (E-19). Der Text beschreibt die aktuelle BPMN-Fassung; die fehlenden Ergänzungen in SD4 sind im Abschnitt zum Sequenzdiagramm und in 5.4 ausdrücklich offengelegt.</w:t>
+      </w:r>
+    </w:p>
+  </w:comment>
+  <w:comment w:id="6" w:author="David Leismann" w:initials="DL" w:date="2026-10-05T10:03:10Z">
+    <w:p>
+      <w:r>
+        <w:t>Quelle: P08 GW08_Dritte / T08_Verwertung / GW08_Mahnstufe / T08_Inkasso (E-19). Die Gruppenbestätigung der Grenzwerte und ein möglicher Status für verwertete Geräte stehen noch aus.</w:t>
+      </w:r>
+    </w:p>
+  </w:comment>
+  <w:comment w:id="7" w:author="David Leismann" w:initials="DL" w:date="2026-10-05T10:03:10Z">
+    <w:p>
+      <w:r>
+        <w:t>uml/modell.xmi enthält Klassen und Use Cases, keine sechs Sequenzdiagramme. Im aktuellen Git-Stand gibt es keine .vpp; deren Fertigstellung ist weiterhin Aufgabe von Kilian und David.</w:t>
+      </w:r>
+    </w:p>
+  </w:comment>
+  <w:comment w:id="8" w:author="David Leismann" w:initials="DL" w:date="2026-10-05T10:03:10Z">
+    <w:p>
+      <w:r>
+        <w:t>Offene QA-Befunde Q2/Q3: SD4 wurde in diesem Dokumentationsabgleich nicht verändert. Die Doku nennt die tatsächliche Abweichung zu P07, statt einen abgeschlossenen Modellabgleich zu behaupten.</w:t>
+      </w:r>
+    </w:p>
+  </w:comment>
+  <w:comment w:id="9" w:author="David Leismann" w:initials="DL" w:date="2026-10-05T10:03:10Z">
+    <w:p>
+      <w:r>
+        <w:t>E-21 und abgabe/README.md: BPMN-ZIP zur Abgabe von Hand packen. Das Abgabe-Archiv und die finale VPP-Datei werden hier als vorgesehen beschrieben.</w:t>
+      </w:r>
+    </w:p>
+  </w:comment>
+  <w:comment w:id="10" w:author="David Leismann" w:initials="DL" w:date="2026-10-05T10:03:10Z">
+    <w:p>
+      <w:r>
+        <w:t>Das PNG auf main war oben abgeschnitten. Aus der unveränderten usecase.puml mit PlantUML 1.2026.8 vollständig neu exportiert und proportional eingebettet. Alle acht Akteure und 19 Use Cases sind enthalten; die aktualisierte PNG-Datei wird zusammen mit der Doku im Repository abgelegt.</w:t>
+      </w:r>
+    </w:p>
+  </w:comment>
+</w:comments>
 </file>
 
 <file path=word/endnotes.xml><?xml version="1.0" encoding="utf-8"?>

</xml_diff>

<commit_message>
[T04 2026-10-05] fix: close QA findings Q1-Q3/B12 and finalize documents (E-22)
- P06: stop after second unanswered delivery reminder (cancel, alternative supplier)
- P10: receive replacement delivery before booking it
- SD4: parts disposition via UC09 for approved supplement, abort after second rework
- Doku: placeholders filled, status passages, images, TOC; slides aligned with doku
- abgabe/ABGABE-STATUS.md and KI-Angabe-Moodle.md (draft)

Co-Authored-By: Claude Opus 5.5 <noreply@anthropic.com>
Claude-Session: https://claude.ai/code/session_01H2bGsFaySUqsEjJ1PXuxUw
</commit_message>
<xml_diff>
--- a/doku/Projektdokumentation.docx
+++ b/doku/Projektdokumentation.docx
@@ -173,9 +173,8 @@
         <w:rPr>
           <w:rFonts w:ascii="Calibri" w:hAnsi="Calibri"/>
           <w:sz w:val="20"/>
-          <w:color w:val="666666"/>
-        </w:rPr>
-        <w:t>Bearbeitungsstand: 5. Oktober 2026</w:t>
+        </w:rPr>
+        <w:t>Bearbeitungsstand: 8. Oktober 2026</w:t>
       </w:r>
     </w:p>
     <w:p>
@@ -306,7 +305,9 @@
           <w:sz w:val="20"/>
           <w:szCs w:val="20"/>
         </w:rPr>
-        <w:t xml:space="preserve">2.2 Das Startup RepairFlow	2</w:t>
+        <w:t>2.2 Das Startup RepairFlow</w:t>
+        <w:tab/>
+        <w:t>3</w:t>
       </w:r>
     </w:p>
     <w:p>
@@ -382,7 +383,9 @@
           <w:sz w:val="20"/>
           <w:szCs w:val="20"/>
         </w:rPr>
-        <w:t xml:space="preserve">2.6 Alleinstellungsmerkmal: die KI-Sofortdiagnose	4</w:t>
+        <w:t>2.6 Alleinstellungsmerkmal: die KI-Sofortdiagnose</w:t>
+        <w:tab/>
+        <w:t>5</w:t>
       </w:r>
     </w:p>
     <w:p>
@@ -401,7 +404,9 @@
           <w:sz w:val="22"/>
           <w:szCs w:val="22"/>
         </w:rPr>
-        <w:t xml:space="preserve">3 Vorgehen bei der Umsetzung	5</w:t>
+        <w:t>3 Vorgehen bei der Umsetzung</w:t>
+        <w:tab/>
+        <w:t>6</w:t>
       </w:r>
     </w:p>
     <w:p>
@@ -439,7 +444,9 @@
           <w:sz w:val="20"/>
           <w:szCs w:val="20"/>
         </w:rPr>
-        <w:t xml:space="preserve">3.2 Konventionen	6</w:t>
+        <w:t>3.2 Konventionen</w:t>
+        <w:tab/>
+        <w:t>7</w:t>
       </w:r>
     </w:p>
     <w:p>
@@ -477,7 +484,9 @@
           <w:sz w:val="22"/>
           <w:szCs w:val="22"/>
         </w:rPr>
-        <w:t xml:space="preserve">4 Projektmanagement	7</w:t>
+        <w:t>4 Projektmanagement</w:t>
+        <w:tab/>
+        <w:t>8</w:t>
       </w:r>
     </w:p>
     <w:p>
@@ -496,7 +505,9 @@
           <w:sz w:val="20"/>
           <w:szCs w:val="20"/>
         </w:rPr>
-        <w:t xml:space="preserve">4.1 Vorgehensmodell und Arbeitsweise	7</w:t>
+        <w:t>4.1 Vorgehensmodell und Arbeitsweise</w:t>
+        <w:tab/>
+        <w:t>8</w:t>
       </w:r>
     </w:p>
     <w:p>
@@ -515,7 +526,9 @@
           <w:sz w:val="20"/>
           <w:szCs w:val="20"/>
         </w:rPr>
-        <w:t xml:space="preserve">4.2 Sprintplan und Meilensteine	7</w:t>
+        <w:t>4.2 Sprintplan und Meilensteine</w:t>
+        <w:tab/>
+        <w:t>8</w:t>
       </w:r>
     </w:p>
     <w:p>
@@ -534,7 +547,9 @@
           <w:sz w:val="20"/>
           <w:szCs w:val="20"/>
         </w:rPr>
-        <w:t xml:space="preserve">4.3 Aufgabensteuerung mit Trello	8</w:t>
+        <w:t>4.3 Aufgabensteuerung mit Trello</w:t>
+        <w:tab/>
+        <w:t>9</w:t>
       </w:r>
     </w:p>
     <w:p>
@@ -553,7 +568,9 @@
           <w:sz w:val="20"/>
           <w:szCs w:val="20"/>
         </w:rPr>
-        <w:t xml:space="preserve">4.4 Zusammenarbeit im Repository	8</w:t>
+        <w:t>4.4 Zusammenarbeit im Repository</w:t>
+        <w:tab/>
+        <w:t>9</w:t>
       </w:r>
     </w:p>
     <w:p>
@@ -591,7 +608,9 @@
           <w:sz w:val="22"/>
           <w:szCs w:val="22"/>
         </w:rPr>
-        <w:t xml:space="preserve">5 Überblick über die erstellten Artefakte	9</w:t>
+        <w:t>5 Überblick über die erstellten Artefakte</w:t>
+        <w:tab/>
+        <w:t>10</w:t>
       </w:r>
     </w:p>
     <w:p>
@@ -610,7 +629,9 @@
           <w:sz w:val="20"/>
           <w:szCs w:val="20"/>
         </w:rPr>
-        <w:t xml:space="preserve">5.1 Geschäftsprozessmodell (BPMN)	9</w:t>
+        <w:t>5.1 Geschäftsprozessmodell (BPMN)</w:t>
+        <w:tab/>
+        <w:t>10</w:t>
       </w:r>
     </w:p>
     <w:p>
@@ -629,7 +650,9 @@
           <w:sz w:val="20"/>
           <w:szCs w:val="20"/>
         </w:rPr>
-        <w:t xml:space="preserve">5.1.1 Modellierungskonventionen	10</w:t>
+        <w:t>5.1.1 Modellierungskonventionen</w:t>
+        <w:tab/>
+        <w:t>11</w:t>
       </w:r>
     </w:p>
     <w:p>
@@ -648,7 +671,9 @@
           <w:sz w:val="20"/>
           <w:szCs w:val="20"/>
         </w:rPr>
-        <w:t xml:space="preserve">5.1.2 Die zehn Prozesse	11</w:t>
+        <w:t>5.1.2 Die zehn Prozesse</w:t>
+        <w:tab/>
+        <w:t>12</w:t>
       </w:r>
     </w:p>
     <w:p>
@@ -686,7 +711,9 @@
           <w:sz w:val="20"/>
           <w:szCs w:val="20"/>
         </w:rPr>
-        <w:t xml:space="preserve">5.3 Objektorientierte Analyse (UML)	13</w:t>
+        <w:t>5.3 Objektorientierte Analyse (UML)</w:t>
+        <w:tab/>
+        <w:t>14</w:t>
       </w:r>
     </w:p>
     <w:p>
@@ -705,7 +732,9 @@
           <w:sz w:val="20"/>
           <w:szCs w:val="20"/>
         </w:rPr>
-        <w:t xml:space="preserve">5.3.1 Use-Case-Diagramm	13</w:t>
+        <w:t>5.3.1 Use-Case-Diagramm</w:t>
+        <w:tab/>
+        <w:t>14</w:t>
       </w:r>
     </w:p>
     <w:p>
@@ -724,7 +753,9 @@
           <w:sz w:val="20"/>
           <w:szCs w:val="20"/>
         </w:rPr>
-        <w:t xml:space="preserve">5.3.2 Klassendiagramm	14</w:t>
+        <w:t>5.3.2 Klassendiagramm</w:t>
+        <w:tab/>
+        <w:t>15</w:t>
       </w:r>
     </w:p>
     <w:p>
@@ -743,7 +774,9 @@
           <w:sz w:val="20"/>
           <w:szCs w:val="20"/>
         </w:rPr>
-        <w:t xml:space="preserve">5.3.3 Sequenzdiagramme	15</w:t>
+        <w:t>5.3.3 Sequenzdiagramme</w:t>
+        <w:tab/>
+        <w:t>16</w:t>
       </w:r>
     </w:p>
     <w:p>
@@ -762,7 +795,9 @@
           <w:sz w:val="20"/>
           <w:szCs w:val="20"/>
         </w:rPr>
-        <w:t xml:space="preserve">5.4 Konsistenz zwischen den Modellen	21</w:t>
+        <w:t>5.4 Konsistenz zwischen den Modellen</w:t>
+        <w:tab/>
+        <w:t>22</w:t>
       </w:r>
     </w:p>
     <w:p>
@@ -781,7 +816,9 @@
           <w:sz w:val="22"/>
           <w:szCs w:val="22"/>
         </w:rPr>
-        <w:t xml:space="preserve">6 Probleme und Herausforderungen	22</w:t>
+        <w:t>6 Probleme und Herausforderungen</w:t>
+        <w:tab/>
+        <w:t>23</w:t>
       </w:r>
     </w:p>
     <w:p>
@@ -800,7 +837,9 @@
           <w:sz w:val="22"/>
           <w:szCs w:val="22"/>
         </w:rPr>
-        <w:t xml:space="preserve">7 Feedback	24</w:t>
+        <w:t>7 Feedback</w:t>
+        <w:tab/>
+        <w:t>25</w:t>
       </w:r>
     </w:p>
     <w:p>
@@ -819,7 +858,9 @@
           <w:sz w:val="20"/>
           <w:szCs w:val="20"/>
         </w:rPr>
-        <w:t xml:space="preserve">7.1 Feedback des Dozenten und Umsetzung	24</w:t>
+        <w:t>7.1 Feedback des Dozenten und Umsetzung</w:t>
+        <w:tab/>
+        <w:t>25</w:t>
       </w:r>
     </w:p>
     <w:p>
@@ -838,7 +879,9 @@
           <w:sz w:val="20"/>
           <w:szCs w:val="20"/>
         </w:rPr>
-        <w:t xml:space="preserve">7.2 Unser Feedback zur Fallstudie	24</w:t>
+        <w:t>7.2 Unser Feedback zur Fallstudie</w:t>
+        <w:tab/>
+        <w:t>25</w:t>
       </w:r>
     </w:p>
     <w:p>
@@ -857,7 +900,9 @@
           <w:sz w:val="22"/>
           <w:szCs w:val="22"/>
         </w:rPr>
-        <w:t xml:space="preserve">Anhang A: Abgabestruktur	24</w:t>
+        <w:t>Anhang A: Abgabestruktur</w:t>
+        <w:tab/>
+        <w:t>26</w:t>
       </w:r>
     </w:p>
     <w:p>
@@ -876,7 +921,9 @@
           <w:sz w:val="22"/>
           <w:szCs w:val="22"/>
         </w:rPr>
-        <w:t xml:space="preserve">Anhang B: Die zehn BPMN-Kollaborationsdiagramme	25</w:t>
+        <w:t>Anhang B: Die zehn BPMN-Kollaborationsdiagramme</w:t>
+        <w:tab/>
+        <w:t>27</w:t>
       </w:r>
     </w:p>
     <w:p>
@@ -895,7 +942,9 @@
           <w:sz w:val="22"/>
           <w:szCs w:val="22"/>
         </w:rPr>
-        <w:t xml:space="preserve">Anhang C: Das vollständige Klassendiagramm	35</w:t>
+        <w:t>Anhang C: Das vollständige Klassendiagramm</w:t>
+        <w:tab/>
+        <w:t>37</w:t>
       </w:r>
     </w:p>
     <w:p>
@@ -1620,13 +1669,190 @@
       <w:r>
         <w:rPr>
           <w:rFonts w:ascii="Calibri" w:cs="Calibri" w:eastAsia="Calibri" w:hAnsi="Calibri"/>
-          <w:i/>
-          <w:iCs/>
-          <w:sz w:val="22"/>
-          <w:szCs w:val="22"/>
-          <w:shd w:fill="FFF2A8" w:color="auto" w:val="clear"/>
-        </w:rPr>
-        <w:t xml:space="preserve">[Gruppe: Vor der Abgabe ergänzen: tatsächliche Beiträge je Person (welche Diagramme, Kapitel und Folien wer erarbeitet hat), weil der Ablauf verlangt, dass erkennbar ist, was von wem erarbeitet wurde]</w:t>
+          <w:sz w:val="22"/>
+          <w:szCs w:val="22"/>
+        </w:rPr>
+        <w:t>Die folgende Übersicht nennt, was die einzelnen Gruppenmitglieder erarbeitet haben. Grundlage sind die Aufgabenverteilungen der Gruppentermine vom 02.09. und 05.10.2026 und die Historie des Repositories.</w:t>
+      </w:r>
+    </w:p>
+    <w:p>
+      <w:pPr>
+        <w:pStyle w:val="ListParagraph"/>
+        <w:numPr>
+          <w:ilvl w:val="0"/>
+          <w:numId w:val="2"/>
+        </w:numPr>
+        <w:spacing w:after="60" w:line="264"/>
+        <w:keepLines/>
+      </w:pPr>
+      <w:r>
+        <w:rPr>
+          <w:rFonts w:ascii="Calibri" w:cs="Calibri" w:eastAsia="Calibri" w:hAnsi="Calibri"/>
+          <w:b/>
+          <w:bCs/>
+          <w:sz w:val="22"/>
+          <w:szCs w:val="22"/>
+        </w:rPr>
+        <w:t xml:space="preserve">Nina Sattler: </w:t>
+      </w:r>
+      <w:r>
+        <w:rPr>
+          <w:rFonts w:ascii="Calibri" w:cs="Calibri" w:eastAsia="Calibri" w:hAnsi="Calibri"/>
+          <w:bCs/>
+          <w:sz w:val="22"/>
+          <w:szCs w:val="22"/>
+        </w:rPr>
+        <w:t>Projektleitung mit Gesamtplanung, Terminen und Abgabe-Archiv; Prüfung der BPMN-Diagramme 07 und 08 in Sprint 1; Folien 1–2 und 18–19.</w:t>
+      </w:r>
+    </w:p>
+    <w:p>
+      <w:pPr>
+        <w:pStyle w:val="ListParagraph"/>
+        <w:numPr>
+          <w:ilvl w:val="0"/>
+          <w:numId w:val="2"/>
+        </w:numPr>
+        <w:spacing w:after="60" w:line="264"/>
+        <w:keepLines/>
+      </w:pPr>
+      <w:r>
+        <w:rPr>
+          <w:rFonts w:ascii="Calibri" w:cs="Calibri" w:eastAsia="Calibri" w:hAnsi="Calibri"/>
+          <w:b/>
+          <w:bCs/>
+          <w:sz w:val="22"/>
+          <w:szCs w:val="22"/>
+        </w:rPr>
+        <w:t xml:space="preserve">David Leismann: </w:t>
+      </w:r>
+      <w:r>
+        <w:rPr>
+          <w:rFonts w:ascii="Calibri" w:cs="Calibri" w:eastAsia="Calibri" w:hAnsi="Calibri"/>
+          <w:bCs/>
+          <w:sz w:val="22"/>
+          <w:szCs w:val="22"/>
+        </w:rPr>
+        <w:t>Prüfung der BPMN-Diagramme 03 und 04 in Sprint 1; Abgleich der Use Cases und Sequenzdiagramme mit den Prozessen (E-18); Überarbeitung der Prozesse 05 und 06 (E-20); Abgleich der Projektdokumentation mit dem Modellstand; Sequenzdiagramme SD2, SD4, SD5 und SD6 in Visual Paradigm; Folien 3 und 16.</w:t>
+      </w:r>
+    </w:p>
+    <w:p>
+      <w:pPr>
+        <w:pStyle w:val="ListParagraph"/>
+        <w:numPr>
+          <w:ilvl w:val="0"/>
+          <w:numId w:val="2"/>
+        </w:numPr>
+        <w:spacing w:after="60" w:line="264"/>
+        <w:keepLines/>
+      </w:pPr>
+      <w:r>
+        <w:rPr>
+          <w:rFonts w:ascii="Calibri" w:cs="Calibri" w:eastAsia="Calibri" w:hAnsi="Calibri"/>
+          <w:b/>
+          <w:bCs/>
+          <w:sz w:val="22"/>
+          <w:szCs w:val="22"/>
+        </w:rPr>
+        <w:t xml:space="preserve">Adrian Wenzler: </w:t>
+      </w:r>
+      <w:r>
+        <w:rPr>
+          <w:rFonts w:ascii="Calibri" w:cs="Calibri" w:eastAsia="Calibri" w:hAnsi="Calibri"/>
+          <w:bCs/>
+          <w:sz w:val="22"/>
+          <w:szCs w:val="22"/>
+        </w:rPr>
+        <w:t>Product Owner mit fachlicher Abnahme im Sprint Review; Prüfung der BPMN-Diagramme 05 und 06 in Sprint 1; zuständig für die Bestätigung der Prozessänderungen E-19 und E-20; Folien 4–6 und 11.</w:t>
+      </w:r>
+    </w:p>
+    <w:p>
+      <w:pPr>
+        <w:pStyle w:val="ListParagraph"/>
+        <w:numPr>
+          <w:ilvl w:val="0"/>
+          <w:numId w:val="2"/>
+        </w:numPr>
+        <w:spacing w:after="60" w:line="264"/>
+        <w:keepLines/>
+      </w:pPr>
+      <w:r>
+        <w:rPr>
+          <w:rFonts w:ascii="Calibri" w:cs="Calibri" w:eastAsia="Calibri" w:hAnsi="Calibri"/>
+          <w:b/>
+          <w:bCs/>
+          <w:sz w:val="22"/>
+          <w:szCs w:val="22"/>
+        </w:rPr>
+        <w:t xml:space="preserve">Kilian Platter: </w:t>
+      </w:r>
+      <w:r>
+        <w:rPr>
+          <w:rFonts w:ascii="Calibri" w:cs="Calibri" w:eastAsia="Calibri" w:hAnsi="Calibri"/>
+          <w:bCs/>
+          <w:sz w:val="22"/>
+          <w:szCs w:val="22"/>
+        </w:rPr>
+        <w:t>Scrum Master mit Trello-Board und Sprint-Protokollen; Zusammenführung der beiden Entwürfe (E-10); Gesamtprüfungen vom 26.09. und 05.10.2026 (E-15, E-17); Use-Case- und Klassendiagramm sowie SD1 und SD3 in Visual Paradigm; Folien 12–14.</w:t>
+      </w:r>
+    </w:p>
+    <w:p>
+      <w:pPr>
+        <w:pStyle w:val="ListParagraph"/>
+        <w:numPr>
+          <w:ilvl w:val="0"/>
+          <w:numId w:val="2"/>
+        </w:numPr>
+        <w:spacing w:after="60" w:line="264"/>
+        <w:keepLines/>
+      </w:pPr>
+      <w:r>
+        <w:rPr>
+          <w:rFonts w:ascii="Calibri" w:cs="Calibri" w:eastAsia="Calibri" w:hAnsi="Calibri"/>
+          <w:b/>
+          <w:bCs/>
+          <w:sz w:val="22"/>
+          <w:szCs w:val="22"/>
+        </w:rPr>
+        <w:t xml:space="preserve">Maximilian Ewald: </w:t>
+      </w:r>
+      <w:r>
+        <w:rPr>
+          <w:rFonts w:ascii="Calibri" w:cs="Calibri" w:eastAsia="Calibri" w:hAnsi="Calibri"/>
+          <w:bCs/>
+          <w:sz w:val="22"/>
+          <w:szCs w:val="22"/>
+        </w:rPr>
+        <w:t>Prüfung der BPMN-Diagramme 01 und 02 in Sprint 1; seit E-21 verantwortlich für alle zehn BPMN-Dateien, ihre Prüfung im Camunda Modeler und den PNG-Export; Folien 7–10.</w:t>
+      </w:r>
+    </w:p>
+    <w:p>
+      <w:pPr>
+        <w:pStyle w:val="ListParagraph"/>
+        <w:numPr>
+          <w:ilvl w:val="0"/>
+          <w:numId w:val="2"/>
+        </w:numPr>
+        <w:spacing w:after="60" w:line="264"/>
+        <w:keepLines/>
+      </w:pPr>
+      <w:r>
+        <w:rPr>
+          <w:rFonts w:ascii="Calibri" w:cs="Calibri" w:eastAsia="Calibri" w:hAnsi="Calibri"/>
+          <w:b/>
+          <w:bCs/>
+          <w:sz w:val="22"/>
+          <w:szCs w:val="22"/>
+        </w:rPr>
+        <w:t xml:space="preserve">Jakob Schwan: </w:t>
+      </w:r>
+      <w:r>
+        <w:rPr>
+          <w:rFonts w:ascii="Calibri" w:cs="Calibri" w:eastAsia="Calibri" w:hAnsi="Calibri"/>
+          <w:bCs/>
+          <w:sz w:val="22"/>
+          <w:szCs w:val="22"/>
+        </w:rPr>
+        <w:t>Prüfung der BPMN-Diagramme 09 und 10 mit Review-Protokoll in Sprint 1; Behebung der Logikfehler in den Prozessen 07 und 08 (E-19); QA-Checkliste, Prüfung und Merge der Pull Requests; Folien 15 und 17.</w:t>
       </w:r>
     </w:p>
     <w:p>
@@ -3155,13 +3381,10 @@
       <w:r>
         <w:rPr>
           <w:rFonts w:ascii="Calibri" w:cs="Calibri" w:eastAsia="Calibri" w:hAnsi="Calibri"/>
-          <w:i/>
-          <w:iCs/>
-          <w:sz w:val="22"/>
-          <w:szCs w:val="22"/>
-          <w:shd w:fill="FFF2A8" w:color="auto" w:val="clear"/>
-        </w:rPr>
-        <w:t xml:space="preserve">[Gruppe: Nach Sprint 2 ergänzen, wie die Reviews tatsächlich abgelaufen sind: Anzahl der Befunde, typische Fehler]</w:t>
+          <w:sz w:val="22"/>
+          <w:szCs w:val="22"/>
+        </w:rPr>
+        <w:t>Bis zum 08.10.2026 gab es vier Prüfrunden. In Sprint 1 hat Jakob die Prozesse 09 und 10 strukturell geprüft, ohne Befund. Die Gesamtprüfung am 26.09.2026 (E-15) fand fachliche Fehler in den Prozessen 02, 05 und 06, Datenobjekte, deren Namen nicht zu den Klassen passten, und Sequenzbotschaften, die keine Operation der Empfängerklasse waren. Der Komplettcheck am 05.10.2026 (E-17) ergab 26 Befunde, zwölf zu BPMN und 14 zu UML. Typisch waren Warteschleifen ohne Ausstieg, abgelehnte Aufträge ohne Rückgabe des Geräts, fehlende Nachrichtenflüsse zwischen den Pools und vertauschte include- und extend-Beziehungen. Jakobs QA-Prüfung am selben Tag führte acht weitere Punkte (Q1 bis Q8). Fünf davon waren sofort erledigt; die übrigen drei und der verwandte Befund B12 betrafen Prozess 06, Prozess 10 und SD4 und wurden am 08.10.2026 umgesetzt (E-22). Daraus haben wir gelernt, dass jede Änderung an einem Prozess eine Prüfung der zugehörigen Use Cases und Sequenzdiagramme nach sich ziehen muss.</w:t>
       </w:r>
     </w:p>
     <w:p>
@@ -4042,13 +4265,10 @@
       <w:r>
         <w:rPr>
           <w:rFonts w:ascii="Calibri" w:cs="Calibri" w:eastAsia="Calibri" w:hAnsi="Calibri"/>
-          <w:i/>
-          <w:iCs/>
-          <w:sz w:val="22"/>
-          <w:szCs w:val="22"/>
-          <w:shd w:fill="FFF2A8" w:color="auto" w:val="clear"/>
-        </w:rPr>
-        <w:t xml:space="preserve">[Gruppe: Tatsächliche Sprint-Ergebnisse und Abweichungen vom Plan beschreiben]</w:t>
+          <w:sz w:val="22"/>
+          <w:szCs w:val="22"/>
+        </w:rPr>
+        <w:t>Tatsächlich verlief die Arbeit an zwei Stellen anders als geplant. Die Übernahme des UML-Modells in Visual Paradigm war für Sprint 1 vorgesehen, wurde aber erst in Sprint 3 begonnen, auch weil die Modelle nach den Prüfrunden in Sprint 2 noch mehrfach geändert wurden (E-15 bis E-20); die Sequenzdiagramme entstanden deshalb zunächst als PlantUML-Quellen. Außerdem kamen in Sprint 2 mit der Gesamtprüfung und dem Komplettcheck zwei Korrekturrunden hinzu, die nicht als Karten geplant waren. Am 05.10.2026 hat die Gruppe alle offenen Grundsatzentscheidungen getroffen (E-21) und die Arbeit für Sprint 3 neu verteilt. Bis zum 08.10.2026 sind das Use-Case-Diagramm in Visual Paradigm angelegt und die offenen QA-Befunde in den Modellen behoben; Klassendiagramm, Sequenzdiagramme in Visual Paradigm und die Prüfung im Camunda Modeler folgen bis zum 15.10.2026.</w:t>
       </w:r>
     </w:p>
     <w:p>
@@ -7205,7 +7425,7 @@
           <w:sz w:val="22"/>
           <w:szCs w:val="22"/>
         </w:rPr>
-        <w:t xml:space="preserve">Insgesamt enthalten die zehn Werkstatt-Prozesse 131 Aktivitäten, im Durchschnitt 13,1 je Diagramm. Gezählt werden alle Task-Typen, Aufruf-Aktivitäten und der Mehrfach-Teilprozess einschließlich seiner enthaltenen Aktivitäten. Die Kundenabläufe kommen mit 26 weiteren Aktivitäten hinzu und sind in Tabelle 1 nicht mitgezählt. Dazu kommen 40 Nachrichtenflüsse sowie 48 Datenobjekt-Referenzen und zwölf Datenspeicherdefinitionen, zusammen 60; mehrere Referenzen auf denselben Speicher innerhalb eines Diagramms zählen dabei einmal. Jeder Prozess hat auf Prozessebene genau ein Start- und ein Endereignis.</w:t>
+        <w:t>Insgesamt enthalten die zehn Werkstatt-Prozesse 131 Aktivitäten, im Durchschnitt 13,1 je Diagramm. Gezählt werden alle Task-Typen, Aufruf-Aktivitäten und der Mehrfach-Teilprozess einschließlich seiner enthaltenen Aktivitäten. Die Kundenabläufe kommen mit 26 weiteren Aktivitäten hinzu und sind in Tabelle 1 nicht mitgezählt. Dazu kommen 41 Nachrichtenflüsse sowie 48 Datenobjekt-Referenzen und zwölf Datenspeicherdefinitionen, zusammen 60; mehrere Referenzen auf denselben Speicher innerhalb eines Diagramms zählen dabei einmal. Jeder Prozess hat auf Prozessebene genau ein Start- und ein Endereignis.</w:t>
       </w:r>
       <w:commentRangeEnd w:id="4"/>
       <w:r>
@@ -7881,7 +8101,7 @@
           <w:sz w:val="22"/>
           <w:szCs w:val="22"/>
         </w:rPr>
-        <w:t xml:space="preserve">Die Fehlteile eines Auftrags werden mit offenen Nachbestellvorschlägen gebündelt und beim Lieferanten bestellt, bei Überschreitung der Freigabegrenze nach Freigabe durch die Werkstattleitung. Kommt binnen 3 Tagen keine Auftragsbestätigung oder kann der Lieferant nicht liefern, wird die Bestellung storniert und ein alternativer Lieferant gesucht. Nach Auftragsbestätigung wird der Liefertermin am Auftrag hinterlegt (Status „Teile bestellt") und der Kunde bei Verzögerung informiert; bleibt die Lieferung 14 Tage aus, wird sie angemahnt und erneut gewartet. Eine Grenze für wiederholte Liefermahnungen ist bisher nicht modelliert und muss im Rahmen von E-20 festgelegt werden. Der Wareneingang wird geprüft und gebucht, mangelhafte Lieferungen gehen in die Retoure (Prozess 10). Eine Ersatzlieferung wird geprüft, bevor die Fehlteile dem Auftrag zugeordnet werden; bei Gutschrift wird neu bestellt, solange das Teil noch benötigt wird.</w:t>
+        <w:t>Die Fehlteile eines Auftrags werden mit offenen Nachbestellvorschlägen gebündelt und beim Lieferanten bestellt, bei Überschreitung der Freigabegrenze nach Freigabe durch die Werkstattleitung. Kommt binnen 3 Tagen keine Auftragsbestätigung oder kann der Lieferant nicht liefern, wird die Bestellung storniert und ein alternativer Lieferant gesucht. Nach Auftragsbestätigung wird der Liefertermin am Auftrag hinterlegt (Status „Teile bestellt") und der Kunde bei Verzögerung informiert; bleibt die Lieferung 14 Tage aus, wird sie angemahnt und erneut gewartet. Bleibt auch die zweite Mahnung ohne Lieferung, wird die Bestellung wie bei fehlender Auftragsbestätigung storniert und ein alternativer Lieferant gesucht (E-22). Der Wareneingang wird geprüft und gebucht, mangelhafte Lieferungen gehen in die Retoure (Prozess 10). Eine Ersatzlieferung wird geprüft, bevor die Fehlteile dem Auftrag zugeordnet werden; bei Gutschrift wird neu bestellt, solange das Teil noch benötigt wird.</w:t>
       </w:r>
     </w:p>
     <w:p>
@@ -7993,7 +8213,7 @@
           <w:sz w:val="22"/>
           <w:szCs w:val="22"/>
         </w:rPr>
-        <w:t xml:space="preserve">Defekte oder falsche Lieferantenteile werden beim Lieferanten angemeldet. Bleibt die RMA-Freigabe fünf Tage aus, eskaliert die Werkstattleitung. Nach weiteren fünf Tagen ohne Freigabe wird das Teil abgeschrieben. Nach der Freigabe wird das Teil versendet, der Bestand korrigiert und je nach Rückmeldung eine Ersatzlieferung gebucht oder eine Gutschrift verbucht; ob danach neu bestellt wird, entscheidet der aufrufende Prozess 06. Im Ersatzpfad fehlt derzeit ein ausdrücklicher Empfang der Ersatzlieferung vor ihrer Buchung (offener Befund B12).</w:t>
+        <w:t>Defekte oder falsche Lieferantenteile werden beim Lieferanten angemeldet. Bleibt die RMA-Freigabe fünf Tage aus, eskaliert die Werkstattleitung. Nach weiteren fünf Tagen ohne Freigabe wird das Teil abgeschrieben. Nach der Freigabe wird das Teil versendet, der Bestand korrigiert und je nach Rückmeldung eine Gutschrift verbucht oder auf die Ersatzlieferung gewartet und diese nach ihrem Eingang gebucht (E-22); ob nach einer Gutschrift neu bestellt wird, entscheidet der aufrufende Prozess 06.</w:t>
       </w:r>
     </w:p>
     <w:p>
@@ -8800,7 +9020,7 @@
       <w:r>
         <w:drawing>
           <wp:inline distT="0" distB="0" distL="0" distR="0">
-            <wp:extent cx="3238500" cy="4191000"/>
+            <wp:extent cx="3238500" cy="4524820"/>
             <wp:effectExtent t="0" r="0" b="0" l="0"/>
             <wp:docPr id="7" name="" descr="" title=""/>
             <wp:cNvGraphicFramePr>
@@ -8825,7 +9045,7 @@
                   <pic:spPr bwMode="auto">
                     <a:xfrm>
                       <a:off x="0" y="0"/>
-                      <a:ext cx="3238500" cy="4191000"/>
+                      <a:ext cx="3238500" cy="4524820"/>
                     </a:xfrm>
                     <a:prstGeom prst="rect">
                       <a:avLst/>
@@ -8867,15 +9087,9 @@
           <w:sz w:val="22"/>
           <w:szCs w:val="22"/>
         </w:rPr>
-        <w:t xml:space="preserve">SD4 knüpft die Fertigmeldung an abgeschlossene Reparaturschritte und bestandene Endkontrolle. Der Verweis auf UC13 umfasst Schritte, Arbeitszeiten und einen möglichen Nachtrags-KVA; Ablehnung oder drei Tage ohne Antwort führen zur Endkontrolle. Die dargestellte Fassung ist noch nicht vollständig an E-19 angepasst: Im freigegebenen Nachtrag fehlen die Teile-Disposition über Prozess 05, in der Endkontrollschleife der Abbruch nach der zweiten erfolglosen Nacharbeit. Diese Ergänzungen sind für SD4 noch offen. Abholbenachrichtigung und Rechnung gehören zu UC15 in Prozess 08.</w:t>
+        <w:t>SD4 knüpft die Fertigmeldung an abgeschlossene Reparaturschritte und eine bestandene Endkontrolle. Der Verweis auf UC13 umfasst Schritte, Arbeitszeiten und einen möglichen Nachtrags-KVA: Nach der Freigabe werden die zusätzlichen Teile über UC09 (Prozess 05) disponiert, Ablehnung oder drei Tage ohne Antwort führen zur Endkontrolle. Die Schleife erlaubt höchstens zwei Nacharbeiten; bleibt auch die zweite erfolglos, wechselt der Reparaturauftrag in den Status „abgelehnt“. Abholbenachrichtigung, Rückgabe und Rechnung gehören zu UC15 in Prozess 08.</w:t>
       </w:r>
       <w:commentRangeEnd w:id="8"/>
-      <w:r>
-        <w:rPr>
-          <w:rStyle w:val="CommentReference"/>
-        </w:rPr>
-        <w:commentReference w:id="8"/>
-      </w:r>
     </w:p>
     <w:p>
       <w:pPr>
@@ -9030,7 +9244,7 @@
           <w:sz w:val="22"/>
           <w:szCs w:val="22"/>
         </w:rPr>
-        <w:t xml:space="preserve">SD6 bündelt den Bestellbedarf aus Prozess 05, wählt einen Lieferanten und legt eine Bestellung mit Positionen an. Oberhalb der Freigabegrenze ist die Freigabe durch die Werkstattleitung erforderlich. Nur eine bestätigte und lieferbare Bestellung setzt bei auftragsbezogenen Fehlteilen den Status „Teile bestellt"; Verzögerungen werden dem Kunden mitgeteilt. Nicht lieferbare oder binnen drei Tagen nicht bestätigte Bestellungen werden storniert, ein alternativer Lieferant wird gesucht. Die Lieferwartezeit beträgt 14 Tage, danach wird angemahnt und weiter gewartet; die Abbruchgrenze ist noch offen. UC11 verfeinert Lieferung und Wareneingang, bei Mängeln mit UC19 Retoure. Ohne Ersatz wird nur erneut bestellt, solange das Teil noch benötigt wird. Eine Zusammenführung mit offenen Bestellungen wird nicht behauptet, weil Prozess 06 diesen Pfad nicht enthält.</w:t>
+        <w:t>SD6 bündelt den Bestellbedarf aus Prozess 05, wählt einen Lieferanten und legt eine Bestellung mit Positionen an. Oberhalb der Freigabegrenze ist die Freigabe durch die Werkstattleitung erforderlich. Nur eine bestätigte und lieferbare Bestellung setzt bei auftragsbezogenen Fehlteilen den Status „Teile bestellt"; Verzögerungen werden dem Kunden mitgeteilt. Nicht lieferbare oder binnen drei Tagen nicht bestätigte Bestellungen werden storniert, ein alternativer Lieferant wird gesucht. Die Lieferwartezeit beträgt 14 Tage, danach wird angemahnt und weiter gewartet; nach der zweiten erfolglosen Mahnung wird die Bestellung storniert. UC11 verfeinert Lieferung und Wareneingang, bei Mängeln mit UC19 Retoure. Ohne Ersatz wird nur erneut bestellt, solange das Teil noch benötigt wird. Eine Zusammenführung mit offenen Bestellungen wird nicht behauptet, weil Prozess 06 diesen Pfad nicht enthält.</w:t>
       </w:r>
     </w:p>
     <w:p>
@@ -9072,7 +9286,7 @@
           <w:sz w:val="22"/>
           <w:szCs w:val="22"/>
         </w:rPr>
-        <w:t xml:space="preserve">Offen sind im Stand vom 05.10.2026 die Anpassung von SD4 an den Nachtrags- und Abbruchpfad in P07, die Begrenzung der Liefermahnungen in P06 und der Empfang der Ersatzlieferung vor der Buchung in P10. E-19 und E-20 sind außerdem noch durch die Gruppe zu bestätigen; für verwertete Geräte ist ein möglicher zusätzlicher AuftragStatus ungeklärt. Die QA-Checkliste führt diese Punkte. Die Diagrammbilder entsprechen den aktuell eingecheckten PNGs.</w:t>
+        <w:t>Die am 05.10.2026 noch offenen Abweichungen, also SD4 gegenüber dem Nachtrags- und Abbruchpfad in Prozess 07, die fehlende Begrenzung der Liefermahnungen in Prozess 06 und der fehlende Empfang der Ersatzlieferung in Prozess 10, sind seit dem 08.10.2026 behoben (E-22). Von der Gruppe zu bestätigen sind noch die Fristen aus E-19, E-20 und E-22; ob verwertete Geräte einen eigenen Wert in AuftragStatus brauchen, ist ungeklärt. Die Diagrammbilder entsprechen den aktuell eingecheckten PNGs.</w:t>
       </w:r>
     </w:p>
     <w:tbl>
@@ -10068,11 +10282,10 @@
                 <w:rFonts w:ascii="Calibri" w:cs="Calibri" w:eastAsia="Calibri" w:hAnsi="Calibri"/>
                 <w:b w:val="false"/>
                 <w:bCs w:val="false"/>
-                <w:color w:val="000000"/>
-                <w:sz w:val="19"/>
-                <w:szCs w:val="19"/>
-              </w:rPr>
-              <w:t xml:space="preserve">SD4 (Abgleich offen)</w:t>
+                <w:sz w:val="19"/>
+                <w:szCs w:val="19"/>
+              </w:rPr>
+              <w:t>SD4</w:t>
             </w:r>
           </w:p>
         </w:tc>
@@ -10524,7 +10737,7 @@
           <w:sz w:val="22"/>
           <w:szCs w:val="22"/>
         </w:rPr>
-        <w:t xml:space="preserve">Ein erster Entwurf modellierte Werkstatt und Ersatzteil-Disposition als getrennte Pools. Nach der Vorlesungsregel „Pool = Unternehmen, Lanes = Rollen" wurde auf einen Pool mit Lanes umgestellt; Kunde und Lieferant blieben eigene Pools. Erst dadurch wurden die Nachrichtenflüsse eindeutig. Den Kunden hatten wir zunächst als Black Box gezeichnet; weil dabei nicht sichtbar war, wann er antwortet, entscheidet oder fertig ist, haben wir ihm einen eigenen Ablauf gegeben (Entscheidungslog E-16). Eine Gesamtprüfung aller Modelle am 05.10.2026 (E-17) zeigte danach Lücken zwischen den Prozessen, etwa dass abgelehnte Aufträge nie abgeholt wurden und Warteschleifen keinen Ausstieg hatten; die Rückgaben laufen seitdem über Prozess 08, und Wartesituationen haben modellierte Fristen. In Prozess 06 führt der Liefer-Timer allerdings nur zur Mahnung und zurück in die Warteschleife; ein endgültiger Ausstieg ist noch festzulegen.</w:t>
+        <w:t>Ein erster Entwurf modellierte Werkstatt und Ersatzteil-Disposition als getrennte Pools. Nach der Vorlesungsregel „Pool = Unternehmen, Lanes = Rollen" wurde auf einen Pool mit Lanes umgestellt; Kunde und Lieferant blieben eigene Pools. Erst dadurch wurden die Nachrichtenflüsse eindeutig. Den Kunden hatten wir zunächst als Black Box gezeichnet; weil dabei nicht sichtbar war, wann er antwortet, entscheidet oder fertig ist, haben wir ihm einen eigenen Ablauf gegeben (Entscheidungslog E-16). Eine Gesamtprüfung aller Modelle am 05.10.2026 (E-17) zeigte danach Lücken zwischen den Prozessen, etwa dass abgelehnte Aufträge nie abgeholt wurden und Warteschleifen keinen Ausstieg hatten; die Rückgaben laufen seitdem über Prozess 08, und Wartesituationen haben modellierte Fristen. Die letzte Schleife dieser Art, die Liefermahnung in Prozess 06, hat seit E-22 ebenfalls einen Ausstieg.</w:t>
       </w:r>
     </w:p>
     <w:p>
@@ -10596,7 +10809,7 @@
           <w:sz w:val="22"/>
           <w:szCs w:val="22"/>
         </w:rPr>
-        <w:t xml:space="preserve">Datenobjekte, Klassen, Lebenslinien und Statuswerte müssen wortgleich sein. Frühere Fassungen der Sequenzdiagramme verwendeten „Diagnose" und „Reservierung", das Klassendiagramm „Fehlerbefund" und „ErsatzteilReservierung". Die Rohentwürfe wurden deshalb aus einer gemeinsamen Modellbeschreibung erzeugt. Seit E-21 werden die aktiven Quellen direkt bearbeitet; Namen, Operationen und Beziehungen müssen nach Änderungen erneut gegeneinander geprüft werden. Der noch offene Abgleich von SD4 zeigt, warum diese Prüfung erforderlich bleibt.</w:t>
+        <w:t>Datenobjekte, Klassen, Lebenslinien und Statuswerte müssen wortgleich sein. Frühere Fassungen der Sequenzdiagramme verwendeten „Diagnose" und „Reservierung", das Klassendiagramm „Fehlerbefund" und „ErsatzteilReservierung". Die Rohentwürfe wurden deshalb aus einer gemeinsamen Modellbeschreibung erzeugt. Seit E-21 werden die aktiven Quellen direkt bearbeitet; Namen, Operationen und Beziehungen müssen nach Änderungen erneut gegeneinander geprüft werden. Dass SD4 nach den Korrekturen an Prozess 07 (E-19) erst nachgezogen werden musste, zeigt, warum diese Prüfung erforderlich bleibt.</w:t>
       </w:r>
     </w:p>
     <w:p>
@@ -10679,13 +10892,44 @@
       <w:r>
         <w:rPr>
           <w:rFonts w:ascii="Calibri" w:cs="Calibri" w:eastAsia="Calibri" w:hAnsi="Calibri"/>
-          <w:i/>
-          <w:iCs/>
-          <w:sz w:val="22"/>
-          <w:szCs w:val="22"/>
-          <w:shd w:fill="FFF2A8" w:color="auto" w:val="clear"/>
-        </w:rPr>
-        <w:t xml:space="preserve">[Gruppe: Ergänzen: Herausforderungen in der Gruppenarbeit, zum Beispiel Terminfindung, Aufteilung, Git-Konflikte]</w:t>
+          <w:b/>
+          <w:sz w:val="22"/>
+          <w:szCs w:val="22"/>
+        </w:rPr>
+        <w:t xml:space="preserve">Zusammenarbeit im Team. </w:t>
+      </w:r>
+      <w:r>
+        <w:rPr>
+          <w:rFonts w:ascii="Calibri" w:cs="Calibri" w:eastAsia="Calibri" w:hAnsi="Calibri"/>
+          <w:sz w:val="22"/>
+          <w:szCs w:val="22"/>
+        </w:rPr>
+        <w:t>Sechs Personen arbeiten am selben Repository, aber nicht alle mit denselben Werkzeugen: Zugriff auf Visual Paradigm und den Teamwork-Server haben bei uns nur David und Kilian, sodass sich die UML-Arbeit auf zwei Personen konzentriert. Am 05.10.2026 haben zwei Pull Requests parallel eine Entscheidung mit der Nummer E-20 angelegt; die Konflikte wurden gleichzeitig an zwei Stellen gelöst, und ein Stand musste neu aufgesetzt werden. Seitdem gilt die Regel, vor jeder neuen Entscheidung main zu aktualisieren und die nächste freie Nummer zu nehmen. Word- und PowerPoint-Dateien lassen sich in Git nicht zusammenführen; wer sie bearbeitet, kündigt das deshalb vorher in der WhatsApp-Gruppe an.</w:t>
+      </w:r>
+    </w:p>
+    <w:p>
+      <w:pPr>
+        <w:spacing w:after="120" w:line="276"/>
+        <w:jc w:val="both"/>
+      </w:pPr>
+      <w:r>
+        <w:rPr>
+          <w:rFonts w:ascii="Calibri" w:cs="Calibri" w:eastAsia="Calibri" w:hAnsi="Calibri"/>
+          <w:b/>
+          <w:bCs/>
+          <w:sz w:val="22"/>
+          <w:szCs w:val="22"/>
+        </w:rPr>
+        <w:t xml:space="preserve">Werkzeuge im Alltag. </w:t>
+      </w:r>
+      <w:r>
+        <w:rPr>
+          <w:rFonts w:ascii="Calibri" w:cs="Calibri" w:eastAsia="Calibri" w:hAnsi="Calibri"/>
+          <w:bCs/>
+          <w:sz w:val="22"/>
+          <w:szCs w:val="22"/>
+        </w:rPr>
+        <w:t>Ein Repository, das in einem synchronisierten OneDrive-Ordner liegt, sperrte Dateien im Git-Verzeichnis, sodass Git beim Wechsel von Branches Löschvorgänge nicht abschließen konnte. Beim Aufbau des Use-Case-Diagramms in Visual Paradigm führte ein wiederholter XMI-Import zu doppelten Beziehungen; gelöst haben wir das, indem wir das Modell vollständig gelöscht und einmal sauber neu importiert haben.</w:t>
       </w:r>
     </w:p>
     <w:p>
@@ -10736,13 +10980,10 @@
       <w:r>
         <w:rPr>
           <w:rFonts w:ascii="Calibri" w:cs="Calibri" w:eastAsia="Calibri" w:hAnsi="Calibri"/>
-          <w:i/>
-          <w:iCs/>
-          <w:sz w:val="22"/>
-          <w:szCs w:val="22"/>
-          <w:shd w:fill="FFF2A8" w:color="auto" w:val="clear"/>
-        </w:rPr>
-        <w:t xml:space="preserve">[Gruppe: Weitere Rückmeldungen aus den Coaching-Terminen und deren Umsetzung ergänzen]</w:t>
+          <w:sz w:val="22"/>
+          <w:szCs w:val="22"/>
+        </w:rPr>
+        <w:t>Fragen zum Vorgehen klären wir in den Gruppenterminen direkt mit dem Dozenten; eine feste Ansprechperson gibt es dafür nicht (E-21). Rückmeldungen, die zu Änderungen an den Modellen führen, halten wir im Repository fest und verknüpfen sie mit der zugehörigen Entscheidung.</w:t>
       </w:r>
     </w:p>
     <w:p>
@@ -10769,7 +11010,7 @@
           <w:sz w:val="22"/>
           <w:szCs w:val="22"/>
         </w:rPr>
-        <w:t xml:space="preserve">Die bisherigen Review-Befunde zeigen, wie viel Abstimmung nötig ist, damit Prozessmodell, Use Cases und Klassenmodell zusammenpassen. Für die abschließende Bewertung der Fallstudie sammeln wir die persönlichen Rückmeldungen aller Gruppenmitglieder und die Erfahrungen aus den weiteren Coaching-Terminen.</w:t>
+        <w:t>Am meisten gebracht hat uns, ein Szenario durchgehend von der Prozessanalyse bis zum Sequenzdiagramm zu modellieren. Erst dabei wurde sichtbar, wie eng BPMN, Use Cases und Klassenmodell zusammenhängen: Jede Korrektur an einem Prozess hatte Folgen für mindestens ein UML-Diagramm. Die Reviews im Zweierteam und die Gesamtprüfungen haben mehr Fehler gefunden, als wir beim Modellieren selbst bemerkt hätten.</w:t>
       </w:r>
     </w:p>
     <w:p>
@@ -10780,13 +11021,10 @@
       <w:r>
         <w:rPr>
           <w:rFonts w:ascii="Calibri" w:cs="Calibri" w:eastAsia="Calibri" w:hAnsi="Calibri"/>
-          <w:i/>
-          <w:iCs/>
-          <w:sz w:val="22"/>
-          <w:szCs w:val="22"/>
-          <w:shd w:fill="FFF2A8" w:color="auto" w:val="clear"/>
-        </w:rPr>
-        <w:t xml:space="preserve">[Gruppe: Ergänzen: Was hat euch am meisten gebracht, was war zu viel oder zu wenig, was würdet ihr beim nächsten Mal anders machen]</w:t>
+          <w:sz w:val="22"/>
+          <w:szCs w:val="22"/>
+        </w:rPr>
+        <w:t>Viel Aufwand steckte in Dingen am Rand der eigentlichen Analyse, etwa im Zugang zum Teamwork-Server über das VPN und in der Camunda-8-Anreicherung, die der Modeler für fehlerfreie Diagramme verlangt. Beim nächsten Mal würden wir früher festlegen, welche Datei die verbindliche Quelle eines Modells ist, und das UML-Modell schon in Sprint 1 in Visual Paradigm anlegen, statt es mehrfach außerhalb zu überarbeiten.</w:t>
       </w:r>
     </w:p>
     <w:p>
@@ -10804,6 +11042,7 @@
     </w:p>
     <w:p>
       <w:pPr>
+        <w:keepNext/>
         <w:spacing w:after="120" w:line="276"/>
         <w:jc w:val="both"/>
       </w:pPr>
@@ -10843,6 +11082,7 @@
       <w:tr>
         <w:trPr>
           <w:tblHeader/>
+          <w:cantSplit/>
         </w:trPr>
         <w:tc>
           <w:tcPr>
@@ -10858,6 +11098,7 @@
           </w:tcPr>
           <w:p>
             <w:pPr>
+              <w:keepNext/>
               <w:spacing w:after="40" w:line="252"/>
               <w:jc w:val="left"/>
             </w:pPr>
@@ -10888,6 +11129,7 @@
           </w:tcPr>
           <w:p>
             <w:pPr>
+              <w:keepNext/>
               <w:spacing w:after="40" w:line="252"/>
               <w:jc w:val="left"/>
             </w:pPr>
@@ -10922,6 +11164,7 @@
           </w:tcPr>
           <w:p>
             <w:pPr>
+              <w:keepNext/>
               <w:spacing w:after="40" w:line="252"/>
               <w:jc w:val="left"/>
             </w:pPr>
@@ -10951,6 +11194,7 @@
           </w:tcPr>
           <w:p>
             <w:pPr>
+              <w:keepNext/>
               <w:spacing w:after="40" w:line="252"/>
               <w:jc w:val="left"/>
             </w:pPr>
@@ -10986,6 +11230,7 @@
           </w:tcPr>
           <w:p>
             <w:pPr>
+              <w:keepNext/>
               <w:spacing w:after="40" w:line="252"/>
               <w:jc w:val="left"/>
             </w:pPr>
@@ -11016,6 +11261,7 @@
           </w:tcPr>
           <w:p>
             <w:pPr>
+              <w:keepNext/>
               <w:spacing w:after="40" w:line="252"/>
               <w:jc w:val="left"/>
             </w:pPr>
@@ -11050,6 +11296,7 @@
           </w:tcPr>
           <w:p>
             <w:pPr>
+              <w:keepNext/>
               <w:spacing w:after="40" w:line="252"/>
               <w:jc w:val="left"/>
             </w:pPr>
@@ -11079,6 +11326,7 @@
           </w:tcPr>
           <w:p>
             <w:pPr>
+              <w:keepNext/>
               <w:spacing w:after="40" w:line="252"/>
               <w:jc w:val="left"/>
             </w:pPr>
@@ -11541,7 +11789,7 @@
       <w:r>
         <w:drawing>
           <wp:inline distT="0" distB="0" distL="0" distR="0">
-            <wp:extent cx="9144000" cy="2400300"/>
+            <wp:extent cx="9144000" cy="2400393"/>
             <wp:effectExtent t="0" r="0" b="0" l="0"/>
             <wp:docPr id="15" name="" descr="" title=""/>
             <wp:cNvGraphicFramePr>
@@ -11566,7 +11814,7 @@
                   <pic:spPr bwMode="auto">
                     <a:xfrm>
                       <a:off x="0" y="0"/>
-                      <a:ext cx="9144000" cy="2400300"/>
+                      <a:ext cx="9144000" cy="2400393"/>
                     </a:xfrm>
                     <a:prstGeom prst="rect">
                       <a:avLst/>
@@ -11817,7 +12065,7 @@
       <w:r>
         <w:drawing>
           <wp:inline distT="0" distB="0" distL="0" distR="0">
-            <wp:extent cx="9144000" cy="2705100"/>
+            <wp:extent cx="9144000" cy="2555528"/>
             <wp:effectExtent t="0" r="0" b="0" l="0"/>
             <wp:docPr id="19" name="" descr="" title=""/>
             <wp:cNvGraphicFramePr>
@@ -11842,7 +12090,7 @@
                   <pic:spPr bwMode="auto">
                     <a:xfrm>
                       <a:off x="0" y="0"/>
-                      <a:ext cx="9144000" cy="2705100"/>
+                      <a:ext cx="9144000" cy="2555528"/>
                     </a:xfrm>
                     <a:prstGeom prst="rect">
                       <a:avLst/>

</xml_diff>

<commit_message>
[T04 2026-10-05] fix: align SD6 with E-22 and address review findings
- SD6: storno after second unanswered reminder
- Doku: contributions worded as responsibilities, 39 findings in komplettcheck, SD6 image, outdated Word comments removed
- P10 description: one escalation, as modelled
- Status file, overview, roles and decision log updated

Co-Authored-By: Claude Opus 5.5 <noreply@anthropic.com>
Claude-Session: https://claude.ai/code/session_01H2bGsFaySUqsEjJ1PXuxUw
</commit_message>
<xml_diff>
--- a/doku/Projektdokumentation.docx
+++ b/doku/Projektdokumentation.docx
@@ -1264,7 +1264,6 @@
               <w:spacing w:after="40" w:line="252"/>
               <w:jc w:val="left"/>
             </w:pPr>
-            <w:commentRangeStart w:id="0"/>
             <w:r>
               <w:rPr>
                 <w:rFonts w:ascii="Calibri" w:cs="Calibri" w:eastAsia="Calibri" w:hAnsi="Calibri"/>
@@ -1275,13 +1274,6 @@
                 <w:szCs w:val="19"/>
               </w:rPr>
               <w:t xml:space="preserve">Sicherung der Repositories (Git, VP-Server), Termine, Abgabe-Check; SD2, SD4, SD5 und SD6 in Visual Paradigm</w:t>
-            </w:r>
-            <w:commentRangeEnd w:id="0"/>
-            <w:r>
-              <w:rPr>
-                <w:rStyle w:val="CommentReference"/>
-              </w:rPr>
-              <w:commentReference w:id="0"/>
             </w:r>
           </w:p>
         </w:tc>
@@ -1672,7 +1664,7 @@
           <w:sz w:val="22"/>
           <w:szCs w:val="22"/>
         </w:rPr>
-        <w:t>Die folgende Übersicht nennt, was die einzelnen Gruppenmitglieder erarbeitet haben. Grundlage sind die Aufgabenverteilungen der Gruppentermine vom 02.09. und 05.10.2026 und die Historie des Repositories.</w:t>
+        <w:t>Die folgende Übersicht nennt, was die einzelnen Gruppenmitglieder erarbeitet haben und wofür sie bis zur Abgabe verantwortlich sind. Grundlage sind die Aufgabenverteilungen der Gruppentermine vom 02.09. und 05.10.2026 und die Historie des Repositories.</w:t>
       </w:r>
     </w:p>
     <w:p>
@@ -1732,7 +1724,7 @@
           <w:sz w:val="22"/>
           <w:szCs w:val="22"/>
         </w:rPr>
-        <w:t>Prüfung der BPMN-Diagramme 03 und 04 in Sprint 1; Abgleich der Use Cases und Sequenzdiagramme mit den Prozessen (E-18); Überarbeitung der Prozesse 05 und 06 (E-20); Abgleich der Projektdokumentation mit dem Modellstand; Sequenzdiagramme SD2, SD4, SD5 und SD6 in Visual Paradigm; Folien 3 und 16.</w:t>
+        <w:t>Prüfung der BPMN-Diagramme 03 und 04 in Sprint 1; Abgleich der Use Cases und Sequenzdiagramme mit den Prozessen (E-18); Überarbeitung der Prozesse 05 und 06 (E-20); Abgleich der Projektdokumentation mit dem Modellstand; verantwortlich für die Sequenzdiagramme SD2, SD4, SD5 und SD6 in Visual Paradigm; Folien 3 und 16.</w:t>
       </w:r>
     </w:p>
     <w:p>
@@ -1792,7 +1784,7 @@
           <w:sz w:val="22"/>
           <w:szCs w:val="22"/>
         </w:rPr>
-        <w:t>Scrum Master mit Trello-Board und Sprint-Protokollen; Zusammenführung der beiden Entwürfe (E-10); Gesamtprüfungen vom 26.09. und 05.10.2026 (E-15, E-17); Use-Case- und Klassendiagramm sowie SD1 und SD3 in Visual Paradigm; Folien 12–14.</w:t>
+        <w:t>Scrum Master mit Trello-Board und Sprint-Protokollen; Zusammenführung der beiden Entwürfe (E-10); Gesamtprüfungen vom 26.09. und 05.10.2026 (E-15, E-17); Use-Case-Diagramm in Visual Paradigm, verantwortlich für Klassendiagramm sowie SD1 und SD3 in Visual Paradigm; Folien 12–14.</w:t>
       </w:r>
     </w:p>
     <w:p>
@@ -2277,7 +2269,6 @@
         <w:spacing w:after="120" w:line="276"/>
         <w:jc w:val="both"/>
       </w:pPr>
-      <w:commentRangeStart w:id="1"/>
       <w:r>
         <w:rPr>
           <w:rFonts w:ascii="Calibri" w:cs="Calibri" w:eastAsia="Calibri" w:hAnsi="Calibri"/>
@@ -2285,13 +2276,6 @@
           <w:szCs w:val="22"/>
         </w:rPr>
         <w:t xml:space="preserve">So funktioniert sie: Der Kunde lädt in der RepairFlow-App ein Foto des Schadens, ein Video oder eine Tonaufnahme hoch, etwa das Klackern eines E-Bike-Motors, und beschreibt die Symptome. RepairFlow legt mit Eingang der Anfrage eine Voranmeldung an. Der KI-Diagnosedienst erkennt Gerätetyp und wahrscheinliche Fehlerursache und nennt die vermutlich benötigten Ersatzteile. RepairFlow berechnet daraus einen vorläufigen Kostenvoranschlag, prüft die Teileverfügbarkeit in allen Filialen und schlägt Filiale und Termin vor. Bestätigt der Kunde den Vorschlag, wird die Voranmeldung als bestätigt markiert, und die benötigten Teile werden vorreserviert. Bei der Fehlerdiagnose in der Werkstatt werden die Daten übernommen, der Techniker prüft den Vorschlag und bestätigt oder korrigiert ihn. Unser Slogan dafür: KVA in 60 Sekunden.</w:t>
-      </w:r>
-      <w:commentRangeEnd w:id="1"/>
-      <w:r>
-        <w:rPr>
-          <w:rStyle w:val="CommentReference"/>
-        </w:rPr>
-        <w:commentReference w:id="1"/>
       </w:r>
     </w:p>
     <w:p>
@@ -3134,7 +3118,6 @@
         <w:spacing w:after="60" w:line="264"/>
         <w:keepLines/>
       </w:pPr>
-      <w:commentRangeStart w:id="2"/>
       <w:r>
         <w:rPr>
           <w:rFonts w:ascii="Calibri" w:cs="Calibri" w:eastAsia="Calibri" w:hAnsi="Calibri"/>
@@ -3152,13 +3135,6 @@
           <w:szCs w:val="22"/>
         </w:rPr>
         <w:t xml:space="preserve">als textuelle Quelle der UML-Diagramme im Verzeichnis uml/. Die PNGs werden aus der jeweils aktuellen .puml-Datei gerendert. Die frühere gemeinsame Modellgenerierung liegt seit dem Gruppenbeschluss E-21 in archiv/tools/ und wird nicht mehr zur Bearbeitung verwendet. Dokumentation und Folien werden direkt in Word und PowerPoint gepflegt.</w:t>
-      </w:r>
-      <w:commentRangeEnd w:id="2"/>
-      <w:r>
-        <w:rPr>
-          <w:rStyle w:val="CommentReference"/>
-        </w:rPr>
-        <w:commentReference w:id="2"/>
       </w:r>
     </w:p>
     <w:p>
@@ -3342,7 +3318,6 @@
         <w:spacing w:after="120" w:line="276"/>
         <w:jc w:val="both"/>
       </w:pPr>
-      <w:commentRangeStart w:id="3"/>
       <w:r>
         <w:rPr>
           <w:rFonts w:ascii="Calibri" w:cs="Calibri" w:eastAsia="Calibri" w:hAnsi="Calibri"/>
@@ -3350,13 +3325,6 @@
           <w:szCs w:val="22"/>
         </w:rPr>
         <w:t xml:space="preserve">Jedes Artefakt durchläuft eine Definition of Done: eigener Branch mit aktuellem main-Stand, Pull Request, Review durch eine zweite Person und Abnahme anhand der QA-Checkliste. Jakob übernimmt die Qualitätssicherung und den Merge; bei UML gehört außerdem der Commit auf dem VP-Teamwork-Server dazu. Die seit dem 05.10.2026 gültige Liste steht in doku/qa-checkliste.md. Frühere Rohdiagramme wurden mit dem Camunda-Regelsatz und bpmnlint geprüft; die Skripte und damaligen Protokolle liegen im Archiv. Diese Ergebnisse ersetzen keine Prüfung späterer Änderungen. Für den aktuellen Stand sind das Öffnen, Prüfen und Speichern aller zehn BPMN-Dateien im Camunda Modeler sowie der Abschluss in Visual Paradigm noch ausstehend.</w:t>
-      </w:r>
-      <w:commentRangeEnd w:id="3"/>
-      <w:r>
-        <w:rPr>
-          <w:rStyle w:val="CommentReference"/>
-        </w:rPr>
-        <w:commentReference w:id="3"/>
       </w:r>
     </w:p>
     <w:p>
@@ -3384,7 +3352,7 @@
           <w:sz w:val="22"/>
           <w:szCs w:val="22"/>
         </w:rPr>
-        <w:t>Bis zum 08.10.2026 gab es vier Prüfrunden. In Sprint 1 hat Jakob die Prozesse 09 und 10 strukturell geprüft, ohne Befund. Die Gesamtprüfung am 26.09.2026 (E-15) fand fachliche Fehler in den Prozessen 02, 05 und 06, Datenobjekte, deren Namen nicht zu den Klassen passten, und Sequenzbotschaften, die keine Operation der Empfängerklasse waren. Der Komplettcheck am 05.10.2026 (E-17) ergab 26 Befunde, zwölf zu BPMN und 14 zu UML. Typisch waren Warteschleifen ohne Ausstieg, abgelehnte Aufträge ohne Rückgabe des Geräts, fehlende Nachrichtenflüsse zwischen den Pools und vertauschte include- und extend-Beziehungen. Jakobs QA-Prüfung am selben Tag führte acht weitere Punkte (Q1 bis Q8). Fünf davon waren sofort erledigt; die übrigen drei und der verwandte Befund B12 betrafen Prozess 06, Prozess 10 und SD4 und wurden am 08.10.2026 umgesetzt (E-22). Daraus haben wir gelernt, dass jede Änderung an einem Prozess eine Prüfung der zugehörigen Use Cases und Sequenzdiagramme nach sich ziehen muss.</w:t>
+        <w:t>Bis zum 08.10.2026 gab es vier Prüfrunden. In Sprint 1 hat Jakob die Prozesse 09 und 10 strukturell geprüft, ohne Befund. Die Gesamtprüfung am 26.09.2026 (E-15) fand fachliche Fehler in den Prozessen 02, 05 und 06, Datenobjekte, deren Namen nicht zu den Klassen passten, und Sequenzbotschaften, die keine Operation der Empfängerklasse waren. Der Komplettcheck am 05.10.2026 (E-17) ergab 39 Befunde: zwölf zu BPMN, 14 zu UML, acht zu Dokumentation und Folien und fünf zu den Abgabepflichten. Typisch waren Warteschleifen ohne Ausstieg, abgelehnte Aufträge ohne Rückgabe des Geräts, fehlende Nachrichtenflüsse zwischen den Pools und vertauschte include- und extend-Beziehungen. Jakobs QA-Prüfung am selben Tag führte acht weitere Punkte (Q1 bis Q8). Fünf davon waren sofort erledigt; die übrigen drei und der verwandte Befund B12 betrafen Prozess 06, Prozess 10 und SD4 und wurden am 08.10.2026 umgesetzt (E-22). Daraus haben wir gelernt, dass jede Änderung an einem Prozess eine Prüfung der zugehörigen Use Cases und Sequenzdiagramme nach sich ziehen muss.</w:t>
       </w:r>
     </w:p>
     <w:p>
@@ -7418,7 +7386,6 @@
         <w:spacing w:after="120" w:line="276"/>
         <w:jc w:val="both"/>
       </w:pPr>
-      <w:commentRangeStart w:id="4"/>
       <w:r>
         <w:rPr>
           <w:rFonts w:ascii="Calibri" w:cs="Calibri" w:eastAsia="Calibri" w:hAnsi="Calibri"/>
@@ -7426,13 +7393,6 @@
           <w:szCs w:val="22"/>
         </w:rPr>
         <w:t>Insgesamt enthalten die zehn Werkstatt-Prozesse 131 Aktivitäten, im Durchschnitt 13,1 je Diagramm. Gezählt werden alle Task-Typen, Aufruf-Aktivitäten und der Mehrfach-Teilprozess einschließlich seiner enthaltenen Aktivitäten. Die Kundenabläufe kommen mit 26 weiteren Aktivitäten hinzu und sind in Tabelle 1 nicht mitgezählt. Dazu kommen 41 Nachrichtenflüsse sowie 48 Datenobjekt-Referenzen und zwölf Datenspeicherdefinitionen, zusammen 60; mehrere Referenzen auf denselben Speicher innerhalb eines Diagramms zählen dabei einmal. Jeder Prozess hat auf Prozessebene genau ein Start- und ein Endereignis.</w:t>
-      </w:r>
-      <w:commentRangeEnd w:id="4"/>
-      <w:r>
-        <w:rPr>
-          <w:rStyle w:val="CommentReference"/>
-        </w:rPr>
-        <w:commentReference w:id="4"/>
       </w:r>
     </w:p>
     <w:p>
@@ -8109,7 +8069,6 @@
         <w:spacing w:after="120" w:line="276"/>
         <w:jc w:val="both"/>
       </w:pPr>
-      <w:commentRangeStart w:id="5"/>
       <w:r>
         <w:rPr>
           <w:rFonts w:ascii="Calibri" w:cs="Calibri" w:eastAsia="Calibri" w:hAnsi="Calibri"/>
@@ -8128,20 +8087,12 @@
         </w:rPr>
         <w:t xml:space="preserve">Der Techniker entnimmt die reservierten Teile und arbeitet die Reparaturschritte mit Zeiterfassung ab. Bei einem Zusatzbefund entsteht ein Nachtrags-KVA. Nach Freigabe werden die zusätzlichen Teile über Prozess 05 disponiert und entnommen; Ablehnung oder drei Tage ohne Antwort führen zur Endkontrolle. Nach bestandener Endkontrolle setzt RepairFlow den Auftrag auf „fertig“. Bei Mängeln sind höchstens zwei Nacharbeiten vorgesehen; bleibt die zweite erfolglos, wird der Auftrag auf „abgelehnt“ gesetzt. Auch ein Nacharbeitsauftrag aus einer Reklamation (Prozess 09) läuft über diesen Prozess.</w:t>
       </w:r>
-      <w:commentRangeEnd w:id="5"/>
-      <w:r>
-        <w:rPr>
-          <w:rStyle w:val="CommentReference"/>
-        </w:rPr>
-        <w:commentReference w:id="5"/>
-      </w:r>
     </w:p>
     <w:p>
       <w:pPr>
         <w:spacing w:after="120" w:line="276"/>
         <w:jc w:val="both"/>
       </w:pPr>
-      <w:commentRangeStart w:id="6"/>
       <w:r>
         <w:rPr>
           <w:rFonts w:ascii="Calibri" w:cs="Calibri" w:eastAsia="Calibri" w:hAnsi="Calibri"/>
@@ -8159,13 +8110,6 @@
           <w:szCs w:val="22"/>
         </w:rPr>
         <w:t xml:space="preserve">Für ein abholbereites Gerät entsteht die Rechnung aus KVA und Arbeitszeiten oder bei abgelehnten Aufträgen über die Diagnosepauschale; kostenfreie Nacharbeit wird ohne Rechnung abgewickelt. RepairFlow benachrichtigt den Kunden und erinnert alle 14 Tage. Nach der dritten Erinnerung wird eine Lagergebühr aufgenommen; beim vierten Fristablauf wird die Verwertung des Geräts eingeleitet. Bei regulärer Abholung werden Zahlungsart und Zahlung erfasst beziehungsweise die Rechnung mit Zahlungsziel versandt, danach das Gerät übergeben und der Auftrag auf „abgeholt“ gesetzt. Offene Rechnungen werden alle 14 Tage gemahnt. Bleibt die dritte Mahnung erfolglos, geht die Forderung an Inkasso; andernfalls wird die Zahlung verbucht und an die Buchhaltung übergeben. Im regulären Abschluss folgt eine Bewertungsanfrage. Die Verwertungs- und Mahngrenzen aus E-19 sind noch durch die Gruppe zu bestätigen.</w:t>
-      </w:r>
-      <w:commentRangeEnd w:id="6"/>
-      <w:r>
-        <w:rPr>
-          <w:rStyle w:val="CommentReference"/>
-        </w:rPr>
-        <w:commentReference w:id="6"/>
       </w:r>
     </w:p>
     <w:p>
@@ -8369,7 +8313,6 @@
         <w:spacing w:after="120" w:line="276"/>
         <w:jc w:val="both"/>
       </w:pPr>
-      <w:commentRangeStart w:id="7"/>
       <w:r>
         <w:rPr>
           <w:rFonts w:ascii="Calibri" w:cs="Calibri" w:eastAsia="Calibri" w:hAnsi="Calibri"/>
@@ -8377,13 +8320,6 @@
           <w:szCs w:val="22"/>
         </w:rPr>
         <w:t xml:space="preserve">Die objektorientierte Analyse folgt der Reihenfolge aus der Vorlesung: Use-Case-Diagramm, Klassendiagramm, Interaktionsdiagramme zu ausgewählten Use Cases und ergänzend ein Zustandsdiagramm des Reparaturauftrags. Der aktuelle Git-Stand enthält PlantUML-Quellen, PNGs und uml/modell.xmi mit Klassen- und Use-Case-Modell. Diese Modelle werden in Visual Paradigm importiert; die sechs Sequenzdiagramme sind dort als Unterdiagramme der zugehörigen Use Cases anzulegen. UML-WWI25B4-Gruppe1.vpp ist noch zu erstellen und in uml/ zu sichern.</w:t>
-      </w:r>
-      <w:commentRangeEnd w:id="7"/>
-      <w:r>
-        <w:rPr>
-          <w:rStyle w:val="CommentReference"/>
-        </w:rPr>
-        <w:commentReference w:id="7"/>
       </w:r>
     </w:p>
     <w:p>
@@ -8465,7 +8401,6 @@
         <w:spacing w:after="200" w:before="60"/>
         <w:jc w:val="center"/>
       </w:pPr>
-      <w:commentRangeStart w:id="10"/>
       <w:r>
         <w:rPr>
           <w:rFonts w:ascii="Calibri" w:cs="Calibri" w:eastAsia="Calibri" w:hAnsi="Calibri"/>
@@ -8476,13 +8411,6 @@
           <w:szCs w:val="18"/>
         </w:rPr>
         <w:t xml:space="preserve">Abbildung 3: Use-Case-Diagramm RepairFlow</w:t>
-      </w:r>
-      <w:commentRangeEnd w:id="10"/>
-      <w:r>
-        <w:rPr>
-          <w:rStyle w:val="CommentReference"/>
-        </w:rPr>
-        <w:commentReference w:id="10"/>
       </w:r>
     </w:p>
     <w:p>
@@ -9080,7 +9008,6 @@
         <w:spacing w:after="120" w:line="276"/>
         <w:jc w:val="both"/>
       </w:pPr>
-      <w:commentRangeStart w:id="8"/>
       <w:r>
         <w:rPr>
           <w:rFonts w:ascii="Calibri" w:cs="Calibri" w:eastAsia="Calibri" w:hAnsi="Calibri"/>
@@ -9089,7 +9016,6 @@
         </w:rPr>
         <w:t>SD4 knüpft die Fertigmeldung an abgeschlossene Reparaturschritte und eine bestandene Endkontrolle. Der Verweis auf UC13 umfasst Schritte, Arbeitszeiten und einen möglichen Nachtrags-KVA: Nach der Freigabe werden die zusätzlichen Teile über UC09 (Prozess 05) disponiert, Ablehnung oder drei Tage ohne Antwort führen zur Endkontrolle. Die Schleife erlaubt höchstens zwei Nacharbeiten; bleibt auch die zweite erfolglos, wechselt der Reparaturauftrag in den Status „abgelehnt“. Abholbenachrichtigung, Rückgabe und Rechnung gehören zu UC15 in Prozess 08.</w:t>
       </w:r>
-      <w:commentRangeEnd w:id="8"/>
     </w:p>
     <w:p>
       <w:pPr>
@@ -9178,7 +9104,7 @@
       <w:r>
         <w:drawing>
           <wp:inline distT="0" distB="0" distL="0" distR="0">
-            <wp:extent cx="3381375" cy="4572000"/>
+            <wp:extent cx="3381375" cy="4908616"/>
             <wp:effectExtent t="0" r="0" b="0" l="0"/>
             <wp:docPr id="9" name="" descr="" title=""/>
             <wp:cNvGraphicFramePr>
@@ -9203,7 +9129,7 @@
                   <pic:spPr bwMode="auto">
                     <a:xfrm>
                       <a:off x="0" y="0"/>
-                      <a:ext cx="3381375" cy="4572000"/>
+                      <a:ext cx="3381375" cy="4908616"/>
                     </a:xfrm>
                     <a:prstGeom prst="rect">
                       <a:avLst/>
@@ -11046,7 +10972,6 @@
         <w:spacing w:after="120" w:line="276"/>
         <w:jc w:val="both"/>
       </w:pPr>
-      <w:commentRangeStart w:id="9"/>
       <w:r>
         <w:rPr>
           <w:rFonts w:ascii="Calibri" w:cs="Calibri" w:eastAsia="Calibri" w:hAnsi="Calibri"/>
@@ -11054,13 +10979,6 @@
           <w:szCs w:val="22"/>
         </w:rPr>
         <w:t xml:space="preserve">Zur Abgabe wird das vollständige Archiv Fallstudie-WWI25B4-Gruppe1.zip zusammengestellt. Vorgesehen sind:</w:t>
-      </w:r>
-      <w:commentRangeEnd w:id="9"/>
-      <w:r>
-        <w:rPr>
-          <w:rStyle w:val="CommentReference"/>
-        </w:rPr>
-        <w:commentReference w:id="9"/>
       </w:r>
     </w:p>
     <w:tbl>
@@ -12212,88 +12130,6 @@
     </w:sectPr>
   </w:body>
 </w:document>
-</file>
-
-<file path=word/comments.xml><?xml version="1.0" encoding="utf-8"?>
-<w:comments xmlns:w="http://schemas.openxmlformats.org/wordprocessingml/2006/main">
-  <w:comment w:id="0" w:author="David Leismann" w:initials="DL" w:date="2026-10-05T10:03:10Z">
-    <w:p>
-      <w:r>
-        <w:t>Zuständigkeit laut doku/protokolle/2026-10-05-gruppentermin.md: David SD2/SD4/SD5/SD6, Kilian SD1/SD3. Dies ist die Aufgabenverteilung, kein Nachweis tatsächlicher Einzelbeiträge; der gelbe Platzhalter bleibt bestehen.</w:t>
-      </w:r>
-    </w:p>
-  </w:comment>
-  <w:comment w:id="1" w:author="David Leismann" w:initials="DL" w:date="2026-10-05T10:03:10Z">
-    <w:p>
-      <w:r>
-        <w:t>Mit P01 und SD1 abgeglichen: Die Voranmeldung wird bei Eingang der Anfrage angelegt; bei Annahme des Vorschlags wird sie bestätigt.</w:t>
-      </w:r>
-    </w:p>
-  </w:comment>
-  <w:comment w:id="2" w:author="David Leismann" w:initials="DL" w:date="2026-10-05T10:03:10Z">
-    <w:p>
-      <w:r>
-        <w:t>E-21: Aktive .bpmn/.puml-Dateien direkt bearbeiten, Generatoren nur im Archiv; Office-Dateien direkt pflegen.</w:t>
-      </w:r>
-    </w:p>
-  </w:comment>
-  <w:comment w:id="3" w:author="David Leismann" w:initials="DL" w:date="2026-10-05T10:03:10Z">
-    <w:p>
-      <w:r>
-        <w:t>Abgleich mit main cc329e1 vom 05.10.2026. QA-Checkliste ist seit 05.10. gültig. Historische Linter-Ergebnisse sind keine Bestätigung für spätere Modelländerungen; Camunda-/VP-Abschluss bleibt offen.</w:t>
-      </w:r>
-    </w:p>
-  </w:comment>
-  <w:comment w:id="4" w:author="David Leismann" w:initials="DL" w:date="2026-10-05T10:03:10Z">
-    <w:p>
-      <w:r>
-        <w:t>Aktuelle BPMN-XML nachgezählt: 131 Werkstatt-Aktivitäten, 79 automatisiert, 33 User Tasks, 9 Manual Tasks, 9 Call Activities, 1 Subprozess; 26 Kundenaktivitäten, 40 Nachrichtenflüsse, 48 Datenobjekt-Referenzen und 12 Datenspeicherdefinitionen.</w:t>
-      </w:r>
-    </w:p>
-  </w:comment>
-  <w:comment w:id="5" w:author="David Leismann" w:initials="DL" w:date="2026-10-05T10:03:10Z">
-    <w:p>
-      <w:r>
-        <w:t>Quelle: P07 GW07_Grenze / T07_Abbruch / T07_Teile (E-19). Der Text beschreibt die aktuelle BPMN-Fassung; die fehlenden Ergänzungen in SD4 sind im Abschnitt zum Sequenzdiagramm und in 5.4 ausdrücklich offengelegt.</w:t>
-      </w:r>
-    </w:p>
-  </w:comment>
-  <w:comment w:id="6" w:author="David Leismann" w:initials="DL" w:date="2026-10-05T10:03:10Z">
-    <w:p>
-      <w:r>
-        <w:t>Quelle: P08 GW08_Dritte / T08_Verwertung / GW08_Mahnstufe / T08_Inkasso (E-19). Die Gruppenbestätigung der Grenzwerte und ein möglicher Status für verwertete Geräte stehen noch aus.</w:t>
-      </w:r>
-    </w:p>
-  </w:comment>
-  <w:comment w:id="7" w:author="David Leismann" w:initials="DL" w:date="2026-10-05T10:03:10Z">
-    <w:p>
-      <w:r>
-        <w:t>uml/modell.xmi enthält Klassen und Use Cases, keine sechs Sequenzdiagramme. Im aktuellen Git-Stand gibt es keine .vpp; deren Fertigstellung ist weiterhin Aufgabe von Kilian und David.</w:t>
-      </w:r>
-    </w:p>
-  </w:comment>
-  <w:comment w:id="8" w:author="David Leismann" w:initials="DL" w:date="2026-10-05T10:03:10Z">
-    <w:p>
-      <w:r>
-        <w:t>Offene QA-Befunde Q2/Q3: SD4 wurde in diesem Dokumentationsabgleich nicht verändert. Die Doku nennt die tatsächliche Abweichung zu P07, statt einen abgeschlossenen Modellabgleich zu behaupten.</w:t>
-      </w:r>
-    </w:p>
-  </w:comment>
-  <w:comment w:id="9" w:author="David Leismann" w:initials="DL" w:date="2026-10-05T10:03:10Z">
-    <w:p>
-      <w:r>
-        <w:t>E-21 und abgabe/README.md: BPMN-ZIP zur Abgabe von Hand packen. Das Abgabe-Archiv und die finale VPP-Datei werden hier als vorgesehen beschrieben.</w:t>
-      </w:r>
-    </w:p>
-  </w:comment>
-  <w:comment w:id="10" w:author="David Leismann" w:initials="DL" w:date="2026-10-05T10:03:10Z">
-    <w:p>
-      <w:r>
-        <w:t>Das PNG auf main war oben abgeschnitten. Aus der unveränderten usecase.puml mit PlantUML 1.2026.8 vollständig neu exportiert und proportional eingebettet. Alle acht Akteure und 19 Use Cases sind enthalten; die aktualisierte PNG-Datei wird zusammen mit der Doku im Repository abgelegt.</w:t>
-      </w:r>
-    </w:p>
-  </w:comment>
-</w:comments>
 </file>
 
 <file path=word/endnotes.xml><?xml version="1.0" encoding="utf-8"?>

</xml_diff>

<commit_message>
[T04 2026-10-05] docs: language pass on documentation, strip file metadata
- 58 paragraphs reworded (shorter sentences, fewer semicolon chains); facts, numbers and IDs unchanged, checked by script and a second review
- docx/pptx: PNG text chunks and personal docProps scrubbed, author set to group
- status file quotes aligned with new wording

Co-Authored-By: Claude Opus 5.5 <noreply@anthropic.com>
Claude-Session: https://claude.ai/code/session_01H2bGsFaySUqsEjJ1PXuxUw
</commit_message>
<xml_diff>
--- a/doku/Projektdokumentation.docx
+++ b/doku/Projektdokumentation.docx
@@ -976,7 +976,7 @@
           <w:sz w:val="22"/>
           <w:szCs w:val="22"/>
         </w:rPr>
-        <w:t xml:space="preserve">Die Fallstudie wird von sechs Studierenden des Kurses WWI25B4 bearbeitet. Das Team hat sich zu Beginn des Semesters konstituiert und die Zuständigkeiten nach dem Scrum-Vorgehensmodell verteilt (Kapitel 4): Jedes Artefakt hat eine verantwortliche Person, die Projektleitung plant und koordiniert, und Reviews erfolgen durch eine zweite Person nach dem Vier-Augen-Prinzip.</w:t>
+        <w:t>Die Fallstudie wird von sechs Studierenden des Kurses WWI25B4 bearbeitet. Das Team hat sich zu Beginn des Semesters konstituiert und die Zuständigkeiten nach dem Scrum-Vorgehensmodell verteilt (Kapitel 4). Jedes Artefakt hat eine verantwortliche Person. Die Projektleitung plant und koordiniert, Reviews übernimmt nach dem Vier-Augen-Prinzip eine zweite Person.</w:t>
       </w:r>
     </w:p>
     <w:tbl>
@@ -1784,7 +1784,7 @@
           <w:sz w:val="22"/>
           <w:szCs w:val="22"/>
         </w:rPr>
-        <w:t>Scrum Master mit Trello-Board und Sprint-Protokollen; Zusammenführung der beiden Entwürfe (E-10); Gesamtprüfungen vom 26.09. und 05.10.2026 (E-15, E-17); Use-Case-Diagramm in Visual Paradigm, verantwortlich für Klassendiagramm sowie SD1 und SD3 in Visual Paradigm; Folien 12–14.</w:t>
+        <w:t>Scrum Master mit Trello-Board und Sprint-Protokollen; Zusammenführung der beiden Entwürfe (E-10); Gesamtprüfungen vom 26.09. und 05.10.2026 (E-15, E-17); Use-Case-Diagramm in Visual Paradigm; verantwortlich für Klassendiagramm sowie SD1 und SD3 in Visual Paradigm; Folien 12–14.</w:t>
       </w:r>
     </w:p>
     <w:p>
@@ -2038,7 +2038,7 @@
           <w:sz w:val="22"/>
           <w:szCs w:val="22"/>
         </w:rPr>
-        <w:t xml:space="preserve">RepairFlow soll Fahrrad-, E-Bike- und Elektronikreparaturen in einer gemeinsamen Plattform abbilden. Unser Konzept verbindet ein gemeinsames Ersatzteillager mit filialübergreifender Disposition: Bestände, Reservierungen und Umlagerungen werden über alle Standorte berücksichtigt. Als weiteres Merkmal liefert die KI-Sofortdiagnose dem Kunden einen Diagnosevorschlag mit vorläufigem Kostenvoranschlag, bevor er die Werkstatt betritt (Abschnitt 2.6). Diese Merkmale beschreiben den Zuschnitt unseres Entwurfs; ein belegter Funktionsvergleich mit bestehenden Werkstattlösungen liegt der Dokumentation nicht zugrunde.</w:t>
+        <w:t>RepairFlow soll Fahrrad-, E-Bike- und Elektronikreparaturen in einer gemeinsamen Plattform abbilden. Unser Konzept verbindet ein gemeinsames Ersatzteillager mit filialübergreifender Disposition: Bestände, Reservierungen und Umlagerungen werden über alle Standorte berücksichtigt. Als weiteres Merkmal liefert die KI-Sofortdiagnose dem Kunden einen Diagnosevorschlag mit vorläufigem Kostenvoranschlag, bevor er die Werkstatt betritt (Abschnitt 2.6). Diese Merkmale beschreiben den Zuschnitt unseres Entwurfs. Ein belegter Funktionsvergleich mit bestehenden Werkstattlösungen liegt der Dokumentation nicht zugrunde.</w:t>
       </w:r>
     </w:p>
     <w:p>
@@ -2143,7 +2143,7 @@
           <w:sz w:val="22"/>
           <w:szCs w:val="22"/>
         </w:rPr>
-        <w:t xml:space="preserve">Bewusst außerhalb der Systemgrenze liegen die physische Reparatur selbst, die Systeme der Lieferanten und die Buchhaltung. An die Buchhaltung wird nur über eine Exportschnittstelle übergeben. Diese Abgrenzung ist die Grundlage für das Use-Case-Diagramm in Abschnitt 5.3.</w:t>
+        <w:t>Die physische Reparatur selbst, die Systeme der Lieferanten und die Buchhaltung haben wir bewusst außerhalb der Systemgrenze gelassen. An die Buchhaltung wird nur über eine Exportschnittstelle übergeben. Diese Abgrenzung ist die Grundlage für das Use-Case-Diagramm in Abschnitt 5.3.</w:t>
       </w:r>
     </w:p>
     <w:p>
@@ -2170,7 +2170,7 @@
           <w:sz w:val="22"/>
           <w:szCs w:val="22"/>
         </w:rPr>
-        <w:t xml:space="preserve">Kern der Plattform ist der Reparaturauftrag. Alle Modelle verwenden die Zustände angenommen, in Diagnose, KVA offen, freigegeben, abgelehnt, Teile bestellt, in Reparatur, fertig und abgeholt. Je nach Ablauf werden einzelne Zustände übersprungen: Ohne Fehlteile entfällt „Teile bestellt“, ein Nacharbeitsauftrag beginnt ohne erneute Diagnose und KVA. Seit E-19 kann eine erfolglose zweite Nacharbeit aus „in Reparatur“ nach „abgelehnt“ führen. Das Klassendiagramm hält die Werte im Attribut status mit der Aufzählung AuftragStatus; Abbildung 2 zeigt die möglichen Übergänge.</w:t>
+        <w:t>Kern der Plattform ist der Reparaturauftrag. Alle Modelle verwenden die Zustände angenommen, in Diagnose, KVA offen, freigegeben, abgelehnt, Teile bestellt, in Reparatur, fertig und abgeholt. Je nach Ablauf werden einzelne Zustände übersprungen: Ohne Fehlteile entfällt „Teile bestellt“, ein Nacharbeitsauftrag beginnt ohne erneute Diagnose und KVA. Seit E-19 kann eine erfolglose zweite Nacharbeit aus „in Reparatur“ nach „abgelehnt“ führen. Das Klassendiagramm hält die Werte im Attribut status mit der Aufzählung AuftragStatus. Abbildung 2 zeigt die möglichen Übergänge.</w:t>
       </w:r>
     </w:p>
     <w:p>
@@ -2275,7 +2275,7 @@
           <w:sz w:val="22"/>
           <w:szCs w:val="22"/>
         </w:rPr>
-        <w:t xml:space="preserve">So funktioniert sie: Der Kunde lädt in der RepairFlow-App ein Foto des Schadens, ein Video oder eine Tonaufnahme hoch, etwa das Klackern eines E-Bike-Motors, und beschreibt die Symptome. RepairFlow legt mit Eingang der Anfrage eine Voranmeldung an. Der KI-Diagnosedienst erkennt Gerätetyp und wahrscheinliche Fehlerursache und nennt die vermutlich benötigten Ersatzteile. RepairFlow berechnet daraus einen vorläufigen Kostenvoranschlag, prüft die Teileverfügbarkeit in allen Filialen und schlägt Filiale und Termin vor. Bestätigt der Kunde den Vorschlag, wird die Voranmeldung als bestätigt markiert, und die benötigten Teile werden vorreserviert. Bei der Fehlerdiagnose in der Werkstatt werden die Daten übernommen, der Techniker prüft den Vorschlag und bestätigt oder korrigiert ihn. Unser Slogan dafür: KVA in 60 Sekunden.</w:t>
+        <w:t>In der RepairFlow-App lädt der Kunde ein Foto des Schadens, ein Video oder eine Tonaufnahme hoch, etwa das Klackern eines E-Bike-Motors, und beschreibt die Symptome. RepairFlow legt mit Eingang der Anfrage eine Voranmeldung an. Der KI-Diagnosedienst erkennt Gerätetyp und wahrscheinliche Fehlerursache und nennt die vermutlich benötigten Ersatzteile. RepairFlow berechnet daraus einen vorläufigen Kostenvoranschlag, prüft die Teileverfügbarkeit in allen Filialen und schlägt Filiale und Termin vor. Bestätigt der Kunde den Vorschlag, wird die Voranmeldung als bestätigt markiert und die benötigten Teile werden vorreserviert. Die Fehlerdiagnose in der Werkstatt übernimmt diese Daten. Der Techniker prüft den Vorschlag und bestätigt oder korrigiert ihn. Unser Slogan dafür: KVA in 60 Sekunden.</w:t>
       </w:r>
     </w:p>
     <w:p>
@@ -2289,7 +2289,7 @@
           <w:sz w:val="22"/>
           <w:szCs w:val="22"/>
         </w:rPr>
-        <w:t xml:space="preserve">Technisch ist ein Teil davon heute machbar, etwa die Erkennung sichtbarer Schäden wie eines gebrochenen Displays oder einer abgerissenen Kette per Bildanalyse. Die Auswertung von Motorgeräuschen oder die Schätzung von Arbeitszeiten aus einem Video sind dagegen Vision. Deshalb bleibt der Vorschlag im Modell ausdrücklich unverbindlich: Der Kostenvoranschlag trägt den Status „vorläufig", der Techniker muss ihn bestätigen, und bei nicht auswertbaren Medien fragt das System nach einer besseren Aufnahme. Für die spätere Umsetzung ist als Anforderung vorgesehen, Medien nur mit Einwilligung des Kunden zu verarbeiten und nach Abschluss des Auftrags zu löschen.</w:t>
+        <w:t>Technisch ist ein Teil davon heute machbar, etwa die Erkennung sichtbarer Schäden wie eines gebrochenen Displays oder einer abgerissenen Kette per Bildanalyse. Die Auswertung von Motorgeräuschen oder die Schätzung von Arbeitszeiten aus einem Video sind dagegen Vision. Deshalb bleibt der Vorschlag im Modell ausdrücklich unverbindlich. Der Kostenvoranschlag trägt den Status „vorläufig" und muss vom Techniker bestätigt werden. Sind die Medien nicht auswertbar, fragt das System nach einer besseren Aufnahme. Für die spätere Umsetzung ist als Anforderung vorgesehen, Medien nur mit Einwilligung des Kunden zu verarbeiten und nach Abschluss des Auftrags zu löschen.</w:t>
       </w:r>
     </w:p>
     <w:p>
@@ -3048,7 +3048,7 @@
           <w:sz w:val="22"/>
           <w:szCs w:val="22"/>
         </w:rPr>
-        <w:t xml:space="preserve">für die BPMN-Kollaborationsdiagramme. Die Modelle enthalten Task-Definitionen für automatisierte Aktivitäten, Message-Subscriptions, ISO-Dauern für Timer und FEEL-Bedingungen. Verbindliche Quelle sind die .bpmn-Dateien; nach einer Änderung wird das PNG neu exportiert. Die abschließende Prüfung aller zehn Dateien im Modeler ist noch offen.</w:t>
+        <w:t>für die BPMN-Kollaborationsdiagramme. Die Modelle enthalten Task-Definitionen für automatisierte Aktivitäten, Message-Subscriptions, ISO-Dauern für Timer und FEEL-Bedingungen. Verbindliche Quelle sind die .bpmn-Dateien. Nach einer Änderung wird das PNG neu exportiert. Die abschließende Prüfung aller zehn Dateien im Modeler ist noch offen.</w:t>
       </w:r>
     </w:p>
     <w:p>
@@ -3077,7 +3077,7 @@
           <w:sz w:val="22"/>
           <w:szCs w:val="22"/>
         </w:rPr>
-        <w:t xml:space="preserve">für das finale UML-Projekt, mit dem DHBW-Teamwork-Server WWI25B4G1 als Zielrepository. Die XMI-Datei enthält das Klassen- und Use-Case-Modell für den Import. Sequenzdiagramme werden in Visual Paradigm als Unterdiagramme der jeweiligen Use Cases angelegt; die abzugebende VPP-Datei liegt noch nicht vor.</w:t>
+        <w:t>für das finale UML-Projekt, mit dem DHBW-Teamwork-Server WWI25B4G1 als Zielrepository. Die XMI-Datei enthält das Klassen- und Use-Case-Modell für den Import. Sequenzdiagramme werden in Visual Paradigm als Unterdiagramme der jeweiligen Use Cases angelegt. Die abzugebende VPP-Datei liegt noch nicht vor.</w:t>
       </w:r>
     </w:p>
     <w:p>
@@ -3243,7 +3243,7 @@
           <w:sz w:val="22"/>
           <w:szCs w:val="22"/>
         </w:rPr>
-        <w:t xml:space="preserve">Je Diagramm gibt es auf Prozessebene ein Start- und ein Endereignis (eingebettete Teilprozesse haben ihr eigenes); alternative Ausgänge werden vor dem Ende zusammengeführt.</w:t>
+        <w:t>Je Diagramm gibt es auf Prozessebene ein Start- und ein Endereignis (eingebettete Teilprozesse haben ihr eigenes). Alternative Ausgänge werden vor dem Ende zusammengeführt.</w:t>
       </w:r>
     </w:p>
     <w:p>
@@ -3261,7 +3261,7 @@
           <w:sz w:val="22"/>
           <w:szCs w:val="22"/>
         </w:rPr>
-        <w:t xml:space="preserve">Die Rollen Kunde, Servicemitarbeiter, Techniker, Disponent und Werkstattleiter sind in BPMN Pool beziehungsweise Lanes (Kunde, Service / Annahme, Techniker, Ersatzteil-Disposition, Werkstattleitung), im Use-Case-Diagramm und in den Sequenzdiagrammen Akteure und im Klassendiagramm Unterklassen von Person beziehungsweise Mitarbeiter.</w:t>
+        <w:t>Die Rollen Kunde, Servicemitarbeiter, Techniker, Disponent und Werkstattleiter sind in BPMN Pool beziehungsweise Lanes (Kunde, Service / Annahme, Techniker, Ersatzteil-Disposition, Werkstattleitung). Im Use-Case-Diagramm und in den Sequenzdiagrammen sind sie Akteure, im Klassendiagramm Unterklassen von Person beziehungsweise Mitarbeiter.</w:t>
       </w:r>
     </w:p>
     <w:p>
@@ -3297,7 +3297,7 @@
           <w:sz w:val="22"/>
           <w:szCs w:val="22"/>
         </w:rPr>
-        <w:t xml:space="preserve">Dateien im Repository tragen keine Umlaute und keinen Projekt-Präfix; Diagrammquelle (.puml, .bpmn) und Bild (.png) haben denselben Basisnamen, und ein Bild wird nie ohne seine Quelle ausgetauscht.</w:t>
+        <w:t>Dateien im Repository tragen keine Umlaute und keinen Projekt-Präfix. Diagrammquelle (.puml, .bpmn) und Bild (.png) haben denselben Basisnamen, und ein Bild wird nie ohne seine Quelle ausgetauscht.</w:t>
       </w:r>
     </w:p>
     <w:p>
@@ -3324,7 +3324,7 @@
           <w:sz w:val="22"/>
           <w:szCs w:val="22"/>
         </w:rPr>
-        <w:t xml:space="preserve">Jedes Artefakt durchläuft eine Definition of Done: eigener Branch mit aktuellem main-Stand, Pull Request, Review durch eine zweite Person und Abnahme anhand der QA-Checkliste. Jakob übernimmt die Qualitätssicherung und den Merge; bei UML gehört außerdem der Commit auf dem VP-Teamwork-Server dazu. Die seit dem 05.10.2026 gültige Liste steht in doku/qa-checkliste.md. Frühere Rohdiagramme wurden mit dem Camunda-Regelsatz und bpmnlint geprüft; die Skripte und damaligen Protokolle liegen im Archiv. Diese Ergebnisse ersetzen keine Prüfung späterer Änderungen. Für den aktuellen Stand sind das Öffnen, Prüfen und Speichern aller zehn BPMN-Dateien im Camunda Modeler sowie der Abschluss in Visual Paradigm noch ausstehend.</w:t>
+        <w:t>Jedes Artefakt durchläuft eine Definition of Done: eigener Branch mit aktuellem main-Stand, Pull Request, Review durch eine zweite Person und Abnahme anhand der QA-Checkliste. Jakob übernimmt die Qualitätssicherung und den Merge, bei UML gehört außerdem der Commit auf dem VP-Teamwork-Server dazu. Die seit dem 05.10.2026 gültige Liste steht in doku/qa-checkliste.md. Frühere Rohdiagramme wurden mit dem Camunda-Regelsatz und bpmnlint geprüft. Die Skripte und damaligen Protokolle liegen im Archiv. Diese Ergebnisse ersetzen keine Prüfung späterer Änderungen. Für den aktuellen Stand stehen das Öffnen, Prüfen und Speichern aller zehn BPMN-Dateien im Camunda Modeler sowie der Abschluss in Visual Paradigm noch aus.</w:t>
       </w:r>
     </w:p>
     <w:p>
@@ -3338,7 +3338,7 @@
           <w:sz w:val="22"/>
           <w:szCs w:val="22"/>
         </w:rPr>
-        <w:t xml:space="preserve">Für die UML-Modelle gilt die Konsistenzregel „Botschaft = Operation der Klasse": Jede Lebenslinie eines Sequenzdiagramms ist eine Klasse oder ein Akteur des Klassen- beziehungsweise Use-Case-Diagramms, jede Botschaft eine dort definierte Operation. Die Prüfung erfolgt beim Review. Noch offene Abweichungen werden in Abschnitt 5.4 benannt; Kapitel 6 beschreibt die bisherigen Korrekturen.</w:t>
+        <w:t>Für die UML-Modelle gilt die Konsistenzregel „Botschaft = Operation der Klasse": Jede Lebenslinie eines Sequenzdiagramms ist eine Klasse oder ein Akteur des Klassen- beziehungsweise Use-Case-Diagramms, jede Botschaft eine dort definierte Operation. Geprüft wird das beim Review. Abschnitt 5.4 nennt die noch offenen Abweichungen, Kapitel 6 beschreibt die bisherigen Korrekturen.</w:t>
       </w:r>
     </w:p>
     <w:p>
@@ -3352,7 +3352,7 @@
           <w:sz w:val="22"/>
           <w:szCs w:val="22"/>
         </w:rPr>
-        <w:t>Bis zum 08.10.2026 gab es vier Prüfrunden. In Sprint 1 hat Jakob die Prozesse 09 und 10 strukturell geprüft, ohne Befund. Die Gesamtprüfung am 26.09.2026 (E-15) fand fachliche Fehler in den Prozessen 02, 05 und 06, Datenobjekte, deren Namen nicht zu den Klassen passten, und Sequenzbotschaften, die keine Operation der Empfängerklasse waren. Der Komplettcheck am 05.10.2026 (E-17) ergab 39 Befunde: zwölf zu BPMN, 14 zu UML, acht zu Dokumentation und Folien und fünf zu den Abgabepflichten. Typisch waren Warteschleifen ohne Ausstieg, abgelehnte Aufträge ohne Rückgabe des Geräts, fehlende Nachrichtenflüsse zwischen den Pools und vertauschte include- und extend-Beziehungen. Jakobs QA-Prüfung am selben Tag führte acht weitere Punkte (Q1 bis Q8). Fünf davon waren sofort erledigt; die übrigen drei und der verwandte Befund B12 betrafen Prozess 06, Prozess 10 und SD4 und wurden am 08.10.2026 umgesetzt (E-22). Daraus haben wir gelernt, dass jede Änderung an einem Prozess eine Prüfung der zugehörigen Use Cases und Sequenzdiagramme nach sich ziehen muss.</w:t>
+        <w:t>Bis zum 08.10.2026 gab es vier Prüfrunden. In Sprint 1 hat Jakob die Prozesse 09 und 10 strukturell geprüft, ohne Befund. Die Gesamtprüfung am 26.09.2026 (E-15) fand fachliche Fehler in den Prozessen 02, 05 und 06, Datenobjekte, deren Namen nicht zu den Klassen passten, und Sequenzbotschaften, die keine Operation der Empfängerklasse waren. Der Komplettcheck am 05.10.2026 (E-17) ergab 39 Befunde: zwölf zu BPMN, 14 zu UML, acht zu Dokumentation und Folien und fünf zu den Abgabepflichten. Typisch waren Warteschleifen ohne Ausstieg, abgelehnte Aufträge ohne Rückgabe des Geräts, fehlende Nachrichtenflüsse zwischen den Pools und vertauschte include- und extend-Beziehungen. Jakobs QA-Prüfung am selben Tag führte acht weitere Punkte (Q1 bis Q8). Fünf davon waren sofort erledigt. Die übrigen drei und der verwandte Befund B12 betrafen Prozess 06, Prozess 10 und SD4 und wurden am 08.10.2026 umgesetzt (E-22). Daraus haben wir gelernt: Ändert sich ein Prozess, müssen auch die zugehörigen Use Cases und Sequenzdiagramme geprüft werden.</w:t>
       </w:r>
     </w:p>
     <w:p>
@@ -3392,7 +3392,7 @@
           <w:sz w:val="22"/>
           <w:szCs w:val="22"/>
         </w:rPr>
-        <w:t xml:space="preserve">Das Projekt ist nach Scrum organisiert (Vorlesung Kapitel 2): Der Product Owner priorisiert den Product Backlog und nimmt Ergebnisse im Sprint Review ab, der Scrum Master moderiert die Rituale und pflegt das Board, das Projektteam bearbeitet den Sprint Backlog, wobei jede Aufgabe genau einer Person zugeordnet ist. Abweichend vom reinen Scrum gibt es, wie in der Aufgabenstellung vorgesehen, eine Projektleitung, die Planung und Termine koordiniert.</w:t>
+        <w:t>Das Projekt ist nach Scrum organisiert (Vorlesung Kapitel 2). Der Product Owner priorisiert den Product Backlog und nimmt Ergebnisse im Sprint Review ab. Die Rituale moderiert der Scrum Master, der auch das Board pflegt. Das Projektteam bearbeitet den Sprint Backlog, wobei jede Aufgabe genau einer Person zugeordnet ist. Abweichend vom reinen Scrum gibt es, wie in der Aufgabenstellung vorgesehen, eine Projektleitung, die Planung und Termine koordiniert.</w:t>
       </w:r>
     </w:p>
     <w:p>
@@ -3406,7 +3406,7 @@
           <w:sz w:val="22"/>
           <w:szCs w:val="22"/>
         </w:rPr>
-        <w:t xml:space="preserve">Als Sprint-Takt dienen die Gruppentermine in Präsenz (jeweils 4:15 Stunden): Für jeden Termin sind Sprint Review und Retrospektive des vorangegangenen Sprints sowie das Sprint Planning des nächsten vorgesehen; das Feedback des Dozenten aus dem Coaching wird direkt im Planning eingeplant. Zwischen den Terminen arbeiten wir asynchron: Abstimmungen laufen über eine WhatsApp-Gruppe, Dateien teilen wir ausschließlich über das GitHub-Repository.</w:t>
+        <w:t>Den Sprint-Takt geben die Gruppentermine in Präsenz vor (jeweils 4:15 Stunden). Für jeden Termin sind Sprint Review und Retrospektive des vorangegangenen Sprints sowie das Sprint Planning des nächsten vorgesehen. Das Feedback des Dozenten aus dem Coaching planen wir direkt im Planning ein. Zwischen den Terminen arbeiten wir asynchron. Abstimmungen laufen über eine WhatsApp-Gruppe, Dateien teilen wir ausschließlich über das GitHub-Repository.</w:t>
       </w:r>
     </w:p>
     <w:p>
@@ -4222,7 +4222,7 @@
           <w:sz w:val="22"/>
           <w:szCs w:val="22"/>
         </w:rPr>
-        <w:t xml:space="preserve">Das Trello-Board der Gruppe ist bewusst einfach gehalten: Eine Liste je Termin (02.09., 05.10., 15.10., 22.10., 27.10. und 13.11.2026) enthält die Karten, die bis zu diesem Termin erledigt sein müssen. Jede Karte nennt genau eine verantwortliche Person und, wo ein Diagramm entsteht, den Teampartner als Prüfer (Vier-Augen-Prinzip). Für den ersten Gruppentermin sind das zehn Karten für die BPMN-Diagramme (je zwei pro Person, Kilian übernimmt stattdessen das UML-Modell), je eine Karte für Use-Case- und Klassendiagramm, Dokumentationsgerüst, QA-Checkliste und Sprint-Protokoll; die folgenden Listen enthalten die Korrekturen, Sequenzdiagramme, Dokumentation, Folien, Generalprobe, Präsentation und Abgabe. Erledigte Karten werden abgehakt, sodass der Dozent den Stand je Termin auf einen Blick sieht.</w:t>
+        <w:t>Das Trello-Board der Gruppe ist bewusst einfach gehalten. Eine Liste je Termin (02.09., 05.10., 15.10., 22.10., 27.10. und 13.11.2026) enthält die Karten, die bis zu diesem Termin erledigt sein müssen. Jede Karte nennt genau eine verantwortliche Person und, wo ein Diagramm entsteht, den Teampartner als Prüfer (Vier-Augen-Prinzip). Für den ersten Gruppentermin sind das zehn Karten für die BPMN-Diagramme (je zwei pro Person, Kilian übernimmt stattdessen das UML-Modell), je eine Karte für Use-Case- und Klassendiagramm, Dokumentationsgerüst, QA-Checkliste und Sprint-Protokoll. Die folgenden Listen enthalten die Korrekturen, Sequenzdiagramme, Dokumentation, Folien, Generalprobe, Präsentation und Abgabe. Erledigte Karten werden abgehakt, sodass der Dozent den Stand je Termin auf einen Blick sieht.</w:t>
       </w:r>
     </w:p>
     <w:p>
@@ -4236,7 +4236,7 @@
           <w:sz w:val="22"/>
           <w:szCs w:val="22"/>
         </w:rPr>
-        <w:t>Tatsächlich verlief die Arbeit an zwei Stellen anders als geplant. Die Übernahme des UML-Modells in Visual Paradigm war für Sprint 1 vorgesehen, wurde aber erst in Sprint 3 begonnen, auch weil die Modelle nach den Prüfrunden in Sprint 2 noch mehrfach geändert wurden (E-15 bis E-20); die Sequenzdiagramme entstanden deshalb zunächst als PlantUML-Quellen. Außerdem kamen in Sprint 2 mit der Gesamtprüfung und dem Komplettcheck zwei Korrekturrunden hinzu, die nicht als Karten geplant waren. Am 05.10.2026 hat die Gruppe alle offenen Grundsatzentscheidungen getroffen (E-21) und die Arbeit für Sprint 3 neu verteilt. Bis zum 08.10.2026 sind das Use-Case-Diagramm in Visual Paradigm angelegt und die offenen QA-Befunde in den Modellen behoben; Klassendiagramm, Sequenzdiagramme in Visual Paradigm und die Prüfung im Camunda Modeler folgen bis zum 15.10.2026.</w:t>
+        <w:t>An zwei Stellen verlief die Arbeit anders als geplant. Die Übernahme des UML-Modells in Visual Paradigm war für Sprint 1 vorgesehen, wurde aber erst in Sprint 3 begonnen, auch weil die Modelle nach den Prüfrunden in Sprint 2 noch mehrfach geändert wurden (E-15 bis E-20). Deshalb entstanden die Sequenzdiagramme zunächst als PlantUML-Quellen. Außerdem kamen in Sprint 2 mit der Gesamtprüfung und dem Komplettcheck zwei Korrekturrunden hinzu, die nicht als Karten geplant waren. Am 05.10.2026 hat die Gruppe alle offenen Grundsatzentscheidungen getroffen (E-21) und die Arbeit für Sprint 3 neu verteilt. Bis zum 08.10.2026 sind das Use-Case-Diagramm in Visual Paradigm angelegt und die offenen QA-Befunde in den Modellen behoben. Klassendiagramm, Sequenzdiagramme in Visual Paradigm und die Prüfung im Camunda Modeler folgen bis zum 15.10.2026.</w:t>
       </w:r>
     </w:p>
     <w:p>
@@ -4263,7 +4263,7 @@
           <w:sz w:val="22"/>
           <w:szCs w:val="22"/>
         </w:rPr>
-        <w:t xml:space="preserve">Änderungen am gemeinsamen Stand laufen über einen Git-Workflow, den wir in der README des Repositories festgehalten haben: vor Beginn main aktualisieren, keine direkten Commits auf main, ein Branch je Aufgabe, Pull Request mit Beschreibung, Review durch ein anderes Teammitglied und Merge durch den Qualitätsmanager. Commit-Nachrichten tragen einen Termin-Stempel und ein Conventional-Commit-Präfix nach dem Muster [T03 2026-09-02] docs: update class diagram, damit im Log erkennbar bleibt, zu welchem Gruppentermin ein Stand gehört. Das Repository ist nach Artefakten gegliedert (bpmn, uml, doku, praesi); Entscheidungen, die mehr als eine Person betreffen, stehen in der aktuellen Kurzfassung doku/03-entscheidungen.md; der ausführliche frühere Verlauf liegt im Archiv, Rückmeldungen des Dozenten in einer eigenen Datei.</w:t>
+        <w:t>Änderungen am gemeinsamen Stand laufen über einen Git-Workflow, den wir in der README des Repositories festgehalten haben: vor Beginn main aktualisieren, keine direkten Commits auf main, ein Branch je Aufgabe, Pull Request mit Beschreibung, Review durch ein anderes Teammitglied und Merge durch den Qualitätsmanager. Commit-Nachrichten tragen einen Termin-Stempel und ein Conventional-Commit-Präfix nach dem Muster [T03 2026-09-02] docs: update class diagram, damit im Log erkennbar bleibt, zu welchem Gruppentermin ein Stand gehört. Das Repository ist nach Artefakten gegliedert (bpmn, uml, doku, praesi). Entscheidungen, die mehr als eine Person betreffen, stehen in der aktuellen Kurzfassung doku/03-entscheidungen.md. Der ausführliche frühere Verlauf liegt im Archiv, die Rückmeldungen des Dozenten stehen in einer eigenen Datei.</w:t>
       </w:r>
     </w:p>
     <w:p>
@@ -4277,7 +4277,7 @@
           <w:sz w:val="22"/>
           <w:szCs w:val="22"/>
         </w:rPr>
-        <w:t xml:space="preserve">Die BPMN-Modelle liegen ausschließlich im Git-Repository; Camunda Cloud wird nicht genutzt. Für UML ist der VP-Teamwork-Server das Zielrepository. Im Git liegen derzeit PlantUML-Quellen, PNGs und XMI; die lokale VPP-Sicherung wird nach der Fertigstellung ergänzt. Seit E-21 werden Word- und PowerPoint-Dateien direkt bearbeitet. Weil diese Dateien nicht automatisch zusammengeführt werden können, stimmt das Team die Bearbeitung vorher über WhatsApp ab; die Dateien selbst werden ausschließlich über GitHub geteilt.</w:t>
+        <w:t>Die BPMN-Modelle liegen ausschließlich im Git-Repository, Camunda Cloud wird nicht genutzt. Für UML ist der VP-Teamwork-Server das Zielrepository. Im Git liegen derzeit PlantUML-Quellen, PNGs und XMI. Die lokale VPP-Sicherung wird nach der Fertigstellung ergänzt. Seit E-21 werden Word- und PowerPoint-Dateien direkt bearbeitet. Weil diese Dateien nicht automatisch zusammengeführt werden können, stimmt das Team die Bearbeitung vorher über WhatsApp ab. Die Dateien selbst werden ausschließlich über GitHub geteilt.</w:t>
       </w:r>
     </w:p>
     <w:p>
@@ -7392,7 +7392,7 @@
           <w:sz w:val="22"/>
           <w:szCs w:val="22"/>
         </w:rPr>
-        <w:t>Insgesamt enthalten die zehn Werkstatt-Prozesse 131 Aktivitäten, im Durchschnitt 13,1 je Diagramm. Gezählt werden alle Task-Typen, Aufruf-Aktivitäten und der Mehrfach-Teilprozess einschließlich seiner enthaltenen Aktivitäten. Die Kundenabläufe kommen mit 26 weiteren Aktivitäten hinzu und sind in Tabelle 1 nicht mitgezählt. Dazu kommen 41 Nachrichtenflüsse sowie 48 Datenobjekt-Referenzen und zwölf Datenspeicherdefinitionen, zusammen 60; mehrere Referenzen auf denselben Speicher innerhalb eines Diagramms zählen dabei einmal. Jeder Prozess hat auf Prozessebene genau ein Start- und ein Endereignis.</w:t>
+        <w:t>Insgesamt enthalten die zehn Werkstatt-Prozesse 131 Aktivitäten, im Durchschnitt 13,1 je Diagramm. Gezählt werden alle Task-Typen, Aufruf-Aktivitäten und der Mehrfach-Teilprozess einschließlich seiner enthaltenen Aktivitäten. Die Kundenabläufe bringen 26 weitere Aktivitäten mit, die in Tabelle 1 nicht mitgezählt sind. Hinzu kommen 41 Nachrichtenflüsse sowie 48 Datenobjekt-Referenzen und zwölf Datenspeicherdefinitionen, zusammen 60. Mehrere Referenzen auf denselben Speicher innerhalb eines Diagramms zählen dabei einmal. Jeder Prozess hat auf Prozessebene genau ein Start- und ein Endereignis.</w:t>
       </w:r>
     </w:p>
     <w:p>
@@ -7419,7 +7419,7 @@
           <w:sz w:val="22"/>
           <w:szCs w:val="22"/>
         </w:rPr>
-        <w:t xml:space="preserve">Der Pool ist der Werkstattbetrieb, in dem die Plattform läuft, mit dem Pilotkunden FixWerk als Beispiel. Seine Lanes sind die Rollen Service/Annahme, Techniker, Werkstattleitung und Ersatzteil-Disposition; je Diagramm sind nur die beteiligten Lanes gezeichnet. Kunde und Lieferant sind eigene Beteiligte und deshalb eigene Pools, mit denen ausschließlich über Nachrichtenflüsse kommuniziert wird. Der Kunde hat in den Prozessen 01 bis 09 einen eigenen Ablauf mit Start- und Endereignis, zum Beispiel Foto aufnehmen, Anfrage senden, auf Rückfrage oder Diagnose warten, Kostenvoranschlag freigeben oder ablehnen; dieser Ablauf ist nicht ausführbar, weil RepairFlow ihn nicht steuert, zeigt aber, wann der Kunde reagiert und wie der Vorgang für ihn endet. Die Nachrichtenflüsse verbinden deshalb konkrete Aktivitäten und Ereignisse beider Pools. Der Lieferant bleibt ein Empty Pool (Black Box), weil wir seine internen Abläufe weder kennen noch beeinflussen. Der KI-Diagnosedienst ist kein eigener Pool, obwohl er im Systemkontext ein externer Dienst ist: RepairFlow ruft ihn synchron innerhalb der Geschäftsregel-Aktivität „KI-Diagnosevorschlag erstellen" auf, er hat keinen eigenen Geschäftsprozess, mit dem Nachrichten ausgetauscht würden. Eine Lane für die Software gibt es bewusst nicht, weil Rechenleistung keine Ressource im Sinne der Prozessmodellierung ist. Wo RepairFlow arbeitet, zeigt stattdessen der Aktivitätstyp:</w:t>
+        <w:t>Der Pool ist der Werkstattbetrieb, in dem die Plattform läuft, mit dem Pilotkunden FixWerk als Beispiel. Seine Lanes sind die Rollen Service/Annahme, Techniker, Werkstattleitung und Ersatzteil-Disposition. Je Diagramm sind nur die beteiligten Lanes gezeichnet. Kunde und Lieferant sind eigene Beteiligte und deshalb eigene Pools, mit denen ausschließlich über Nachrichtenflüsse kommuniziert wird. Der Kunde hat in den Prozessen 01 bis 09 einen eigenen Ablauf mit Start- und Endereignis, zum Beispiel Foto aufnehmen, Anfrage senden, auf Rückfrage oder Diagnose warten, Kostenvoranschlag freigeben oder ablehnen. Dieser Ablauf ist nicht ausführbar, weil RepairFlow ihn nicht steuert. Er zeigt aber, wann der Kunde reagiert und wie der Vorgang für ihn endet. Die Nachrichtenflüsse verbinden deshalb konkrete Aktivitäten und Ereignisse beider Pools. Der Lieferant bleibt ein Empty Pool (Black Box), weil wir seine internen Abläufe weder kennen noch beeinflussen. Der KI-Diagnosedienst ist im Systemkontext zwar ein externer Dienst, bekommt aber keinen eigenen Pool: RepairFlow ruft ihn synchron innerhalb der Geschäftsregel-Aktivität „KI-Diagnosevorschlag erstellen" auf, und er hat keinen eigenen Geschäftsprozess, mit dem Nachrichten ausgetauscht würden. Eine Lane für die Software gibt es bewusst nicht, weil Rechenleistung keine Ressource im Sinne der Prozessmodellierung ist. Wo RepairFlow arbeitet, zeigt stattdessen der Aktivitätstyp:</w:t>
       </w:r>
     </w:p>
     <w:tbl>
@@ -7904,7 +7904,7 @@
           <w:sz w:val="22"/>
           <w:szCs w:val="22"/>
         </w:rPr>
-        <w:t xml:space="preserve">Datenobjekte hängen an den Aktivitäten, die sie erzeugen oder lesen, und tragen die Klassennamen des Klassendiagramms mit dem jeweiligen Zustand. Datenspeicher stehen für Objektmengen: die RepairFlow-Datenbank für Aufträge und Bestände, der Technikerplan für die Kapazitäts- und Terminplanung (Prozess 02) und die Buchhaltung, an die bezahlte Rechnungen per DATEV-Export übergeben werden (Prozess 08). Wartesituationen mit mehreren möglichen Ereignissen, etwa Freigabe, Ablehnung oder Fristablauf beim Kostenvoranschlag, modellieren wir mit ereignisbasierten Gateways; die Prüfung je Ersatzteil in Prozess 05 ist ein paralleler Mehrfach-Teilprozess.</w:t>
+        <w:t>Datenobjekte hängen an den Aktivitäten, die sie erzeugen oder lesen, und tragen die Klassennamen des Klassendiagramms mit dem jeweiligen Zustand. Datenspeicher stehen für Objektmengen: die RepairFlow-Datenbank für Aufträge und Bestände, der Technikerplan für die Kapazitäts- und Terminplanung (Prozess 02) und die Buchhaltung, an die bezahlte Rechnungen per DATEV-Export übergeben werden (Prozess 08). Wartesituationen mit mehreren möglichen Ereignissen, etwa Freigabe, Ablehnung oder Fristablauf beim Kostenvoranschlag, modellieren wir mit ereignisbasierten Gateways. Die Prüfung je Ersatzteil in Prozess 05 ist ein paralleler Mehrfach-Teilprozess.</w:t>
       </w:r>
     </w:p>
     <w:p>
@@ -7941,7 +7941,7 @@
           <w:sz w:val="22"/>
           <w:szCs w:val="22"/>
         </w:rPr>
-        <w:t xml:space="preserve">Der Kunde lädt in der App Foto, Video oder eine Tonaufnahme hoch; daraus legt RepairFlow sofort eine Voranmeldung an. Die Medien werden geprüft und vom KI-Dienst ausgewertet (bei nicht auswertbaren Medien fragt das System nach einer besseren Aufnahme, nach sieben Tagen ohne Antwort wird die Voranmeldung verworfen). RepairFlow berechnet einen vorläufigen Kostenvoranschlag, prüft die Teileverfügbarkeit in allen Filialen und schlägt Filiale und Termin vor. Bestätigt der Kunde, werden die Voranmeldung als bestätigt markiert und die Teile vorreserviert; lehnt er den Termin ab oder reagiert er sieben Tage nicht, wird die Voranmeldung verworfen.</w:t>
+        <w:t>Der Kunde lädt in der App Foto, Video oder eine Tonaufnahme hoch, und RepairFlow legt daraus sofort eine Voranmeldung an. Die Medien werden geprüft und vom KI-Dienst ausgewertet. Sind sie nicht auswertbar, fragt das System nach einer besseren Aufnahme. Bleibt die bessere Aufnahme sieben Tage aus, wird die Voranmeldung verworfen. RepairFlow berechnet einen vorläufigen Kostenvoranschlag, prüft die Teileverfügbarkeit in allen Filialen und schlägt Filiale und Termin vor. Bestätigt der Kunde, werden die Voranmeldung als bestätigt markiert und die Teile vorreserviert. Lehnt er den Termin ab oder reagiert er sieben Tage nicht, wird die Voranmeldung verworfen.</w:t>
       </w:r>
     </w:p>
     <w:p>
@@ -7989,7 +7989,7 @@
           <w:sz w:val="22"/>
           <w:szCs w:val="22"/>
         </w:rPr>
-        <w:t xml:space="preserve">Der Techniker sichtet den KI-Diagnosevorschlag, führt Funktionstest und Messung durch, bei nicht reproduzierbarem Fehler zusätzlich eine erweiterte Prüfung, und dokumentiert den Fehlerbefund samt Ersatzteilbedarf. RepairFlow bewertet die Wirtschaftlichkeit der Reparatur; bei einem Totalschaden oder ohne Befund wird der Kunde informiert, der Auftrag auf „abgelehnt" gesetzt und über Prozess 08 mit der Diagnosepauschale zur Abholung gebracht.</w:t>
+        <w:t>Der Techniker sichtet den KI-Diagnosevorschlag und führt Funktionstest und Messung durch. Ist der Fehler nicht reproduzierbar, kommt eine erweiterte Prüfung hinzu. Den Fehlerbefund dokumentiert der Techniker samt Ersatzteilbedarf. RepairFlow bewertet die Wirtschaftlichkeit der Reparatur. Bei einem Totalschaden oder ohne Befund wird der Kunde informiert, der Auftrag auf „abgelehnt" gesetzt und über Prozess 08 mit der Diagnosepauschale zur Abholung gebracht.</w:t>
       </w:r>
     </w:p>
     <w:p>
@@ -8037,7 +8037,7 @@
           <w:sz w:val="22"/>
           <w:szCs w:val="22"/>
         </w:rPr>
-        <w:t xml:space="preserve">Je Ersatzteil prüft RepairFlow in einem parallelen Mehrfach-Teilprozess zuerst den Bestand der eigenen Filiale, dann den der anderen Filialen. Teile werden reserviert, bei Bestand in einer anderen Filiale zusätzlich per Umlagerung angefordert, Fehlteile für die Bestellung markiert. Danach werden die Reservierungen bestätigt; ein unterschrittener Meldebestand erzeugt einen Nachbestellvorschlag. Der Service informiert den Kunden über den voraussichtlichen Reparaturbeginn. Nur Fehlteile lösen Prozess 06 direkt aus; ein Nachbestellvorschlag bleibt im Status Vorschlag und wird mit der nächsten Bestellung gebündelt, damit die Reparatur nicht auf Lagernachschub wartet.</w:t>
+        <w:t>Je Ersatzteil prüft RepairFlow in einem parallelen Mehrfach-Teilprozess zuerst den Bestand der eigenen Filiale, dann den der anderen Filialen. Teile werden reserviert, bei Bestand in einer anderen Filiale zusätzlich per Umlagerung angefordert, Fehlteile für die Bestellung markiert. Danach werden die Reservierungen bestätigt. Ein unterschrittener Meldebestand erzeugt einen Nachbestellvorschlag. Der Service informiert den Kunden über den voraussichtlichen Reparaturbeginn. Nur Fehlteile lösen Prozess 06 direkt aus. Ein Nachbestellvorschlag bleibt im Status Vorschlag und wird mit der nächsten Bestellung gebündelt, damit die Reparatur nicht auf Lagernachschub wartet.</w:t>
       </w:r>
     </w:p>
     <w:p>
@@ -8061,7 +8061,7 @@
           <w:sz w:val="22"/>
           <w:szCs w:val="22"/>
         </w:rPr>
-        <w:t>Die Fehlteile eines Auftrags werden mit offenen Nachbestellvorschlägen gebündelt und beim Lieferanten bestellt, bei Überschreitung der Freigabegrenze nach Freigabe durch die Werkstattleitung. Kommt binnen 3 Tagen keine Auftragsbestätigung oder kann der Lieferant nicht liefern, wird die Bestellung storniert und ein alternativer Lieferant gesucht. Nach Auftragsbestätigung wird der Liefertermin am Auftrag hinterlegt (Status „Teile bestellt") und der Kunde bei Verzögerung informiert; bleibt die Lieferung 14 Tage aus, wird sie angemahnt und erneut gewartet. Bleibt auch die zweite Mahnung ohne Lieferung, wird die Bestellung wie bei fehlender Auftragsbestätigung storniert und ein alternativer Lieferant gesucht (E-22). Der Wareneingang wird geprüft und gebucht, mangelhafte Lieferungen gehen in die Retoure (Prozess 10). Eine Ersatzlieferung wird geprüft, bevor die Fehlteile dem Auftrag zugeordnet werden; bei Gutschrift wird neu bestellt, solange das Teil noch benötigt wird.</w:t>
+        <w:t>Die Fehlteile eines Auftrags werden mit offenen Nachbestellvorschlägen gebündelt und beim Lieferanten bestellt. Wird die Freigabegrenze überschritten, muss die Werkstattleitung die Bestellung vorher freigeben. Kommt binnen 3 Tagen keine Auftragsbestätigung oder kann der Lieferant nicht liefern, wird die Bestellung storniert und ein alternativer Lieferant gesucht. Nach Auftragsbestätigung wird der Liefertermin am Auftrag hinterlegt (Status „Teile bestellt") und der Kunde bei Verzögerung informiert. Bleibt die Lieferung 14 Tage aus, wird sie angemahnt und erneut gewartet. Kommt auch nach der zweiten Mahnung keine Lieferung, wird die Bestellung wie bei fehlender Auftragsbestätigung storniert und ein alternativer Lieferant gesucht (E-22). Der Wareneingang wird geprüft und gebucht, mangelhafte Lieferungen gehen in die Retoure (Prozess 10). Eine Ersatzlieferung wird geprüft, bevor die Fehlteile dem Auftrag zugeordnet werden. Bei Gutschrift wird neu bestellt, solange das Teil noch benötigt wird.</w:t>
       </w:r>
     </w:p>
     <w:p>
@@ -8085,7 +8085,7 @@
           <w:sz w:val="22"/>
           <w:szCs w:val="22"/>
         </w:rPr>
-        <w:t xml:space="preserve">Der Techniker entnimmt die reservierten Teile und arbeitet die Reparaturschritte mit Zeiterfassung ab. Bei einem Zusatzbefund entsteht ein Nachtrags-KVA. Nach Freigabe werden die zusätzlichen Teile über Prozess 05 disponiert und entnommen; Ablehnung oder drei Tage ohne Antwort führen zur Endkontrolle. Nach bestandener Endkontrolle setzt RepairFlow den Auftrag auf „fertig“. Bei Mängeln sind höchstens zwei Nacharbeiten vorgesehen; bleibt die zweite erfolglos, wird der Auftrag auf „abgelehnt“ gesetzt. Auch ein Nacharbeitsauftrag aus einer Reklamation (Prozess 09) läuft über diesen Prozess.</w:t>
+        <w:t>Der Techniker entnimmt die reservierten Teile und arbeitet die Reparaturschritte mit Zeiterfassung ab. Bei einem Zusatzbefund entsteht ein Nachtrags-KVA. Nach Freigabe werden die zusätzlichen Teile über Prozess 05 disponiert und entnommen; Ablehnung oder drei Tage ohne Antwort führen zur Endkontrolle. Nach bestandener Endkontrolle setzt RepairFlow den Auftrag auf „fertig“. Bei Mängeln sind höchstens zwei Nacharbeiten vorgesehen. Bleibt die zweite erfolglos, wird der Auftrag auf „abgelehnt“ gesetzt. Auch ein Nacharbeitsauftrag aus einer Reklamation (Prozess 09) läuft über diesen Prozess.</w:t>
       </w:r>
     </w:p>
     <w:p>
@@ -8109,7 +8109,7 @@
           <w:sz w:val="22"/>
           <w:szCs w:val="22"/>
         </w:rPr>
-        <w:t xml:space="preserve">Für ein abholbereites Gerät entsteht die Rechnung aus KVA und Arbeitszeiten oder bei abgelehnten Aufträgen über die Diagnosepauschale; kostenfreie Nacharbeit wird ohne Rechnung abgewickelt. RepairFlow benachrichtigt den Kunden und erinnert alle 14 Tage. Nach der dritten Erinnerung wird eine Lagergebühr aufgenommen; beim vierten Fristablauf wird die Verwertung des Geräts eingeleitet. Bei regulärer Abholung werden Zahlungsart und Zahlung erfasst beziehungsweise die Rechnung mit Zahlungsziel versandt, danach das Gerät übergeben und der Auftrag auf „abgeholt“ gesetzt. Offene Rechnungen werden alle 14 Tage gemahnt. Bleibt die dritte Mahnung erfolglos, geht die Forderung an Inkasso; andernfalls wird die Zahlung verbucht und an die Buchhaltung übergeben. Im regulären Abschluss folgt eine Bewertungsanfrage. Die Verwertungs- und Mahngrenzen aus E-19 sind noch durch die Gruppe zu bestätigen.</w:t>
+        <w:t>Für ein abholbereites Gerät entsteht die Rechnung aus KVA und Arbeitszeiten, bei abgelehnten Aufträgen über die Diagnosepauschale. Kostenfreie Nacharbeit wird ohne Rechnung abgewickelt. RepairFlow benachrichtigt den Kunden und erinnert alle 14 Tage. Nach der dritten Erinnerung wird eine Lagergebühr aufgenommen, beim vierten Fristablauf wird die Verwertung des Geräts eingeleitet. Bei regulärer Abholung werden Zahlungsart und Zahlung erfasst beziehungsweise die Rechnung mit Zahlungsziel versandt, danach das Gerät übergeben und der Auftrag auf „abgeholt“ gesetzt. Offene Rechnungen werden alle 14 Tage gemahnt. Bleibt die dritte Mahnung erfolglos, geht die Forderung an Inkasso. Andernfalls wird die Zahlung verbucht und an die Buchhaltung übergeben. Im regulären Abschluss folgt eine Bewertungsanfrage. Die Verwertungs- und Mahngrenzen aus E-19 sind noch durch die Gruppe zu bestätigen.</w:t>
       </w:r>
     </w:p>
     <w:p>
@@ -8133,7 +8133,7 @@
           <w:sz w:val="22"/>
           <w:szCs w:val="22"/>
         </w:rPr>
-        <w:t xml:space="preserve">Meldet der Kunde nach der Abholung einen Mangel, wird die Reklamation erfasst, dem Ursprungsauftrag zugeordnet und das Gerät angenommen. Der Techniker prüft den Mangel, RepairFlow bewertet den Gewährleistungsfall. Die Werkstattleitung entscheidet über die kostenfreie Nacharbeit; andernfalls erhält der Kunde ein kostenpflichtiges Angebot. Nur nach Freigabe oder Angebotsannahme legt der Techniker einen Nacharbeitsauftrag an, der über Prozess 07 durchgeführt wird; defekte Lieferantenteile gehen in die Retoure (Prozess 10). Die Rückgabe des Geräts läuft in allen Zweigen über Prozess 08, danach wird die Reklamation geschlossen.</w:t>
+        <w:t>Meldet der Kunde nach der Abholung einen Mangel, wird die Reklamation erfasst, dem Ursprungsauftrag zugeordnet und das Gerät angenommen. Der Techniker prüft den Mangel, RepairFlow bewertet den Gewährleistungsfall. Die Werkstattleitung entscheidet über die kostenfreie Nacharbeit. Andernfalls erhält der Kunde ein kostenpflichtiges Angebot. Nur nach Freigabe oder Angebotsannahme legt der Techniker einen Nacharbeitsauftrag an, der über Prozess 07 durchgeführt wird. Defekte Lieferantenteile gehen in die Retoure (Prozess 10). Die Rückgabe des Geräts läuft in allen Zweigen über Prozess 08, danach wird die Reklamation geschlossen.</w:t>
       </w:r>
     </w:p>
     <w:p>
@@ -8157,7 +8157,7 @@
           <w:sz w:val="22"/>
           <w:szCs w:val="22"/>
         </w:rPr>
-        <w:t>Defekte oder falsche Lieferantenteile werden beim Lieferanten angemeldet. Bleibt die RMA-Freigabe fünf Tage aus, eskaliert die Werkstattleitung. Nach weiteren fünf Tagen ohne Freigabe wird das Teil abgeschrieben. Nach der Freigabe wird das Teil versendet, der Bestand korrigiert und je nach Rückmeldung eine Gutschrift verbucht oder auf die Ersatzlieferung gewartet und diese nach ihrem Eingang gebucht (E-22); ob nach einer Gutschrift neu bestellt wird, entscheidet der aufrufende Prozess 06.</w:t>
+        <w:t>Defekte oder falsche Lieferantenteile werden beim Lieferanten angemeldet. Bleibt die RMA-Freigabe fünf Tage aus, eskaliert die Werkstattleitung. Nach weiteren fünf Tagen ohne Freigabe wird das Teil abgeschrieben. Nach der Freigabe wird das Teil versendet und der Bestand korrigiert. Je nach Rückmeldung wird eine Gutschrift verbucht oder auf die Ersatzlieferung gewartet und diese nach ihrem Eingang gebucht (E-22). Ob nach einer Gutschrift neu bestellt wird, entscheidet der aufrufende Prozess 06.</w:t>
       </w:r>
     </w:p>
     <w:p>
@@ -8184,7 +8184,7 @@
           <w:sz w:val="22"/>
           <w:szCs w:val="22"/>
         </w:rPr>
-        <w:t xml:space="preserve">Von den 131 Aktivitäten sind 79 automatisierte, regelbasierte, sendende oder empfangende Aktivitäten, also rund 60 Prozent. Weitere 33 Benutzer-Aktivitäten werden von Mitarbeitern in der Plattform ausgeführt. Neun manuelle Aktivitäten liegen außerhalb der Systemgrenze; neun Aktivitäten rufen einen anderen Prozess auf, und eine weitere ist der Mehrfach-Teilprozess. Die Software, die wir in der objektorientierten Analyse entwerfen, unterstützt und automatisiert damit den Reparaturauftrags-Lebenszyklus:</w:t>
+        <w:t>Von den 131 Aktivitäten sind 79 automatisierte, regelbasierte, sendende oder empfangende Aktivitäten, also rund 60 Prozent. Weitere 33 Benutzer-Aktivitäten werden von Mitarbeitern in der Plattform ausgeführt. Neun manuelle Aktivitäten liegen außerhalb der Systemgrenze. Neun Aktivitäten rufen einen anderen Prozess auf, eine weitere ist der Mehrfach-Teilprozess. Die Software, die wir in der objektorientierten Analyse entwerfen, unterstützt und automatisiert damit den Reparaturauftrags-Lebenszyklus:</w:t>
       </w:r>
     </w:p>
     <w:p>
@@ -8319,7 +8319,7 @@
           <w:sz w:val="22"/>
           <w:szCs w:val="22"/>
         </w:rPr>
-        <w:t xml:space="preserve">Die objektorientierte Analyse folgt der Reihenfolge aus der Vorlesung: Use-Case-Diagramm, Klassendiagramm, Interaktionsdiagramme zu ausgewählten Use Cases und ergänzend ein Zustandsdiagramm des Reparaturauftrags. Der aktuelle Git-Stand enthält PlantUML-Quellen, PNGs und uml/modell.xmi mit Klassen- und Use-Case-Modell. Diese Modelle werden in Visual Paradigm importiert; die sechs Sequenzdiagramme sind dort als Unterdiagramme der zugehörigen Use Cases anzulegen. UML-WWI25B4-Gruppe1.vpp ist noch zu erstellen und in uml/ zu sichern.</w:t>
+        <w:t>Die objektorientierte Analyse folgt der Reihenfolge aus der Vorlesung: Use-Case-Diagramm, Klassendiagramm, Interaktionsdiagramme zu ausgewählten Use Cases und ergänzend ein Zustandsdiagramm des Reparaturauftrags. Der aktuelle Git-Stand enthält PlantUML-Quellen, PNGs und uml/modell.xmi mit Klassen- und Use-Case-Modell. Diese Modelle werden in Visual Paradigm importiert. Dort sind die sechs Sequenzdiagramme als Unterdiagramme der zugehörigen Use Cases anzulegen. UML-WWI25B4-Gruppe1.vpp ist noch zu erstellen und in uml/ zu sichern.</w:t>
       </w:r>
     </w:p>
     <w:p>
@@ -8346,7 +8346,7 @@
           <w:sz w:val="22"/>
           <w:szCs w:val="22"/>
         </w:rPr>
-        <w:t xml:space="preserve">Das Use-Case-Diagramm beschreibt, was RepairFlow aus Sicht seiner Benutzer leistet. Es enthält 19 Use Cases in vier Bereichen (Kundenportal, Auftrag und Werkstatt, Ersatzteil-Disposition, Administration) und acht Akteure. Primäre Akteure sind Kunde, Servicemitarbeiter, Techniker, Disponent, Werkstattleiter und Werkstattinhaber; Lieferant und KI-Diagnosedienst sind sekundäre, externe Akteure. Jede Lane der Prozessmodelle hat damit einen Akteur, die Lane Service / Annahme den Servicemitarbeiter.</w:t>
+        <w:t>Das Use-Case-Diagramm beschreibt, was RepairFlow aus Sicht seiner Benutzer leistet. Es enthält 19 Use Cases in vier Bereichen (Kundenportal, Auftrag und Werkstatt, Ersatzteil-Disposition, Administration) und acht Akteure. Primäre Akteure sind Kunde, Servicemitarbeiter, Techniker, Disponent, Werkstattleiter und Werkstattinhaber. Lieferant und KI-Diagnosedienst sind sekundäre, externe Akteure. Jede Lane der Prozessmodelle hat damit einen Akteur, die Lane Service / Annahme den Servicemitarbeiter.</w:t>
       </w:r>
     </w:p>
     <w:p>
@@ -8424,7 +8424,7 @@
           <w:sz w:val="22"/>
           <w:szCs w:val="22"/>
         </w:rPr>
-        <w:t xml:space="preserve">Die Beziehungen zwischen den Use Cases folgen der Regel: include für einen Teilschritt, der immer ausgeführt wird, extend für bedingtes Verhalten. So schließen „Sofortdiagnose anfordern" und „Ersatzteile disponieren und reservieren" im erfolgreichen Hauptablauf „Ersatzteil-Verfügbarkeit prüfen" ein. „Reparaturauftrag anlegen" erweitert „Reklamation bearbeiten" nur bei freigegebener Nacharbeit oder angenommenem Angebot; bei Ablehnung entsteht kein neuer Auftrag. „Voranmeldung bestätigen" erweitert die Sofortdiagnose nur dann, wenn der Kunde den Vorschlag annimmt; „Diagnosevorschlag prüfen" bleibt ein eigener Use Case vor der Befunderfassung; Prozess 03 enthält dafür keine bedingte Verzweigung, deshalb wird keine extend-Beziehung behauptet; „Nachbestellvorschlag erzeugen" erweitert die Disposition bei unterschrittenem Meldebestand. „Lieferantenbestellung auslösen" erweitert sie, wenn Fehlteile vorhanden sind. „Retoure abwickeln" erweitert den Wareneingang bei mangelhafter Lieferung und die Reklamation bei einem defekten Lieferantenteil. Die Bedingungen und Erweiterungspunkte stehen auch in der XMI-Datei. Vorbedingungen wie die Fertigmeldung vor der Rechnung sind bewusst keine include-Beziehungen, weil der Basis-Use-Case den anderen nicht ausführt.</w:t>
+        <w:t>Für die Beziehungen zwischen den Use Cases gilt: include steht für einen Teilschritt, der immer ausgeführt wird, extend für bedingtes Verhalten. So schließen „Sofortdiagnose anfordern" und „Ersatzteile disponieren und reservieren" im erfolgreichen Hauptablauf „Ersatzteil-Verfügbarkeit prüfen" ein. „Reparaturauftrag anlegen" erweitert „Reklamation bearbeiten" nur bei freigegebener Nacharbeit oder angenommenem Angebot. Bei Ablehnung entsteht kein neuer Auftrag. „Voranmeldung bestätigen" erweitert die Sofortdiagnose nur dann, wenn der Kunde den Vorschlag annimmt. „Diagnosevorschlag prüfen" bleibt ein eigener Use Case vor der Befunderfassung. Prozess 03 enthält dafür keine bedingte Verzweigung, deshalb wird hier keine extend-Beziehung behauptet. „Nachbestellvorschlag erzeugen" erweitert die Disposition bei unterschrittenem Meldebestand, „Lieferantenbestellung auslösen" erweitert sie, wenn Fehlteile vorhanden sind. „Retoure abwickeln" erweitert den Wareneingang bei mangelhafter Lieferung und die Reklamation bei einem defekten Lieferantenteil. Die Bedingungen und Erweiterungspunkte stehen auch in der XMI-Datei. Vorbedingungen wie die Fertigmeldung vor der Rechnung sind bewusst keine include-Beziehungen, weil der Basis-Use-Case den anderen nicht ausführt.</w:t>
       </w:r>
     </w:p>
     <w:p>
@@ -8451,7 +8451,7 @@
           <w:sz w:val="22"/>
           <w:szCs w:val="22"/>
         </w:rPr>
-        <w:t xml:space="preserve">Das Klassendiagramm umfasst 27 Klassen, darunter die abstrakten Klassen Person und Mitarbeiter, sowie sieben Aufzählungen und 36 Assoziationen. Es gibt genau ein vollständiges Klassendiagramm in Anhang C und im Repository (uml/klassen.png). Alle Klassen, Operationen und Beziehungen stehen in derselben Abbildung; zusätzliche Fokusdiagramme entfallen. In Visual Paradigm wird es aus der XMI-Datei aufgebaut. Die wichtigsten Entwurfsentscheidungen:</w:t>
+        <w:t>Das Klassendiagramm umfasst 27 Klassen, darunter die abstrakten Klassen Person und Mitarbeiter, sowie sieben Aufzählungen und 36 Assoziationen. Es gibt genau ein vollständiges Klassendiagramm in Anhang C und im Repository (uml/klassen.png). Alle Klassen, Operationen und Beziehungen stehen in derselben Abbildung, zusätzliche Fokusdiagramme entfallen. In Visual Paradigm wird es aus der XMI-Datei aufgebaut. Die wichtigsten Entwurfsentscheidungen:</w:t>
       </w:r>
     </w:p>
     <w:p>
@@ -8479,7 +8479,7 @@
           <w:sz w:val="22"/>
           <w:szCs w:val="22"/>
         </w:rPr>
-        <w:t xml:space="preserve">Fehlerbefund und Reparaturschritte existieren nur mit ihrem Auftrag und sind deshalb Kompositionen. Der Kostenvoranschlag ist dagegen nur assoziiert, weil der vorläufige KVA aus der Sofortdiagnose schon vor dem Auftrag entsteht (Multiplizität 0..1 auf Auftragsseite). Das Gerät existiert unabhängig vom Auftrag und ist nur zugeordnet, weil es mehrfach repariert werden kann. Der Auftrag hält den Status und damit die Methode wechsleStatus(); die Statuswerte sind die Aufzählung AuftragStatus.</w:t>
+        <w:t>Fehlerbefund und Reparaturschritte existieren nur mit ihrem Auftrag und sind deshalb Kompositionen. Der Kostenvoranschlag ist dagegen nur assoziiert, weil der vorläufige KVA aus der Sofortdiagnose schon vor dem Auftrag entsteht (Multiplizität 0..1 auf Auftragsseite). Das Gerät existiert unabhängig vom Auftrag und ist nur zugeordnet, weil es mehrfach repariert werden kann. Der Auftrag hält den Status und damit die Methode wechsleStatus(). Die Statuswerte bilden die Aufzählung AuftragStatus.</w:t>
       </w:r>
     </w:p>
     <w:p>
@@ -8591,7 +8591,7 @@
           <w:sz w:val="22"/>
           <w:szCs w:val="22"/>
         </w:rPr>
-        <w:t xml:space="preserve">Als Solution Provider bedienen wir viele Werkstätten. Der Werkstattbetrieb steht als Mandant über seinen Filialen und Mitarbeitern; jedes Datum der Plattform gehört zu genau einem Mandanten.</w:t>
+        <w:t>Als Solution Provider bedienen wir viele Werkstätten. Der Werkstattbetrieb steht als Mandant über seinen Filialen und Mitarbeitern, und jedes Datum der Plattform gehört zu genau einem Mandanten.</w:t>
       </w:r>
     </w:p>
     <w:p>
@@ -8702,7 +8702,7 @@
           <w:sz w:val="22"/>
           <w:szCs w:val="22"/>
         </w:rPr>
-        <w:t xml:space="preserve">Für sechs Use Cases mit vielen Interaktionen haben wir Sequenzdiagramme erstellt (gefordert waren fünf). Die Lebenslinien zeigen Klassenobjekte und beteiligte Akteure. Klassenbotschaften verwenden die Operationen des Klassendiagramms; Antworten, Konstruktoren und Nachrichten an menschliche oder externe Akteure werden gesondert dargestellt. Kombinierte Fragmente bilden Verzweigungen, optionale Schritte, Schleifen und parallele Teileprüfungen ab.</w:t>
+        <w:t>Für sechs Use Cases mit vielen Interaktionen haben wir Sequenzdiagramme erstellt (gefordert waren fünf). Die Lebenslinien zeigen Klassenobjekte und beteiligte Akteure. Klassenbotschaften verwenden die Operationen des Klassendiagramms. Antworten, Konstruktoren und Nachrichten an menschliche oder externe Akteure werden gesondert dargestellt. Kombinierte Fragmente bilden Verzweigungen, optionale Schritte, Schleifen und parallele Teileprüfungen ab.</w:t>
       </w:r>
     </w:p>
     <w:p>
@@ -8780,7 +8780,7 @@
           <w:sz w:val="22"/>
           <w:szCs w:val="22"/>
         </w:rPr>
-        <w:t xml:space="preserve">SD1 folgt Prozess 01: RepairFlow legt die Voranmeldung an und prüft die Medienqualität. Nicht auswertbare Aufnahmen können nachgereicht werden; sieben Tage ohne neue Aufnahme beenden den Ablauf. Erst danach wertet der KI-Dienst die Medien aus. Vorab-KVA, Verfügbarkeit und Filialauslastung führen zum Terminvorschlag. Bestätigung, Terminablehnung und sieben Tage ohne Entscheidung sind getrennte Pfade; verfügbare Teile werden erst nach Bestätigung vorreserviert.</w:t>
+        <w:t>SD1 folgt Prozess 01: RepairFlow legt die Voranmeldung an und prüft die Medienqualität. Nicht auswertbare Aufnahmen können nachgereicht werden. Kommt sieben Tage lang keine neue Aufnahme, endet der Ablauf. Erst danach wertet der KI-Dienst die Medien aus. Vorab-KVA, Verfügbarkeit und Filialauslastung führen zum Terminvorschlag. Bestätigung, Terminablehnung und sieben Tage ohne Entscheidung sind getrennte Pfade. Verfügbare Teile werden erst nach der Bestätigung vorreserviert.</w:t>
       </w:r>
     </w:p>
     <w:p>
@@ -8858,7 +8858,7 @@
           <w:sz w:val="22"/>
           <w:szCs w:val="22"/>
         </w:rPr>
-        <w:t xml:space="preserve">SD2 übernimmt Positionen und Ersatzteilpreise aus UC06, die Prüfung durch Service / Annahme und den Status „KVA offen". Alle drei Tage ohne Antwort wird ein Fristablauf protokolliert; vor dem dritten Ablauf wird der KVA mit Erinnerung erneut gesendet. Freigabe startet Prozess 05. Eine echte Kundenablehnung und der dritte Fristablauf sind getrennte Pfade zur Abholung über Prozess 08; der Timeout wird nicht als Kundenbotschaft dargestellt.</w:t>
+        <w:t>SD2 übernimmt Positionen und Ersatzteilpreise aus UC06, die Prüfung durch Service / Annahme und den Status „KVA offen". Nach jeweils drei Tagen ohne Antwort wird ein Fristablauf protokolliert. Vor dem dritten Ablauf wird der KVA mit Erinnerung erneut gesendet. Mit der Freigabe startet Prozess 05. Eine echte Kundenablehnung und der dritte Fristablauf führen auf getrennten Pfaden zur Abholung über Prozess 08. Der Timeout wird dabei nicht als Kundenbotschaft dargestellt.</w:t>
       </w:r>
     </w:p>
     <w:p>
@@ -8936,7 +8936,7 @@
           <w:sz w:val="22"/>
           <w:szCs w:val="22"/>
         </w:rPr>
-        <w:t xml:space="preserve">SD3 zeigt den parallelen Mehrfach-Teilprozess je Ersatzteil: eigene Filiale, andere Filialen mit Umlagerung oder Fehlteil markieren. Danach folgen die Bestätigung aller Reservierungen und die Meldebestandsprüfung mit optionalem Nachbestellvorschlag (UC12). Der Servicemitarbeiter ermittelt den Reparaturbeginn und informiert den Kunden. Erst dann startet bei Fehlteilen UC10, ein Nachbestellvorschlag allein löst keine Bestellung aus; der Status „Teile bestellt" folgt erst nach bestätigter Bestellung in SD6.</w:t>
+        <w:t>SD3 zeigt den parallelen Mehrfach-Teilprozess je Ersatzteil: eigene Filiale, andere Filialen mit Umlagerung oder Fehlteil markieren. Danach folgen die Bestätigung aller Reservierungen und die Meldebestandsprüfung mit optionalem Nachbestellvorschlag (UC12). Der Servicemitarbeiter ermittelt den Reparaturbeginn und informiert den Kunden. Erst dann startet bei Fehlteilen UC10. Ein Nachbestellvorschlag allein löst keine Bestellung aus. Der Status „Teile bestellt" folgt erst nach bestätigter Bestellung in SD6.</w:t>
       </w:r>
     </w:p>
     <w:p>
@@ -9014,7 +9014,7 @@
           <w:sz w:val="22"/>
           <w:szCs w:val="22"/>
         </w:rPr>
-        <w:t>SD4 knüpft die Fertigmeldung an abgeschlossene Reparaturschritte und eine bestandene Endkontrolle. Der Verweis auf UC13 umfasst Schritte, Arbeitszeiten und einen möglichen Nachtrags-KVA: Nach der Freigabe werden die zusätzlichen Teile über UC09 (Prozess 05) disponiert, Ablehnung oder drei Tage ohne Antwort führen zur Endkontrolle. Die Schleife erlaubt höchstens zwei Nacharbeiten; bleibt auch die zweite erfolglos, wechselt der Reparaturauftrag in den Status „abgelehnt“. Abholbenachrichtigung, Rückgabe und Rechnung gehören zu UC15 in Prozess 08.</w:t>
+        <w:t>SD4 knüpft die Fertigmeldung an abgeschlossene Reparaturschritte und eine bestandene Endkontrolle. Der Verweis auf UC13 umfasst Schritte, Arbeitszeiten und einen möglichen Nachtrags-KVA. Nach dessen Freigabe werden die zusätzlichen Teile über UC09 (Prozess 05) disponiert. Ablehnung oder drei Tage ohne Antwort führen zur Endkontrolle. Die Schleife erlaubt höchstens zwei Nacharbeiten. Bleibt auch die zweite erfolglos, wechselt der Reparaturauftrag in den Status „abgelehnt“. Abholbenachrichtigung, Rückgabe und Rechnung gehören zu UC15 in Prozess 08.</w:t>
       </w:r>
     </w:p>
     <w:p>
@@ -9092,7 +9092,7 @@
           <w:sz w:val="22"/>
           <w:szCs w:val="22"/>
         </w:rPr>
-        <w:t xml:space="preserve">SD5 zeigt Geräteannahme, Mangelprüfung durch den Techniker und Gewährleistungsbewertung am Ursprungsauftrag. Die Werkstattleitung gibt kostenfreie Nacharbeit frei; sonst entscheidet der Kunde über das Angebot. Nur bei Freigabe oder Annahme legt der Techniker den Nacharbeitsauftrag an. Darauf folgen Prozess 07, gegebenenfalls Prozess 10 bei defektem Lieferantenteil und in allen Pfaden Prozess 08 zur Abholung. Erst danach wird die Reklamation abgeschlossen.</w:t>
+        <w:t>SD5 zeigt Geräteannahme, Mangelprüfung durch den Techniker und Gewährleistungsbewertung am Ursprungsauftrag. Kostenfreie Nacharbeit gibt die Werkstattleitung frei, andernfalls entscheidet der Kunde über das Angebot. Nur bei Freigabe oder Annahme legt der Techniker den Nacharbeitsauftrag an. Darauf folgen Prozess 07, gegebenenfalls Prozess 10 bei defektem Lieferantenteil und in allen Pfaden Prozess 08 zur Abholung. Erst danach wird die Reklamation abgeschlossen.</w:t>
       </w:r>
     </w:p>
     <w:p>
@@ -9170,7 +9170,7 @@
           <w:sz w:val="22"/>
           <w:szCs w:val="22"/>
         </w:rPr>
-        <w:t>SD6 bündelt den Bestellbedarf aus Prozess 05, wählt einen Lieferanten und legt eine Bestellung mit Positionen an. Oberhalb der Freigabegrenze ist die Freigabe durch die Werkstattleitung erforderlich. Nur eine bestätigte und lieferbare Bestellung setzt bei auftragsbezogenen Fehlteilen den Status „Teile bestellt"; Verzögerungen werden dem Kunden mitgeteilt. Nicht lieferbare oder binnen drei Tagen nicht bestätigte Bestellungen werden storniert, ein alternativer Lieferant wird gesucht. Die Lieferwartezeit beträgt 14 Tage, danach wird angemahnt und weiter gewartet; nach der zweiten erfolglosen Mahnung wird die Bestellung storniert. UC11 verfeinert Lieferung und Wareneingang, bei Mängeln mit UC19 Retoure. Ohne Ersatz wird nur erneut bestellt, solange das Teil noch benötigt wird. Eine Zusammenführung mit offenen Bestellungen wird nicht behauptet, weil Prozess 06 diesen Pfad nicht enthält.</w:t>
+        <w:t>SD6 bündelt den Bestellbedarf aus Prozess 05, wählt einen Lieferanten und legt eine Bestellung mit Positionen an. Oberhalb der Freigabegrenze muss die Werkstattleitung die Bestellung freigeben. Nur eine bestätigte und lieferbare Bestellung setzt bei auftragsbezogenen Fehlteilen den Status „Teile bestellt". Verzögerungen werden dem Kunden mitgeteilt. Nicht lieferbare oder binnen drei Tagen nicht bestätigte Bestellungen werden storniert, und es wird ein alternativer Lieferant gesucht. Die Lieferwartezeit beträgt 14 Tage. Danach wird angemahnt und weiter gewartet, nach der zweiten erfolglosen Mahnung wird die Bestellung storniert. UC11 verfeinert Lieferung und Wareneingang, bei Mängeln mit UC19 Retoure. Ohne Ersatz wird nur erneut bestellt, solange das Teil noch benötigt wird. Prozess 06 enthält keinen Pfad für eine Zusammenführung mit offenen Bestellungen, deshalb wird sie nicht behauptet.</w:t>
       </w:r>
     </w:p>
     <w:p>
@@ -9197,7 +9197,7 @@
           <w:sz w:val="22"/>
           <w:szCs w:val="22"/>
         </w:rPr>
-        <w:t xml:space="preserve">Die Modelle werden über gemeinsame Namen, Rollen und Statuswerte abgeglichen. BPMN-Datenobjekte tragen die Klassennamen, bei Bedarf mit Zustand in eckigen Klammern. Der Pool Kunde und die Werkstatt-Lanes entsprechen den Akteuren Kunde, Servicemitarbeiter, Techniker, Disponent und Werkstattleiter sowie den Rollenklassen. Die Auftragszustände folgen AuftragStatus; „abgelehnt“ wird in Prozess 03, 04 und seit E-19 auch in Prozess 07 gesetzt, „angenommen“ in Prozess 02 und bei einem neuen Nacharbeitsauftrag in Prozess 09. Tabelle 2 zeigt die fachliche Zuordnung; sie belegt noch keinen vollständig abgeschlossenen Abgleich.</w:t>
+        <w:t>Die Modelle werden über gemeinsame Namen, Rollen und Statuswerte abgeglichen. BPMN-Datenobjekte tragen die Klassennamen, bei Bedarf mit Zustand in eckigen Klammern. Der Pool Kunde und die Werkstatt-Lanes entsprechen den Akteuren Kunde, Servicemitarbeiter, Techniker, Disponent und Werkstattleiter sowie den Rollenklassen. Die Auftragszustände folgen AuftragStatus: „abgelehnt“ wird in Prozess 03, 04 und seit E-19 auch in Prozess 07 gesetzt, „angenommen“ in Prozess 02 und bei einem neuen Nacharbeitsauftrag in Prozess 09. Tabelle 2 zeigt die fachliche Zuordnung. Ein vollständig abgeschlossener Abgleich ist damit noch nicht belegt.</w:t>
       </w:r>
     </w:p>
     <w:p>
@@ -9212,7 +9212,7 @@
           <w:sz w:val="22"/>
           <w:szCs w:val="22"/>
         </w:rPr>
-        <w:t>Die am 05.10.2026 noch offenen Abweichungen, also SD4 gegenüber dem Nachtrags- und Abbruchpfad in Prozess 07, die fehlende Begrenzung der Liefermahnungen in Prozess 06 und der fehlende Empfang der Ersatzlieferung in Prozess 10, sind seit dem 08.10.2026 behoben (E-22). Von der Gruppe zu bestätigen sind noch die Fristen aus E-19, E-20 und E-22; ob verwertete Geräte einen eigenen Wert in AuftragStatus brauchen, ist ungeklärt. Die Diagrammbilder entsprechen den aktuell eingecheckten PNGs.</w:t>
+        <w:t>Am 05.10.2026 waren noch folgende Abweichungen offen: SD4 gegenüber dem Nachtrags- und Abbruchpfad in Prozess 07, die fehlende Begrenzung der Liefermahnungen in Prozess 06 und der fehlende Empfang der Ersatzlieferung in Prozess 10. Seit dem 08.10.2026 sind sie behoben (E-22). Von der Gruppe zu bestätigen sind noch die Fristen aus E-19, E-20 und E-22. Ungeklärt ist, ob verwertete Geräte einen eigenen Wert in AuftragStatus brauchen. Die Diagrammbilder entsprechen den aktuell eingecheckten PNGs.</w:t>
       </w:r>
     </w:p>
     <w:tbl>
@@ -10639,7 +10639,7 @@
           <w:sz w:val="22"/>
           <w:szCs w:val="22"/>
         </w:rPr>
-        <w:t xml:space="preserve">Zu Beginn des Semesters sind zwei vollständige Entwürfe entstanden: einer aus der Betreiber-Perspektive (FixWerk GmbH als Betreiber, ohne KI-Feature, Camunda 7) und einer aus der Solution-Provider-Perspektive mit KI-Sofortdiagnose (Camunda 8). Statt einen davon zu verwerfen, haben wir beide Artefakt für Artefakt verglichen und zusammengeführt: Grundlage sind die Solution-Provider-Diagramme, weil sie das Dozentenfeedback umsetzen und die für den damaligen Stand dokumentierten Linter-Prüfungen ohne Befund passiert haben; aus dem Betreiber-Entwurf übernommen wurden die Rollenklassen Mitarbeiter, Disponent und Werkstattleiter, die Datenspeicher Technikerplan und Buchhaltung, das Sequenzdiagramm zum Nachbestellvorschlag, der Abschnitt zur Konsistenz der Modelle sowie Sprintplan und Trello-Board. Die Gegenüberstellung steht im Repository (archiv/doku/05-vergleich-und-zusammenfuehrung.md).</w:t>
+        <w:t>Zu Beginn des Semesters sind zwei vollständige Entwürfe entstanden: einer aus der Betreiber-Perspektive (FixWerk GmbH als Betreiber, ohne KI-Feature, Camunda 7) und einer aus der Solution-Provider-Perspektive mit KI-Sofortdiagnose (Camunda 8). Statt einen davon zu verwerfen, haben wir beide Artefakt für Artefakt verglichen und zusammengeführt. Grundlage sind die Solution-Provider-Diagramme, weil sie das Dozentenfeedback umsetzen und die für den damaligen Stand dokumentierten Linter-Prüfungen ohne Befund passiert haben. Aus dem Betreiber-Entwurf haben wir die Rollenklassen Mitarbeiter, Disponent und Werkstattleiter übernommen, dazu die Datenspeicher Technikerplan und Buchhaltung, das Sequenzdiagramm zum Nachbestellvorschlag, den Abschnitt zur Konsistenz der Modelle sowie Sprintplan und Trello-Board. Die Gegenüberstellung steht im Repository (archiv/doku/05-vergleich-und-zusammenfuehrung.md).</w:t>
       </w:r>
     </w:p>
     <w:p>
@@ -10663,7 +10663,7 @@
           <w:sz w:val="22"/>
           <w:szCs w:val="22"/>
         </w:rPr>
-        <w:t>Ein erster Entwurf modellierte Werkstatt und Ersatzteil-Disposition als getrennte Pools. Nach der Vorlesungsregel „Pool = Unternehmen, Lanes = Rollen" wurde auf einen Pool mit Lanes umgestellt; Kunde und Lieferant blieben eigene Pools. Erst dadurch wurden die Nachrichtenflüsse eindeutig. Den Kunden hatten wir zunächst als Black Box gezeichnet; weil dabei nicht sichtbar war, wann er antwortet, entscheidet oder fertig ist, haben wir ihm einen eigenen Ablauf gegeben (Entscheidungslog E-16). Eine Gesamtprüfung aller Modelle am 05.10.2026 (E-17) zeigte danach Lücken zwischen den Prozessen, etwa dass abgelehnte Aufträge nie abgeholt wurden und Warteschleifen keinen Ausstieg hatten; die Rückgaben laufen seitdem über Prozess 08, und Wartesituationen haben modellierte Fristen. Die letzte Schleife dieser Art, die Liefermahnung in Prozess 06, hat seit E-22 ebenfalls einen Ausstieg.</w:t>
+        <w:t>Ein erster Entwurf modellierte Werkstatt und Ersatzteil-Disposition als getrennte Pools. Nach der Vorlesungsregel „Pool = Unternehmen, Lanes = Rollen" haben wir auf einen Pool mit Lanes umgestellt, Kunde und Lieferant blieben eigene Pools. Erst dadurch wurden die Nachrichtenflüsse eindeutig. Den Kunden hatten wir zunächst als Black Box gezeichnet. Dabei war aber nicht sichtbar, wann er antwortet, entscheidet oder fertig ist, also bekam er einen eigenen Ablauf (Entscheidungslog E-16). Eine Gesamtprüfung aller Modelle am 05.10.2026 (E-17) zeigte danach Lücken zwischen den Prozessen. Sie zeigte etwa, dass abgelehnte Aufträge nie abgeholt wurden und Warteschleifen keinen Ausstieg hatten. Seitdem laufen die Rückgaben über Prozess 08, und Wartesituationen haben modellierte Fristen. Die letzte Schleife dieser Art, die Liefermahnung in Prozess 06, hat seit E-22 ebenfalls einen Ausstieg.</w:t>
       </w:r>
     </w:p>
     <w:p>
@@ -10687,7 +10687,7 @@
           <w:sz w:val="22"/>
           <w:szCs w:val="22"/>
         </w:rPr>
-        <w:t xml:space="preserve">In der ersten Fassung waren wir gleichzeitig Werkstatt und Softwareanbieter. Die Rückfrage des Dozenten hat uns gezwungen, das zu klären. Die Entscheidung für den Solution Provider hat sich gelohnt: Die Prozesse blieben gültig, aber Texte, Use Cases (Onboarding) und das Klassenmodell (Mandant) mussten nachziehen.</w:t>
+        <w:t>In der ersten Fassung waren wir gleichzeitig Werkstatt und Softwareanbieter. Die Rückfrage des Dozenten hat uns dazu gebracht, das zu klären. Die Entscheidung für den Solution Provider hat sich gelohnt, denn die Prozesse blieben gültig. Texte, Use Cases (Onboarding) und das Klassenmodell (Mandant) mussten allerdings nachziehen.</w:t>
       </w:r>
     </w:p>
     <w:p>
@@ -10711,7 +10711,7 @@
           <w:sz w:val="22"/>
           <w:szCs w:val="22"/>
         </w:rPr>
-        <w:t xml:space="preserve">Unsere ursprüngliche Prozessliste enthielt die Terminplanung als eigenen Prozess; sie hatte aber nur einen Pool und wenige Schritte. Wir haben sie als Lane Werkstattleitung in die Auftragsannahme integriert und dafür die KI-Sofortdiagnose als neuen Prozess 01 aufgenommen.</w:t>
+        <w:t>Unsere ursprüngliche Prozessliste enthielt die Terminplanung als eigenen Prozess, der aber nur einen Pool und wenige Schritte hatte. Wir haben sie als Lane Werkstattleitung in die Auftragsannahme integriert und dafür die KI-Sofortdiagnose als neuen Prozess 01 aufgenommen.</w:t>
       </w:r>
     </w:p>
     <w:p>
@@ -10735,7 +10735,7 @@
           <w:sz w:val="22"/>
           <w:szCs w:val="22"/>
         </w:rPr>
-        <w:t>Datenobjekte, Klassen, Lebenslinien und Statuswerte müssen wortgleich sein. Frühere Fassungen der Sequenzdiagramme verwendeten „Diagnose" und „Reservierung", das Klassendiagramm „Fehlerbefund" und „ErsatzteilReservierung". Die Rohentwürfe wurden deshalb aus einer gemeinsamen Modellbeschreibung erzeugt. Seit E-21 werden die aktiven Quellen direkt bearbeitet; Namen, Operationen und Beziehungen müssen nach Änderungen erneut gegeneinander geprüft werden. Dass SD4 nach den Korrekturen an Prozess 07 (E-19) erst nachgezogen werden musste, zeigt, warum diese Prüfung erforderlich bleibt.</w:t>
+        <w:t>Datenobjekte, Klassen, Lebenslinien und Statuswerte müssen wortgleich sein. Frühere Fassungen der Sequenzdiagramme verwendeten „Diagnose" und „Reservierung", das Klassendiagramm „Fehlerbefund" und „ErsatzteilReservierung". Die Rohentwürfe wurden deshalb aus einer gemeinsamen Modellbeschreibung erzeugt. Seit E-21 bearbeiten wir die aktiven Quellen direkt. Nach Änderungen müssen Namen, Operationen und Beziehungen erneut gegeneinander geprüft werden. Wie nötig das ist, zeigte SD4: Nach den Korrekturen an Prozess 07 (E-19) musste es erst nachgezogen werden.</w:t>
       </w:r>
     </w:p>
     <w:p>
@@ -10759,7 +10759,7 @@
           <w:sz w:val="22"/>
           <w:szCs w:val="22"/>
         </w:rPr>
-        <w:t xml:space="preserve">Der Teamwork-Server von Visual Paradigm ist nur über das Lehre-VPN erreichbar, und der Camunda Modeler meldet für Camunda-8-Diagramme technische Details als Fehler, etwa fehlende Task-Definitionen oder Message-Subscriptions. Wir haben uns entschieden, die Diagramme „engine-ready" anzureichern, statt die Fehler zu ignorieren; diese Anreicherung dient der technischen Modellprüfung. Eine Ausführung der gesamten Prozesskette in einer Camunda-Engine ist damit nicht nachgewiesen.</w:t>
+        <w:t>Der Teamwork-Server von Visual Paradigm ist nur über das Lehre-VPN erreichbar, und der Camunda Modeler meldet für Camunda-8-Diagramme technische Details als Fehler, etwa fehlende Task-Definitionen oder Message-Subscriptions. Wir haben die Diagramme „engine-ready" angereichert, statt die Fehler zu ignorieren. Diese Anreicherung dient der technischen Modellprüfung. Dass die gesamte Prozesskette in einer Camunda-Engine läuft, ist damit nicht nachgewiesen.</w:t>
       </w:r>
     </w:p>
     <w:p>
@@ -10807,7 +10807,7 @@
           <w:sz w:val="22"/>
           <w:szCs w:val="22"/>
         </w:rPr>
-        <w:t xml:space="preserve">Die KI-Sofortdiagnose soll beeindrucken, aber nicht unglaubwürdig wirken. Wir trennen deshalb in Modell und Text zwischen dem, was heute mit Bildanalyse geht, und dem, was Vision ist, und halten den Vorschlag im Prozess ausdrücklich unverbindlich.</w:t>
+        <w:t>Die KI-Sofortdiagnose soll beeindrucken und trotzdem glaubwürdig bleiben. Deshalb trennen wir in Modell und Text zwischen dem, was heute mit Bildanalyse geht, und dem, was Vision ist. Den Vorschlag halten wir im Prozess ausdrücklich unverbindlich.</w:t>
       </w:r>
     </w:p>
     <w:p>
@@ -10830,7 +10830,7 @@
           <w:sz w:val="22"/>
           <w:szCs w:val="22"/>
         </w:rPr>
-        <w:t>Sechs Personen arbeiten am selben Repository, aber nicht alle mit denselben Werkzeugen: Zugriff auf Visual Paradigm und den Teamwork-Server haben bei uns nur David und Kilian, sodass sich die UML-Arbeit auf zwei Personen konzentriert. Am 05.10.2026 haben zwei Pull Requests parallel eine Entscheidung mit der Nummer E-20 angelegt; die Konflikte wurden gleichzeitig an zwei Stellen gelöst, und ein Stand musste neu aufgesetzt werden. Seitdem gilt die Regel, vor jeder neuen Entscheidung main zu aktualisieren und die nächste freie Nummer zu nehmen. Word- und PowerPoint-Dateien lassen sich in Git nicht zusammenführen; wer sie bearbeitet, kündigt das deshalb vorher in der WhatsApp-Gruppe an.</w:t>
+        <w:t>Sechs Personen arbeiten am selben Repository, aber nicht alle mit denselben Werkzeugen. Zugriff auf Visual Paradigm und den Teamwork-Server haben bei uns nur David und Kilian, also konzentriert sich die UML-Arbeit auf zwei Personen. Am 05.10.2026 haben zwei Pull Requests parallel eine Entscheidung mit der Nummer E-20 angelegt. Die Konflikte wurden gleichzeitig an zwei Stellen gelöst, und ein Stand musste neu aufgesetzt werden. Seitdem gilt die Regel, vor jeder neuen Entscheidung main zu aktualisieren und die nächste freie Nummer zu nehmen. Word- und PowerPoint-Dateien lassen sich in Git nicht zusammenführen. Wer sie bearbeitet, kündigt das deshalb vorher in der WhatsApp-Gruppe an.</w:t>
       </w:r>
     </w:p>
     <w:p>
@@ -10855,7 +10855,7 @@
           <w:sz w:val="22"/>
           <w:szCs w:val="22"/>
         </w:rPr>
-        <w:t>Ein Repository, das in einem synchronisierten OneDrive-Ordner liegt, sperrte Dateien im Git-Verzeichnis, sodass Git beim Wechsel von Branches Löschvorgänge nicht abschließen konnte. Beim Aufbau des Use-Case-Diagramms in Visual Paradigm führte ein wiederholter XMI-Import zu doppelten Beziehungen; gelöst haben wir das, indem wir das Modell vollständig gelöscht und einmal sauber neu importiert haben.</w:t>
+        <w:t>Ein Repository, das in einem synchronisierten OneDrive-Ordner liegt, sperrte Dateien im Git-Verzeichnis, sodass Git beim Wechsel von Branches Löschvorgänge nicht abschließen konnte. Beim Aufbau des Use-Case-Diagramms in Visual Paradigm führte ein wiederholter XMI-Import zu doppelten Beziehungen. Gelöst haben wir das, indem wir das Modell vollständig gelöscht und einmal sauber neu importiert haben.</w:t>
       </w:r>
     </w:p>
     <w:p>
@@ -10909,7 +10909,7 @@
           <w:sz w:val="22"/>
           <w:szCs w:val="22"/>
         </w:rPr>
-        <w:t>Fragen zum Vorgehen klären wir in den Gruppenterminen direkt mit dem Dozenten; eine feste Ansprechperson gibt es dafür nicht (E-21). Rückmeldungen, die zu Änderungen an den Modellen führen, halten wir im Repository fest und verknüpfen sie mit der zugehörigen Entscheidung.</w:t>
+        <w:t>Fragen zum Vorgehen klären wir in den Gruppenterminen direkt mit dem Dozenten. Eine feste Ansprechperson gibt es dafür nicht (E-21). Rückmeldungen, die zu Änderungen an den Modellen führen, halten wir im Repository fest und verknüpfen sie mit der zugehörigen Entscheidung.</w:t>
       </w:r>
     </w:p>
     <w:p>

</xml_diff>